<commit_message>
updates the search to include enter updated logout buton on search screen
</commit_message>
<xml_diff>
--- a/Docs/reservation-test-report.docx
+++ b/Docs/reservation-test-report.docx
@@ -179,11 +179,11 @@
         <w:tblLook w:val="04A0" w:firstRow="1" w:lastRow="0" w:firstColumn="1" w:lastColumn="0" w:noHBand="0" w:noVBand="1"/>
       </w:tblPr>
       <w:tblGrid>
-        <w:gridCol w:w="621"/>
-        <w:gridCol w:w="2173"/>
-        <w:gridCol w:w="2728"/>
-        <w:gridCol w:w="3651"/>
-        <w:gridCol w:w="889"/>
+        <w:gridCol w:w="622"/>
+        <w:gridCol w:w="1293"/>
+        <w:gridCol w:w="1922"/>
+        <w:gridCol w:w="2500"/>
+        <w:gridCol w:w="3725"/>
       </w:tblGrid>
       <w:tr>
         <w:trPr>
@@ -193,7 +193,7 @@
         </w:trPr>
         <w:tc>
           <w:tcPr>
-            <w:tcW w:w="0" w:type="auto"/>
+            <w:tcW w:w="622" w:type="dxa"/>
             <w:tcBorders>
               <w:top w:val="single" w:sz="1" w:space="0" w:color="000000"/>
               <w:bottom w:val="single" w:sz="1" w:space="0" w:color="000000"/>
@@ -284,7 +284,7 @@
         </w:tc>
         <w:tc>
           <w:tcPr>
-            <w:tcW w:w="889" w:type="dxa"/>
+            <w:tcW w:w="3725" w:type="dxa"/>
             <w:tcBorders>
               <w:top w:val="single" w:sz="2" w:space="0" w:color="000000"/>
               <w:left w:val="single" w:sz="4" w:space="0" w:color="auto"/>
@@ -319,7 +319,7 @@
         </w:trPr>
         <w:tc>
           <w:tcPr>
-            <w:tcW w:w="0" w:type="auto"/>
+            <w:tcW w:w="622" w:type="dxa"/>
             <w:tcBorders>
               <w:top w:val="single" w:sz="1" w:space="0" w:color="000000"/>
               <w:bottom w:val="single" w:sz="1" w:space="0" w:color="000000"/>
@@ -382,7 +382,16 @@
                 <w:color w:val="000000"/>
                 <w:sz w:val="17"/>
               </w:rPr>
-              <w:t xml:space="preserve">Set a book's </w:t>
+              <w:t xml:space="preserve">Set </w:t>
+            </w:r>
+            <w:proofErr w:type="gramStart"/>
+            <w:r>
+              <w:rPr>
+                <w:rFonts w:ascii="source sans 3" w:eastAsia="source sans 3" w:hAnsi="source sans 3" w:cs="source sans 3"/>
+                <w:color w:val="000000"/>
+                <w:sz w:val="17"/>
+              </w:rPr>
+              <w:t xml:space="preserve">a book's </w:t>
             </w:r>
             <w:proofErr w:type="spellStart"/>
             <w:r>
@@ -396,6 +405,7 @@
               <w:t>AvailableCopies</w:t>
             </w:r>
             <w:proofErr w:type="spellEnd"/>
+            <w:proofErr w:type="gramEnd"/>
             <w:r>
               <w:rPr>
                 <w:rFonts w:ascii="source sans 3" w:eastAsia="source sans 3" w:hAnsi="source sans 3" w:cs="source sans 3"/>
@@ -404,6 +414,30 @@
               </w:rPr>
               <w:t xml:space="preserve"> to 0, open search, reserve the book as a valid member.</w:t>
             </w:r>
+            <w:r>
+              <w:rPr>
+                <w:rFonts w:ascii="source sans 3" w:eastAsia="source sans 3" w:hAnsi="source sans 3" w:cs="source sans 3"/>
+                <w:color w:val="000000"/>
+                <w:sz w:val="17"/>
+              </w:rPr>
+              <w:t xml:space="preserve"> Book id 11</w:t>
+            </w:r>
+            <w:r>
+              <w:rPr>
+                <w:rFonts w:ascii="source sans 3" w:eastAsia="source sans 3" w:hAnsi="source sans 3" w:cs="source sans 3"/>
+                <w:color w:val="000000"/>
+                <w:sz w:val="17"/>
+              </w:rPr>
+              <w:t xml:space="preserve"> </w:t>
+            </w:r>
+            <w:r>
+              <w:rPr>
+                <w:rFonts w:ascii="source sans 3" w:eastAsia="source sans 3" w:hAnsi="source sans 3" w:cs="source sans 3"/>
+                <w:color w:val="000000"/>
+                <w:sz w:val="17"/>
+              </w:rPr>
+              <w:t>The Art of Computer Programming, Vol. 1</w:t>
+            </w:r>
           </w:p>
         </w:tc>
         <w:tc>
@@ -448,7 +482,7 @@
         </w:tc>
         <w:tc>
           <w:tcPr>
-            <w:tcW w:w="889" w:type="dxa"/>
+            <w:tcW w:w="3725" w:type="dxa"/>
             <w:tcBorders>
               <w:top w:val="single" w:sz="2" w:space="0" w:color="000000"/>
               <w:left w:val="single" w:sz="4" w:space="0" w:color="auto"/>
@@ -464,6 +498,66 @@
                 <w:sz w:val="17"/>
               </w:rPr>
             </w:pPr>
+            <w:r>
+              <w:rPr>
+                <w:rFonts w:ascii="source sans 3" w:eastAsia="source sans 3" w:hAnsi="source sans 3" w:cs="source sans 3"/>
+                <w:color w:val="000000"/>
+                <w:sz w:val="17"/>
+              </w:rPr>
+              <w:drawing>
+                <wp:inline distT="0" distB="0" distL="0" distR="0" wp14:anchorId="4858BD18" wp14:editId="0F5B157E">
+                  <wp:extent cx="1428760" cy="771531"/>
+                  <wp:effectExtent l="0" t="0" r="0" b="9525"/>
+                  <wp:docPr id="566761292" name="Picture 1"/>
+                  <wp:cNvGraphicFramePr>
+                    <a:graphicFrameLocks xmlns:a="http://schemas.openxmlformats.org/drawingml/2006/main" noChangeAspect="1"/>
+                  </wp:cNvGraphicFramePr>
+                  <a:graphic xmlns:a="http://schemas.openxmlformats.org/drawingml/2006/main">
+                    <a:graphicData uri="http://schemas.openxmlformats.org/drawingml/2006/picture">
+                      <pic:pic xmlns:pic="http://schemas.openxmlformats.org/drawingml/2006/picture">
+                        <pic:nvPicPr>
+                          <pic:cNvPr id="566761292" name=""/>
+                          <pic:cNvPicPr/>
+                        </pic:nvPicPr>
+                        <pic:blipFill>
+                          <a:blip r:embed="rId4"/>
+                          <a:stretch>
+                            <a:fillRect/>
+                          </a:stretch>
+                        </pic:blipFill>
+                        <pic:spPr>
+                          <a:xfrm>
+                            <a:off x="0" y="0"/>
+                            <a:ext cx="1428760" cy="771531"/>
+                          </a:xfrm>
+                          <a:prstGeom prst="rect">
+                            <a:avLst/>
+                          </a:prstGeom>
+                        </pic:spPr>
+                      </pic:pic>
+                    </a:graphicData>
+                  </a:graphic>
+                </wp:inline>
+              </w:drawing>
+            </w:r>
+          </w:p>
+          <w:p>
+            <w:pPr>
+              <w:spacing w:line="360" w:lineRule="auto"/>
+              <w:rPr>
+                <w:rFonts w:ascii="source sans 3" w:eastAsia="source sans 3" w:hAnsi="source sans 3" w:cs="source sans 3"/>
+                <w:color w:val="000000"/>
+                <w:sz w:val="17"/>
+              </w:rPr>
+            </w:pPr>
+            <w:r>
+              <w:rPr>
+                <w:rFonts w:ascii="source sans 3" w:eastAsia="source sans 3" w:hAnsi="source sans 3" w:cs="source sans 3"/>
+                <w:color w:val="000000"/>
+                <w:sz w:val="17"/>
+              </w:rPr>
+              <w:t>Pass</w:t>
+            </w:r>
           </w:p>
         </w:tc>
       </w:tr>
@@ -475,7 +569,7 @@
         </w:trPr>
         <w:tc>
           <w:tcPr>
-            <w:tcW w:w="0" w:type="auto"/>
+            <w:tcW w:w="622" w:type="dxa"/>
             <w:tcBorders>
               <w:top w:val="single" w:sz="1" w:space="0" w:color="000000"/>
               <w:bottom w:val="single" w:sz="1" w:space="0" w:color="000000"/>
@@ -540,6 +634,22 @@
               </w:rPr>
               <w:t>Give the member 3 active loans, search for a book with available copies, click reserve.</w:t>
             </w:r>
+            <w:r>
+              <w:rPr>
+                <w:rFonts w:ascii="source sans 3" w:eastAsia="source sans 3" w:hAnsi="source sans 3" w:cs="source sans 3"/>
+                <w:color w:val="000000"/>
+                <w:sz w:val="17"/>
+              </w:rPr>
+              <w:t xml:space="preserve"> User </w:t>
+            </w:r>
+            <w:r>
+              <w:rPr>
+                <w:rFonts w:ascii="source sans 3" w:eastAsia="source sans 3" w:hAnsi="source sans 3" w:cs="source sans 3"/>
+                <w:color w:val="000000"/>
+                <w:sz w:val="17"/>
+              </w:rPr>
+              <w:t xml:space="preserve">2 </w:t>
+            </w:r>
           </w:p>
         </w:tc>
         <w:tc>
@@ -602,7 +712,7 @@
         </w:tc>
         <w:tc>
           <w:tcPr>
-            <w:tcW w:w="889" w:type="dxa"/>
+            <w:tcW w:w="3725" w:type="dxa"/>
             <w:tcBorders>
               <w:top w:val="single" w:sz="2" w:space="0" w:color="000000"/>
               <w:left w:val="single" w:sz="4" w:space="0" w:color="auto"/>
@@ -618,6 +728,64 @@
                 <w:sz w:val="17"/>
               </w:rPr>
             </w:pPr>
+            <w:r>
+              <w:rPr>
+                <w:rFonts w:ascii="source sans 3" w:eastAsia="source sans 3" w:hAnsi="source sans 3" w:cs="source sans 3"/>
+                <w:color w:val="000000"/>
+                <w:sz w:val="17"/>
+              </w:rPr>
+              <w:drawing>
+                <wp:inline distT="0" distB="0" distL="0" distR="0" wp14:anchorId="11780041" wp14:editId="43AE8133">
+                  <wp:extent cx="1495436" cy="838206"/>
+                  <wp:effectExtent l="0" t="0" r="9525" b="0"/>
+                  <wp:docPr id="1286883502" name="Picture 1"/>
+                  <wp:cNvGraphicFramePr>
+                    <a:graphicFrameLocks xmlns:a="http://schemas.openxmlformats.org/drawingml/2006/main" noChangeAspect="1"/>
+                  </wp:cNvGraphicFramePr>
+                  <a:graphic xmlns:a="http://schemas.openxmlformats.org/drawingml/2006/main">
+                    <a:graphicData uri="http://schemas.openxmlformats.org/drawingml/2006/picture">
+                      <pic:pic xmlns:pic="http://schemas.openxmlformats.org/drawingml/2006/picture">
+                        <pic:nvPicPr>
+                          <pic:cNvPr id="1286883502" name=""/>
+                          <pic:cNvPicPr/>
+                        </pic:nvPicPr>
+                        <pic:blipFill>
+                          <a:blip r:embed="rId5"/>
+                          <a:stretch>
+                            <a:fillRect/>
+                          </a:stretch>
+                        </pic:blipFill>
+                        <pic:spPr>
+                          <a:xfrm>
+                            <a:off x="0" y="0"/>
+                            <a:ext cx="1495436" cy="838206"/>
+                          </a:xfrm>
+                          <a:prstGeom prst="rect">
+                            <a:avLst/>
+                          </a:prstGeom>
+                        </pic:spPr>
+                      </pic:pic>
+                    </a:graphicData>
+                  </a:graphic>
+                </wp:inline>
+              </w:drawing>
+            </w:r>
+            <w:r>
+              <w:rPr>
+                <w:rFonts w:ascii="source sans 3" w:eastAsia="source sans 3" w:hAnsi="source sans 3" w:cs="source sans 3"/>
+                <w:color w:val="000000"/>
+                <w:sz w:val="17"/>
+              </w:rPr>
+              <w:t xml:space="preserve"> </w:t>
+            </w:r>
+            <w:r>
+              <w:rPr>
+                <w:rFonts w:ascii="source sans 3" w:eastAsia="source sans 3" w:hAnsi="source sans 3" w:cs="source sans 3"/>
+                <w:color w:val="000000"/>
+                <w:sz w:val="17"/>
+              </w:rPr>
+              <w:t>Pass</w:t>
+            </w:r>
           </w:p>
         </w:tc>
       </w:tr>
@@ -629,7 +797,7 @@
         </w:trPr>
         <w:tc>
           <w:tcPr>
-            <w:tcW w:w="0" w:type="auto"/>
+            <w:tcW w:w="622" w:type="dxa"/>
             <w:tcBorders>
               <w:top w:val="single" w:sz="1" w:space="0" w:color="000000"/>
               <w:bottom w:val="single" w:sz="1" w:space="0" w:color="000000"/>
@@ -694,6 +862,22 @@
               </w:rPr>
               <w:t>Use a member with 0-2 active loans and a book with available copies, then reserve.</w:t>
             </w:r>
+            <w:r>
+              <w:rPr>
+                <w:rFonts w:ascii="source sans 3" w:eastAsia="source sans 3" w:hAnsi="source sans 3" w:cs="source sans 3"/>
+                <w:color w:val="000000"/>
+                <w:sz w:val="17"/>
+              </w:rPr>
+              <w:t xml:space="preserve"> User </w:t>
+            </w:r>
+            <w:r>
+              <w:rPr>
+                <w:rFonts w:ascii="source sans 3" w:eastAsia="source sans 3" w:hAnsi="source sans 3" w:cs="source sans 3"/>
+                <w:color w:val="000000"/>
+                <w:sz w:val="17"/>
+              </w:rPr>
+              <w:t>3</w:t>
+            </w:r>
           </w:p>
         </w:tc>
         <w:tc>
@@ -738,7 +922,7 @@
         </w:tc>
         <w:tc>
           <w:tcPr>
-            <w:tcW w:w="889" w:type="dxa"/>
+            <w:tcW w:w="3725" w:type="dxa"/>
             <w:tcBorders>
               <w:top w:val="single" w:sz="2" w:space="0" w:color="000000"/>
               <w:left w:val="single" w:sz="4" w:space="0" w:color="auto"/>
@@ -754,6 +938,56 @@
                 <w:sz w:val="17"/>
               </w:rPr>
             </w:pPr>
+            <w:r>
+              <w:rPr>
+                <w:rFonts w:ascii="source sans 3" w:eastAsia="source sans 3" w:hAnsi="source sans 3" w:cs="source sans 3"/>
+                <w:color w:val="000000"/>
+                <w:sz w:val="17"/>
+              </w:rPr>
+              <w:drawing>
+                <wp:inline distT="0" distB="0" distL="0" distR="0" wp14:anchorId="742DA705" wp14:editId="166D4FD3">
+                  <wp:extent cx="2143141" cy="809631"/>
+                  <wp:effectExtent l="0" t="0" r="9525" b="9525"/>
+                  <wp:docPr id="32349635" name="Picture 1"/>
+                  <wp:cNvGraphicFramePr>
+                    <a:graphicFrameLocks xmlns:a="http://schemas.openxmlformats.org/drawingml/2006/main" noChangeAspect="1"/>
+                  </wp:cNvGraphicFramePr>
+                  <a:graphic xmlns:a="http://schemas.openxmlformats.org/drawingml/2006/main">
+                    <a:graphicData uri="http://schemas.openxmlformats.org/drawingml/2006/picture">
+                      <pic:pic xmlns:pic="http://schemas.openxmlformats.org/drawingml/2006/picture">
+                        <pic:nvPicPr>
+                          <pic:cNvPr id="32349635" name=""/>
+                          <pic:cNvPicPr/>
+                        </pic:nvPicPr>
+                        <pic:blipFill>
+                          <a:blip r:embed="rId6"/>
+                          <a:stretch>
+                            <a:fillRect/>
+                          </a:stretch>
+                        </pic:blipFill>
+                        <pic:spPr>
+                          <a:xfrm>
+                            <a:off x="0" y="0"/>
+                            <a:ext cx="2143141" cy="809631"/>
+                          </a:xfrm>
+                          <a:prstGeom prst="rect">
+                            <a:avLst/>
+                          </a:prstGeom>
+                        </pic:spPr>
+                      </pic:pic>
+                    </a:graphicData>
+                  </a:graphic>
+                </wp:inline>
+              </w:drawing>
+            </w:r>
+            <w:r>
+              <w:rPr>
+                <w:rFonts w:ascii="source sans 3" w:eastAsia="source sans 3" w:hAnsi="source sans 3" w:cs="source sans 3"/>
+                <w:color w:val="000000"/>
+                <w:sz w:val="17"/>
+              </w:rPr>
+              <w:t xml:space="preserve"> Pass</w:t>
+            </w:r>
           </w:p>
         </w:tc>
       </w:tr>
@@ -765,23 +999,24 @@
         </w:trPr>
         <w:tc>
           <w:tcPr>
-            <w:tcW w:w="0" w:type="auto"/>
-            <w:tcBorders>
-              <w:top w:val="single" w:sz="1" w:space="0" w:color="000000"/>
-              <w:bottom w:val="single" w:sz="1" w:space="0" w:color="000000"/>
-              <w:right w:val="single" w:sz="1" w:space="0" w:color="000000"/>
-            </w:tcBorders>
-          </w:tcPr>
-          <w:p>
-            <w:pPr>
-              <w:spacing w:line="360" w:lineRule="auto"/>
-            </w:pPr>
-            <w:r>
-              <w:rPr>
-                <w:rFonts w:ascii="source sans 3" w:eastAsia="source sans 3" w:hAnsi="source sans 3" w:cs="source sans 3"/>
-                <w:color w:val="000000"/>
-                <w:sz w:val="17"/>
-              </w:rPr>
+            <w:tcW w:w="622" w:type="dxa"/>
+            <w:tcBorders>
+              <w:top w:val="single" w:sz="1" w:space="0" w:color="000000"/>
+              <w:bottom w:val="single" w:sz="1" w:space="0" w:color="000000"/>
+              <w:right w:val="single" w:sz="1" w:space="0" w:color="000000"/>
+            </w:tcBorders>
+          </w:tcPr>
+          <w:p>
+            <w:pPr>
+              <w:spacing w:line="360" w:lineRule="auto"/>
+            </w:pPr>
+            <w:r>
+              <w:rPr>
+                <w:rFonts w:ascii="source sans 3" w:eastAsia="source sans 3" w:hAnsi="source sans 3" w:cs="source sans 3"/>
+                <w:color w:val="000000"/>
+                <w:sz w:val="17"/>
+              </w:rPr>
+              <w:lastRenderedPageBreak/>
               <w:t>R4</w:t>
             </w:r>
           </w:p>
@@ -830,69 +1065,41 @@
               </w:rPr>
               <w:t>Create 3 active reservations for the same member, then attempt a fourth.</w:t>
             </w:r>
-          </w:p>
-        </w:tc>
-        <w:tc>
-          <w:tcPr>
-            <w:tcW w:w="0" w:type="auto"/>
-            <w:tcBorders>
-              <w:top w:val="single" w:sz="1" w:space="0" w:color="000000"/>
-              <w:bottom w:val="single" w:sz="1" w:space="0" w:color="000000"/>
-            </w:tcBorders>
-          </w:tcPr>
-          <w:p>
-            <w:pPr>
-              <w:spacing w:line="360" w:lineRule="auto"/>
-            </w:pPr>
-            <w:r>
-              <w:rPr>
-                <w:rFonts w:ascii="source sans 3" w:eastAsia="source sans 3" w:hAnsi="source sans 3" w:cs="source sans 3"/>
-                <w:color w:val="000000"/>
-                <w:sz w:val="17"/>
-              </w:rPr>
-              <w:t xml:space="preserve">Reservation is blocked because the maximum active reservation count is </w:t>
-            </w:r>
-            <w:proofErr w:type="gramStart"/>
-            <w:r>
-              <w:rPr>
-                <w:rFonts w:ascii="source sans 3" w:eastAsia="source sans 3" w:hAnsi="source sans 3" w:cs="source sans 3"/>
-                <w:color w:val="000000"/>
-                <w:sz w:val="17"/>
-              </w:rPr>
-              <w:t>3.[</w:t>
-            </w:r>
-            <w:proofErr w:type="gramEnd"/>
-            <w:r>
-              <w:rPr>
-                <w:rFonts w:ascii="source sans 3" w:eastAsia="source sans 3" w:hAnsi="source sans 3" w:cs="source sans 3"/>
-                <w:color w:val="000000"/>
-                <w:sz w:val="17"/>
-              </w:rPr>
-              <w:t>file:</w:t>
-            </w:r>
-            <w:proofErr w:type="gramStart"/>
-            <w:r>
-              <w:rPr>
-                <w:rFonts w:ascii="source sans 3" w:eastAsia="source sans 3" w:hAnsi="source sans 3" w:cs="source sans 3"/>
-                <w:color w:val="000000"/>
-                <w:sz w:val="17"/>
-              </w:rPr>
-              <w:t>7][</w:t>
-            </w:r>
-            <w:proofErr w:type="gramEnd"/>
-            <w:r>
-              <w:rPr>
-                <w:rFonts w:ascii="source sans 3" w:eastAsia="source sans 3" w:hAnsi="source sans 3" w:cs="source sans 3"/>
-                <w:color w:val="000000"/>
-                <w:sz w:val="17"/>
-              </w:rPr>
-              <w:t>file:10]</w:t>
-            </w:r>
-          </w:p>
-        </w:tc>
-        <w:tc>
-          <w:tcPr>
-            <w:tcW w:w="889" w:type="dxa"/>
+            <w:r>
+              <w:rPr>
+                <w:rFonts w:ascii="source sans 3" w:eastAsia="source sans 3" w:hAnsi="source sans 3" w:cs="source sans 3"/>
+                <w:color w:val="000000"/>
+                <w:sz w:val="17"/>
+              </w:rPr>
+              <w:t xml:space="preserve"> User 1</w:t>
+            </w:r>
+          </w:p>
+        </w:tc>
+        <w:tc>
+          <w:tcPr>
+            <w:tcW w:w="0" w:type="auto"/>
+            <w:tcBorders>
+              <w:top w:val="single" w:sz="1" w:space="0" w:color="000000"/>
+              <w:bottom w:val="single" w:sz="1" w:space="0" w:color="000000"/>
+            </w:tcBorders>
+          </w:tcPr>
+          <w:p>
+            <w:pPr>
+              <w:spacing w:line="360" w:lineRule="auto"/>
+            </w:pPr>
+            <w:r>
+              <w:rPr>
+                <w:rFonts w:ascii="source sans 3" w:eastAsia="source sans 3" w:hAnsi="source sans 3" w:cs="source sans 3"/>
+                <w:color w:val="000000"/>
+                <w:sz w:val="17"/>
+              </w:rPr>
+              <w:t>Reservation is blocked because the maximum active reservation count is 3.</w:t>
+            </w:r>
+          </w:p>
+        </w:tc>
+        <w:tc>
+          <w:tcPr>
+            <w:tcW w:w="3725" w:type="dxa"/>
             <w:tcBorders>
               <w:top w:val="single" w:sz="2" w:space="0" w:color="000000"/>
               <w:left w:val="single" w:sz="4" w:space="0" w:color="auto"/>
@@ -908,6 +1115,66 @@
                 <w:sz w:val="17"/>
               </w:rPr>
             </w:pPr>
+            <w:r>
+              <w:rPr>
+                <w:rFonts w:ascii="source sans 3" w:eastAsia="source sans 3" w:hAnsi="source sans 3" w:cs="source sans 3"/>
+                <w:color w:val="000000"/>
+                <w:sz w:val="17"/>
+              </w:rPr>
+              <w:drawing>
+                <wp:inline distT="0" distB="0" distL="0" distR="0" wp14:anchorId="508E2025" wp14:editId="77741F0D">
+                  <wp:extent cx="1762138" cy="857256"/>
+                  <wp:effectExtent l="0" t="0" r="9525" b="0"/>
+                  <wp:docPr id="177236645" name="Picture 1"/>
+                  <wp:cNvGraphicFramePr>
+                    <a:graphicFrameLocks xmlns:a="http://schemas.openxmlformats.org/drawingml/2006/main" noChangeAspect="1"/>
+                  </wp:cNvGraphicFramePr>
+                  <a:graphic xmlns:a="http://schemas.openxmlformats.org/drawingml/2006/main">
+                    <a:graphicData uri="http://schemas.openxmlformats.org/drawingml/2006/picture">
+                      <pic:pic xmlns:pic="http://schemas.openxmlformats.org/drawingml/2006/picture">
+                        <pic:nvPicPr>
+                          <pic:cNvPr id="177236645" name=""/>
+                          <pic:cNvPicPr/>
+                        </pic:nvPicPr>
+                        <pic:blipFill>
+                          <a:blip r:embed="rId7"/>
+                          <a:stretch>
+                            <a:fillRect/>
+                          </a:stretch>
+                        </pic:blipFill>
+                        <pic:spPr>
+                          <a:xfrm>
+                            <a:off x="0" y="0"/>
+                            <a:ext cx="1762138" cy="857256"/>
+                          </a:xfrm>
+                          <a:prstGeom prst="rect">
+                            <a:avLst/>
+                          </a:prstGeom>
+                        </pic:spPr>
+                      </pic:pic>
+                    </a:graphicData>
+                  </a:graphic>
+                </wp:inline>
+              </w:drawing>
+            </w:r>
+          </w:p>
+          <w:p>
+            <w:pPr>
+              <w:spacing w:line="360" w:lineRule="auto"/>
+              <w:rPr>
+                <w:rFonts w:ascii="source sans 3" w:eastAsia="source sans 3" w:hAnsi="source sans 3" w:cs="source sans 3"/>
+                <w:color w:val="000000"/>
+                <w:sz w:val="17"/>
+              </w:rPr>
+            </w:pPr>
+            <w:r>
+              <w:rPr>
+                <w:rFonts w:ascii="source sans 3" w:eastAsia="source sans 3" w:hAnsi="source sans 3" w:cs="source sans 3"/>
+                <w:color w:val="000000"/>
+                <w:sz w:val="17"/>
+              </w:rPr>
+              <w:t>Pass</w:t>
+            </w:r>
           </w:p>
         </w:tc>
       </w:tr>
@@ -919,7 +1186,7 @@
         </w:trPr>
         <w:tc>
           <w:tcPr>
-            <w:tcW w:w="0" w:type="auto"/>
+            <w:tcW w:w="622" w:type="dxa"/>
             <w:tcBorders>
               <w:top w:val="single" w:sz="1" w:space="0" w:color="000000"/>
               <w:bottom w:val="single" w:sz="1" w:space="0" w:color="000000"/>
@@ -984,69 +1251,41 @@
               </w:rPr>
               <w:t>Create one active reservation for a member and book, then try reserving the same book again.</w:t>
             </w:r>
-          </w:p>
-        </w:tc>
-        <w:tc>
-          <w:tcPr>
-            <w:tcW w:w="0" w:type="auto"/>
-            <w:tcBorders>
-              <w:top w:val="single" w:sz="1" w:space="0" w:color="000000"/>
-              <w:bottom w:val="single" w:sz="1" w:space="0" w:color="000000"/>
-            </w:tcBorders>
-          </w:tcPr>
-          <w:p>
-            <w:pPr>
-              <w:spacing w:line="360" w:lineRule="auto"/>
-            </w:pPr>
-            <w:r>
-              <w:rPr>
-                <w:rFonts w:ascii="source sans 3" w:eastAsia="source sans 3" w:hAnsi="source sans 3" w:cs="source sans 3"/>
-                <w:color w:val="000000"/>
-                <w:sz w:val="17"/>
-              </w:rPr>
-              <w:t xml:space="preserve">Reservation is blocked because the member already has an active reservation for that </w:t>
-            </w:r>
-            <w:proofErr w:type="gramStart"/>
-            <w:r>
-              <w:rPr>
-                <w:rFonts w:ascii="source sans 3" w:eastAsia="source sans 3" w:hAnsi="source sans 3" w:cs="source sans 3"/>
-                <w:color w:val="000000"/>
-                <w:sz w:val="17"/>
-              </w:rPr>
-              <w:t>book.[</w:t>
-            </w:r>
-            <w:proofErr w:type="gramEnd"/>
-            <w:r>
-              <w:rPr>
-                <w:rFonts w:ascii="source sans 3" w:eastAsia="source sans 3" w:hAnsi="source sans 3" w:cs="source sans 3"/>
-                <w:color w:val="000000"/>
-                <w:sz w:val="17"/>
-              </w:rPr>
-              <w:t>file:</w:t>
-            </w:r>
-            <w:proofErr w:type="gramStart"/>
-            <w:r>
-              <w:rPr>
-                <w:rFonts w:ascii="source sans 3" w:eastAsia="source sans 3" w:hAnsi="source sans 3" w:cs="source sans 3"/>
-                <w:color w:val="000000"/>
-                <w:sz w:val="17"/>
-              </w:rPr>
-              <w:t>7][</w:t>
-            </w:r>
-            <w:proofErr w:type="gramEnd"/>
-            <w:r>
-              <w:rPr>
-                <w:rFonts w:ascii="source sans 3" w:eastAsia="source sans 3" w:hAnsi="source sans 3" w:cs="source sans 3"/>
-                <w:color w:val="000000"/>
-                <w:sz w:val="17"/>
-              </w:rPr>
-              <w:t>file:10]</w:t>
-            </w:r>
-          </w:p>
-        </w:tc>
-        <w:tc>
-          <w:tcPr>
-            <w:tcW w:w="889" w:type="dxa"/>
+            <w:r>
+              <w:rPr>
+                <w:rFonts w:ascii="source sans 3" w:eastAsia="source sans 3" w:hAnsi="source sans 3" w:cs="source sans 3"/>
+                <w:color w:val="000000"/>
+                <w:sz w:val="17"/>
+              </w:rPr>
+              <w:t xml:space="preserve"> User 2</w:t>
+            </w:r>
+          </w:p>
+        </w:tc>
+        <w:tc>
+          <w:tcPr>
+            <w:tcW w:w="0" w:type="auto"/>
+            <w:tcBorders>
+              <w:top w:val="single" w:sz="1" w:space="0" w:color="000000"/>
+              <w:bottom w:val="single" w:sz="1" w:space="0" w:color="000000"/>
+            </w:tcBorders>
+          </w:tcPr>
+          <w:p>
+            <w:pPr>
+              <w:spacing w:line="360" w:lineRule="auto"/>
+            </w:pPr>
+            <w:r>
+              <w:rPr>
+                <w:rFonts w:ascii="source sans 3" w:eastAsia="source sans 3" w:hAnsi="source sans 3" w:cs="source sans 3"/>
+                <w:color w:val="000000"/>
+                <w:sz w:val="17"/>
+              </w:rPr>
+              <w:t>Reservation is blocked because the member already has an active reservation for that book.</w:t>
+            </w:r>
+          </w:p>
+        </w:tc>
+        <w:tc>
+          <w:tcPr>
+            <w:tcW w:w="3725" w:type="dxa"/>
             <w:tcBorders>
               <w:top w:val="single" w:sz="2" w:space="0" w:color="000000"/>
               <w:left w:val="single" w:sz="4" w:space="0" w:color="auto"/>
@@ -1062,6 +1301,66 @@
                 <w:sz w:val="17"/>
               </w:rPr>
             </w:pPr>
+            <w:r>
+              <w:rPr>
+                <w:rFonts w:ascii="source sans 3" w:eastAsia="source sans 3" w:hAnsi="source sans 3" w:cs="source sans 3"/>
+                <w:color w:val="000000"/>
+                <w:sz w:val="17"/>
+              </w:rPr>
+              <w:drawing>
+                <wp:inline distT="0" distB="0" distL="0" distR="0" wp14:anchorId="186B4446" wp14:editId="6626EAAC">
+                  <wp:extent cx="1638312" cy="752481"/>
+                  <wp:effectExtent l="0" t="0" r="0" b="9525"/>
+                  <wp:docPr id="631162644" name="Picture 1"/>
+                  <wp:cNvGraphicFramePr>
+                    <a:graphicFrameLocks xmlns:a="http://schemas.openxmlformats.org/drawingml/2006/main" noChangeAspect="1"/>
+                  </wp:cNvGraphicFramePr>
+                  <a:graphic xmlns:a="http://schemas.openxmlformats.org/drawingml/2006/main">
+                    <a:graphicData uri="http://schemas.openxmlformats.org/drawingml/2006/picture">
+                      <pic:pic xmlns:pic="http://schemas.openxmlformats.org/drawingml/2006/picture">
+                        <pic:nvPicPr>
+                          <pic:cNvPr id="631162644" name=""/>
+                          <pic:cNvPicPr/>
+                        </pic:nvPicPr>
+                        <pic:blipFill>
+                          <a:blip r:embed="rId8"/>
+                          <a:stretch>
+                            <a:fillRect/>
+                          </a:stretch>
+                        </pic:blipFill>
+                        <pic:spPr>
+                          <a:xfrm>
+                            <a:off x="0" y="0"/>
+                            <a:ext cx="1638312" cy="752481"/>
+                          </a:xfrm>
+                          <a:prstGeom prst="rect">
+                            <a:avLst/>
+                          </a:prstGeom>
+                        </pic:spPr>
+                      </pic:pic>
+                    </a:graphicData>
+                  </a:graphic>
+                </wp:inline>
+              </w:drawing>
+            </w:r>
+          </w:p>
+          <w:p>
+            <w:pPr>
+              <w:spacing w:line="360" w:lineRule="auto"/>
+              <w:rPr>
+                <w:rFonts w:ascii="source sans 3" w:eastAsia="source sans 3" w:hAnsi="source sans 3" w:cs="source sans 3"/>
+                <w:color w:val="000000"/>
+                <w:sz w:val="17"/>
+              </w:rPr>
+            </w:pPr>
+            <w:r>
+              <w:rPr>
+                <w:rFonts w:ascii="source sans 3" w:eastAsia="source sans 3" w:hAnsi="source sans 3" w:cs="source sans 3"/>
+                <w:color w:val="000000"/>
+                <w:sz w:val="17"/>
+              </w:rPr>
+              <w:t>Pass</w:t>
+            </w:r>
           </w:p>
         </w:tc>
       </w:tr>
@@ -1073,21 +1372,24 @@
         </w:trPr>
         <w:tc>
           <w:tcPr>
-            <w:tcW w:w="0" w:type="auto"/>
-            <w:tcBorders>
-              <w:top w:val="single" w:sz="1" w:space="0" w:color="000000"/>
-              <w:bottom w:val="single" w:sz="1" w:space="0" w:color="000000"/>
-              <w:right w:val="single" w:sz="1" w:space="0" w:color="000000"/>
-            </w:tcBorders>
-          </w:tcPr>
-          <w:p>
-            <w:pPr>
-              <w:spacing w:line="360" w:lineRule="auto"/>
-            </w:pPr>
-            <w:r>
-              <w:rPr>
-                <w:rFonts w:ascii="source sans 3" w:eastAsia="source sans 3" w:hAnsi="source sans 3" w:cs="source sans 3"/>
-                <w:color w:val="000000"/>
+            <w:tcW w:w="622" w:type="dxa"/>
+            <w:tcBorders>
+              <w:top w:val="single" w:sz="1" w:space="0" w:color="000000"/>
+              <w:bottom w:val="single" w:sz="1" w:space="0" w:color="000000"/>
+              <w:right w:val="single" w:sz="1" w:space="0" w:color="000000"/>
+            </w:tcBorders>
+          </w:tcPr>
+          <w:p>
+            <w:pPr>
+              <w:spacing w:line="360" w:lineRule="auto"/>
+              <w:rPr>
+                <w:color w:val="EE0000"/>
+              </w:rPr>
+            </w:pPr>
+            <w:r>
+              <w:rPr>
+                <w:rFonts w:ascii="source sans 3" w:eastAsia="source sans 3" w:hAnsi="source sans 3" w:cs="source sans 3"/>
+                <w:color w:val="EE0000"/>
                 <w:sz w:val="17"/>
               </w:rPr>
               <w:t>R6</w:t>
@@ -1106,11 +1408,14 @@
           <w:p>
             <w:pPr>
               <w:spacing w:line="360" w:lineRule="auto"/>
-            </w:pPr>
-            <w:r>
-              <w:rPr>
-                <w:rFonts w:ascii="source sans 3" w:eastAsia="source sans 3" w:hAnsi="source sans 3" w:cs="source sans 3"/>
-                <w:color w:val="000000"/>
+              <w:rPr>
+                <w:color w:val="EE0000"/>
+              </w:rPr>
+            </w:pPr>
+            <w:r>
+              <w:rPr>
+                <w:rFonts w:ascii="source sans 3" w:eastAsia="source sans 3" w:hAnsi="source sans 3" w:cs="source sans 3"/>
+                <w:color w:val="EE0000"/>
                 <w:sz w:val="17"/>
               </w:rPr>
               <w:t>Return book with no waiting reservation</w:t>
@@ -1129,11 +1434,16 @@
           <w:p>
             <w:pPr>
               <w:spacing w:line="360" w:lineRule="auto"/>
-            </w:pPr>
-            <w:r>
-              <w:rPr>
-                <w:rFonts w:ascii="source sans 3" w:eastAsia="source sans 3" w:hAnsi="source sans 3" w:cs="source sans 3"/>
-                <w:color w:val="000000"/>
+              <w:rPr>
+                <w:rFonts w:ascii="source sans 3" w:eastAsia="source sans 3" w:hAnsi="source sans 3" w:cs="source sans 3"/>
+                <w:color w:val="EE0000"/>
+                <w:sz w:val="17"/>
+              </w:rPr>
+            </w:pPr>
+            <w:r>
+              <w:rPr>
+                <w:rFonts w:ascii="source sans 3" w:eastAsia="source sans 3" w:hAnsi="source sans 3" w:cs="source sans 3"/>
+                <w:color w:val="EE0000"/>
                 <w:sz w:val="17"/>
               </w:rPr>
               <w:t xml:space="preserve">Return a loan for a book that has no </w:t>
@@ -1142,7 +1452,7 @@
             <w:r>
               <w:rPr>
                 <w:rFonts w:ascii="source sans 3" w:eastAsia="source sans 3" w:hAnsi="source sans 3" w:cs="source sans 3"/>
-                <w:color w:val="000000"/>
+                <w:color w:val="EE0000"/>
                 <w:sz w:val="17"/>
               </w:rPr>
               <w:t>queued</w:t>
@@ -1151,56 +1461,63 @@
             <w:r>
               <w:rPr>
                 <w:rFonts w:ascii="source sans 3" w:eastAsia="source sans 3" w:hAnsi="source sans 3" w:cs="source sans 3"/>
-                <w:color w:val="000000"/>
+                <w:color w:val="EE0000"/>
                 <w:sz w:val="17"/>
               </w:rPr>
               <w:t xml:space="preserve"> reservation.</w:t>
             </w:r>
-          </w:p>
-        </w:tc>
-        <w:tc>
-          <w:tcPr>
-            <w:tcW w:w="0" w:type="auto"/>
-            <w:tcBorders>
-              <w:top w:val="single" w:sz="1" w:space="0" w:color="000000"/>
-              <w:bottom w:val="single" w:sz="1" w:space="0" w:color="000000"/>
-            </w:tcBorders>
-          </w:tcPr>
-          <w:p>
-            <w:pPr>
-              <w:spacing w:line="360" w:lineRule="auto"/>
-            </w:pPr>
-            <w:r>
-              <w:rPr>
-                <w:rFonts w:ascii="source sans 3" w:eastAsia="source sans 3" w:hAnsi="source sans 3" w:cs="source sans 3"/>
-                <w:color w:val="000000"/>
-                <w:sz w:val="17"/>
-              </w:rPr>
-              <w:t xml:space="preserve">Loan is marked returned and the book's available copies increase by </w:t>
-            </w:r>
-            <w:proofErr w:type="gramStart"/>
-            <w:r>
-              <w:rPr>
-                <w:rFonts w:ascii="source sans 3" w:eastAsia="source sans 3" w:hAnsi="source sans 3" w:cs="source sans 3"/>
-                <w:color w:val="000000"/>
-                <w:sz w:val="17"/>
-              </w:rPr>
-              <w:t>one.[</w:t>
-            </w:r>
-            <w:proofErr w:type="gramEnd"/>
-            <w:r>
-              <w:rPr>
-                <w:rFonts w:ascii="source sans 3" w:eastAsia="source sans 3" w:hAnsi="source sans 3" w:cs="source sans 3"/>
-                <w:color w:val="000000"/>
-                <w:sz w:val="17"/>
-              </w:rPr>
-              <w:t>file:10]</w:t>
-            </w:r>
-          </w:p>
-        </w:tc>
-        <w:tc>
-          <w:tcPr>
-            <w:tcW w:w="889" w:type="dxa"/>
+            <w:r>
+              <w:rPr>
+                <w:rFonts w:ascii="source sans 3" w:eastAsia="source sans 3" w:hAnsi="source sans 3" w:cs="source sans 3"/>
+                <w:color w:val="EE0000"/>
+                <w:sz w:val="17"/>
+              </w:rPr>
+              <w:t xml:space="preserve"> </w:t>
+            </w:r>
+          </w:p>
+          <w:p>
+            <w:pPr>
+              <w:spacing w:line="360" w:lineRule="auto"/>
+              <w:rPr>
+                <w:color w:val="EE0000"/>
+              </w:rPr>
+            </w:pPr>
+            <w:r>
+              <w:rPr>
+                <w:color w:val="EE0000"/>
+              </w:rPr>
+              <w:t>User 2 clean code (3)</w:t>
+            </w:r>
+          </w:p>
+        </w:tc>
+        <w:tc>
+          <w:tcPr>
+            <w:tcW w:w="0" w:type="auto"/>
+            <w:tcBorders>
+              <w:top w:val="single" w:sz="1" w:space="0" w:color="000000"/>
+              <w:bottom w:val="single" w:sz="1" w:space="0" w:color="000000"/>
+            </w:tcBorders>
+          </w:tcPr>
+          <w:p>
+            <w:pPr>
+              <w:spacing w:line="360" w:lineRule="auto"/>
+              <w:rPr>
+                <w:color w:val="EE0000"/>
+              </w:rPr>
+            </w:pPr>
+            <w:r>
+              <w:rPr>
+                <w:rFonts w:ascii="source sans 3" w:eastAsia="source sans 3" w:hAnsi="source sans 3" w:cs="source sans 3"/>
+                <w:color w:val="EE0000"/>
+                <w:sz w:val="17"/>
+              </w:rPr>
+              <w:t>Loan is marked returned and the book's available copies increase by one.</w:t>
+            </w:r>
+          </w:p>
+        </w:tc>
+        <w:tc>
+          <w:tcPr>
+            <w:tcW w:w="3725" w:type="dxa"/>
             <w:tcBorders>
               <w:top w:val="single" w:sz="2" w:space="0" w:color="000000"/>
               <w:left w:val="single" w:sz="4" w:space="0" w:color="auto"/>
@@ -1212,10 +1529,70 @@
               <w:spacing w:line="360" w:lineRule="auto"/>
               <w:rPr>
                 <w:rFonts w:ascii="source sans 3" w:eastAsia="source sans 3" w:hAnsi="source sans 3" w:cs="source sans 3"/>
-                <w:color w:val="000000"/>
-                <w:sz w:val="17"/>
-              </w:rPr>
-            </w:pPr>
+                <w:color w:val="EE0000"/>
+                <w:sz w:val="17"/>
+              </w:rPr>
+            </w:pPr>
+            <w:r>
+              <w:rPr>
+                <w:rFonts w:ascii="source sans 3" w:eastAsia="source sans 3" w:hAnsi="source sans 3" w:cs="source sans 3"/>
+                <w:color w:val="EE0000"/>
+                <w:sz w:val="17"/>
+              </w:rPr>
+              <w:drawing>
+                <wp:inline distT="0" distB="0" distL="0" distR="0" wp14:anchorId="1E5C8B1E" wp14:editId="5F51C933">
+                  <wp:extent cx="1666887" cy="762006"/>
+                  <wp:effectExtent l="0" t="0" r="0" b="0"/>
+                  <wp:docPr id="595131875" name="Picture 1"/>
+                  <wp:cNvGraphicFramePr>
+                    <a:graphicFrameLocks xmlns:a="http://schemas.openxmlformats.org/drawingml/2006/main" noChangeAspect="1"/>
+                  </wp:cNvGraphicFramePr>
+                  <a:graphic xmlns:a="http://schemas.openxmlformats.org/drawingml/2006/main">
+                    <a:graphicData uri="http://schemas.openxmlformats.org/drawingml/2006/picture">
+                      <pic:pic xmlns:pic="http://schemas.openxmlformats.org/drawingml/2006/picture">
+                        <pic:nvPicPr>
+                          <pic:cNvPr id="595131875" name=""/>
+                          <pic:cNvPicPr/>
+                        </pic:nvPicPr>
+                        <pic:blipFill>
+                          <a:blip r:embed="rId9"/>
+                          <a:stretch>
+                            <a:fillRect/>
+                          </a:stretch>
+                        </pic:blipFill>
+                        <pic:spPr>
+                          <a:xfrm>
+                            <a:off x="0" y="0"/>
+                            <a:ext cx="1666887" cy="762006"/>
+                          </a:xfrm>
+                          <a:prstGeom prst="rect">
+                            <a:avLst/>
+                          </a:prstGeom>
+                        </pic:spPr>
+                      </pic:pic>
+                    </a:graphicData>
+                  </a:graphic>
+                </wp:inline>
+              </w:drawing>
+            </w:r>
+          </w:p>
+          <w:p>
+            <w:pPr>
+              <w:spacing w:line="360" w:lineRule="auto"/>
+              <w:rPr>
+                <w:rFonts w:ascii="source sans 3" w:eastAsia="source sans 3" w:hAnsi="source sans 3" w:cs="source sans 3"/>
+                <w:color w:val="EE0000"/>
+                <w:sz w:val="17"/>
+              </w:rPr>
+            </w:pPr>
+            <w:r>
+              <w:rPr>
+                <w:rFonts w:ascii="source sans 3" w:eastAsia="source sans 3" w:hAnsi="source sans 3" w:cs="source sans 3"/>
+                <w:color w:val="EE0000"/>
+                <w:sz w:val="17"/>
+              </w:rPr>
+              <w:t>FAIL</w:t>
+            </w:r>
           </w:p>
         </w:tc>
       </w:tr>
@@ -1227,24 +1604,23 @@
         </w:trPr>
         <w:tc>
           <w:tcPr>
-            <w:tcW w:w="0" w:type="auto"/>
-            <w:tcBorders>
-              <w:top w:val="single" w:sz="1" w:space="0" w:color="000000"/>
-              <w:bottom w:val="single" w:sz="1" w:space="0" w:color="000000"/>
-              <w:right w:val="single" w:sz="1" w:space="0" w:color="000000"/>
-            </w:tcBorders>
-          </w:tcPr>
-          <w:p>
-            <w:pPr>
-              <w:spacing w:line="360" w:lineRule="auto"/>
-            </w:pPr>
-            <w:r>
-              <w:rPr>
-                <w:rFonts w:ascii="source sans 3" w:eastAsia="source sans 3" w:hAnsi="source sans 3" w:cs="source sans 3"/>
-                <w:color w:val="000000"/>
-                <w:sz w:val="17"/>
-              </w:rPr>
-              <w:lastRenderedPageBreak/>
+            <w:tcW w:w="622" w:type="dxa"/>
+            <w:tcBorders>
+              <w:top w:val="single" w:sz="1" w:space="0" w:color="000000"/>
+              <w:bottom w:val="single" w:sz="1" w:space="0" w:color="000000"/>
+              <w:right w:val="single" w:sz="1" w:space="0" w:color="000000"/>
+            </w:tcBorders>
+          </w:tcPr>
+          <w:p>
+            <w:pPr>
+              <w:spacing w:line="360" w:lineRule="auto"/>
+            </w:pPr>
+            <w:r>
+              <w:rPr>
+                <w:rFonts w:ascii="source sans 3" w:eastAsia="source sans 3" w:hAnsi="source sans 3" w:cs="source sans 3"/>
+                <w:color w:val="000000"/>
+                <w:sz w:val="17"/>
+              </w:rPr>
               <w:t>R7</w:t>
             </w:r>
           </w:p>
@@ -1311,6 +1687,60 @@
               </w:rPr>
               <w:t>.</w:t>
             </w:r>
+            <w:r>
+              <w:rPr>
+                <w:rFonts w:ascii="source sans 3" w:eastAsia="source sans 3" w:hAnsi="source sans 3" w:cs="source sans 3"/>
+                <w:color w:val="000000"/>
+                <w:sz w:val="17"/>
+              </w:rPr>
+              <w:t xml:space="preserve"> </w:t>
+            </w:r>
+            <w:r>
+              <w:rPr>
+                <w:rFonts w:ascii="source sans 3" w:eastAsia="source sans 3" w:hAnsi="source sans 3" w:cs="source sans 3"/>
+                <w:b/>
+                <w:bCs/>
+                <w:color w:val="000000"/>
+                <w:sz w:val="17"/>
+              </w:rPr>
+              <w:t>Member 1 (Alice Martin)</w:t>
+            </w:r>
+            <w:r>
+              <w:rPr>
+                <w:rFonts w:ascii="source sans 3" w:eastAsia="source sans 3" w:hAnsi="source sans 3" w:cs="source sans 3"/>
+                <w:color w:val="000000"/>
+                <w:sz w:val="17"/>
+              </w:rPr>
+              <w:t xml:space="preserve"> returning </w:t>
+            </w:r>
+            <w:r>
+              <w:rPr>
+                <w:rFonts w:ascii="source sans 3" w:eastAsia="source sans 3" w:hAnsi="source sans 3" w:cs="source sans 3"/>
+                <w:b/>
+                <w:bCs/>
+                <w:color w:val="000000"/>
+                <w:sz w:val="17"/>
+              </w:rPr>
+              <w:t>Book 11 – “The Art of Computer Programming, Vol. 1”</w:t>
+            </w:r>
+            <w:r>
+              <w:rPr>
+                <w:rFonts w:ascii="source sans 3" w:eastAsia="source sans 3" w:hAnsi="source sans 3" w:cs="source sans 3"/>
+                <w:color w:val="000000"/>
+                <w:sz w:val="17"/>
+              </w:rPr>
+              <w:t xml:space="preserve">, and the waiting reservation should belong to </w:t>
+            </w:r>
+            <w:r>
+              <w:rPr>
+                <w:rFonts w:ascii="source sans 3" w:eastAsia="source sans 3" w:hAnsi="source sans 3" w:cs="source sans 3"/>
+                <w:b/>
+                <w:bCs/>
+                <w:color w:val="000000"/>
+                <w:sz w:val="17"/>
+              </w:rPr>
+              <w:t>Member 4</w:t>
+            </w:r>
           </w:p>
         </w:tc>
         <w:tc>
@@ -1351,7 +1781,7 @@
                 <w:color w:val="000000"/>
                 <w:sz w:val="17"/>
               </w:rPr>
-              <w:t xml:space="preserve"> and available copies are not incremented for open </w:t>
+              <w:t xml:space="preserve"> and available copies are not </w:t>
             </w:r>
             <w:proofErr w:type="gramStart"/>
             <w:r>
@@ -1360,7 +1790,7 @@
                 <w:color w:val="000000"/>
                 <w:sz w:val="17"/>
               </w:rPr>
-              <w:t>borrowing.[</w:t>
+              <w:t>incremented</w:t>
             </w:r>
             <w:proofErr w:type="gramEnd"/>
             <w:r>
@@ -1369,37 +1799,81 @@
                 <w:color w:val="000000"/>
                 <w:sz w:val="17"/>
               </w:rPr>
-              <w:t>file:</w:t>
-            </w:r>
-            <w:proofErr w:type="gramStart"/>
-            <w:r>
-              <w:rPr>
-                <w:rFonts w:ascii="source sans 3" w:eastAsia="source sans 3" w:hAnsi="source sans 3" w:cs="source sans 3"/>
-                <w:color w:val="000000"/>
-                <w:sz w:val="17"/>
-              </w:rPr>
-              <w:t>7][</w:t>
-            </w:r>
-            <w:proofErr w:type="gramEnd"/>
-            <w:r>
-              <w:rPr>
-                <w:rFonts w:ascii="source sans 3" w:eastAsia="source sans 3" w:hAnsi="source sans 3" w:cs="source sans 3"/>
-                <w:color w:val="000000"/>
-                <w:sz w:val="17"/>
-              </w:rPr>
-              <w:t>file:10]</w:t>
-            </w:r>
-          </w:p>
-        </w:tc>
-        <w:tc>
-          <w:tcPr>
-            <w:tcW w:w="889" w:type="dxa"/>
+              <w:t xml:space="preserve"> for open borrowing</w:t>
+            </w:r>
+          </w:p>
+        </w:tc>
+        <w:tc>
+          <w:tcPr>
+            <w:tcW w:w="3725" w:type="dxa"/>
             <w:tcBorders>
               <w:top w:val="single" w:sz="2" w:space="0" w:color="000000"/>
               <w:left w:val="single" w:sz="4" w:space="0" w:color="auto"/>
               <w:bottom w:val="single" w:sz="2" w:space="0" w:color="000000"/>
             </w:tcBorders>
           </w:tcPr>
+          <w:p>
+            <w:pPr>
+              <w:spacing w:line="360" w:lineRule="auto"/>
+              <w:rPr>
+                <w:rFonts w:ascii="source sans 3" w:eastAsia="source sans 3" w:hAnsi="source sans 3" w:cs="source sans 3"/>
+                <w:color w:val="000000"/>
+                <w:sz w:val="17"/>
+              </w:rPr>
+            </w:pPr>
+            <w:r>
+              <w:rPr>
+                <w:rFonts w:ascii="source sans 3" w:eastAsia="source sans 3" w:hAnsi="source sans 3" w:cs="source sans 3"/>
+                <w:color w:val="000000"/>
+                <w:sz w:val="17"/>
+              </w:rPr>
+              <w:drawing>
+                <wp:inline distT="0" distB="0" distL="0" distR="0" wp14:anchorId="66840A97" wp14:editId="72973EC9">
+                  <wp:extent cx="2105040" cy="904882"/>
+                  <wp:effectExtent l="0" t="0" r="0" b="9525"/>
+                  <wp:docPr id="1274007367" name="Picture 1"/>
+                  <wp:cNvGraphicFramePr>
+                    <a:graphicFrameLocks xmlns:a="http://schemas.openxmlformats.org/drawingml/2006/main" noChangeAspect="1"/>
+                  </wp:cNvGraphicFramePr>
+                  <a:graphic xmlns:a="http://schemas.openxmlformats.org/drawingml/2006/main">
+                    <a:graphicData uri="http://schemas.openxmlformats.org/drawingml/2006/picture">
+                      <pic:pic xmlns:pic="http://schemas.openxmlformats.org/drawingml/2006/picture">
+                        <pic:nvPicPr>
+                          <pic:cNvPr id="1274007367" name=""/>
+                          <pic:cNvPicPr/>
+                        </pic:nvPicPr>
+                        <pic:blipFill>
+                          <a:blip r:embed="rId10"/>
+                          <a:stretch>
+                            <a:fillRect/>
+                          </a:stretch>
+                        </pic:blipFill>
+                        <pic:spPr>
+                          <a:xfrm>
+                            <a:off x="0" y="0"/>
+                            <a:ext cx="2105040" cy="904882"/>
+                          </a:xfrm>
+                          <a:prstGeom prst="rect">
+                            <a:avLst/>
+                          </a:prstGeom>
+                        </pic:spPr>
+                      </pic:pic>
+                    </a:graphicData>
+                  </a:graphic>
+                </wp:inline>
+              </w:drawing>
+            </w:r>
+          </w:p>
+          <w:p>
+            <w:pPr>
+              <w:spacing w:line="360" w:lineRule="auto"/>
+              <w:rPr>
+                <w:rFonts w:ascii="source sans 3" w:eastAsia="source sans 3" w:hAnsi="source sans 3" w:cs="source sans 3"/>
+                <w:color w:val="000000"/>
+                <w:sz w:val="17"/>
+              </w:rPr>
+            </w:pPr>
+          </w:p>
           <w:p>
             <w:pPr>
               <w:spacing w:line="360" w:lineRule="auto"/>
@@ -1420,7 +1894,7 @@
         </w:trPr>
         <w:tc>
           <w:tcPr>
-            <w:tcW w:w="0" w:type="auto"/>
+            <w:tcW w:w="622" w:type="dxa"/>
             <w:tcBorders>
               <w:top w:val="single" w:sz="1" w:space="0" w:color="000000"/>
               <w:bottom w:val="single" w:sz="1" w:space="0" w:color="000000"/>
@@ -1583,7 +2057,7 @@
         </w:tc>
         <w:tc>
           <w:tcPr>
-            <w:tcW w:w="889" w:type="dxa"/>
+            <w:tcW w:w="3725" w:type="dxa"/>
             <w:tcBorders>
               <w:top w:val="single" w:sz="2" w:space="0" w:color="000000"/>
               <w:left w:val="single" w:sz="4" w:space="0" w:color="auto"/>
@@ -1610,23 +2084,24 @@
         </w:trPr>
         <w:tc>
           <w:tcPr>
-            <w:tcW w:w="0" w:type="auto"/>
-            <w:tcBorders>
-              <w:top w:val="single" w:sz="1" w:space="0" w:color="000000"/>
-              <w:bottom w:val="single" w:sz="1" w:space="0" w:color="000000"/>
-              <w:right w:val="single" w:sz="1" w:space="0" w:color="000000"/>
-            </w:tcBorders>
-          </w:tcPr>
-          <w:p>
-            <w:pPr>
-              <w:spacing w:line="360" w:lineRule="auto"/>
-            </w:pPr>
-            <w:r>
-              <w:rPr>
-                <w:rFonts w:ascii="source sans 3" w:eastAsia="source sans 3" w:hAnsi="source sans 3" w:cs="source sans 3"/>
-                <w:color w:val="000000"/>
-                <w:sz w:val="17"/>
-              </w:rPr>
+            <w:tcW w:w="622" w:type="dxa"/>
+            <w:tcBorders>
+              <w:top w:val="single" w:sz="1" w:space="0" w:color="000000"/>
+              <w:bottom w:val="single" w:sz="1" w:space="0" w:color="000000"/>
+              <w:right w:val="single" w:sz="1" w:space="0" w:color="000000"/>
+            </w:tcBorders>
+          </w:tcPr>
+          <w:p>
+            <w:pPr>
+              <w:spacing w:line="360" w:lineRule="auto"/>
+            </w:pPr>
+            <w:r>
+              <w:rPr>
+                <w:rFonts w:ascii="source sans 3" w:eastAsia="source sans 3" w:hAnsi="source sans 3" w:cs="source sans 3"/>
+                <w:color w:val="000000"/>
+                <w:sz w:val="17"/>
+              </w:rPr>
+              <w:lastRenderedPageBreak/>
               <w:t>R9</w:t>
             </w:r>
           </w:p>
@@ -1755,7 +2230,7 @@
         </w:tc>
         <w:tc>
           <w:tcPr>
-            <w:tcW w:w="889" w:type="dxa"/>
+            <w:tcW w:w="3725" w:type="dxa"/>
             <w:tcBorders>
               <w:top w:val="single" w:sz="2" w:space="0" w:color="000000"/>
               <w:left w:val="single" w:sz="4" w:space="0" w:color="auto"/>
@@ -1782,7 +2257,7 @@
         </w:trPr>
         <w:tc>
           <w:tcPr>
-            <w:tcW w:w="0" w:type="auto"/>
+            <w:tcW w:w="622" w:type="dxa"/>
             <w:tcBorders>
               <w:top w:val="single" w:sz="1" w:space="0" w:color="000000"/>
               <w:bottom w:val="single" w:sz="1" w:space="0" w:color="000000"/>
@@ -1927,7 +2402,7 @@
         </w:tc>
         <w:tc>
           <w:tcPr>
-            <w:tcW w:w="889" w:type="dxa"/>
+            <w:tcW w:w="3725" w:type="dxa"/>
             <w:tcBorders>
               <w:top w:val="single" w:sz="2" w:space="0" w:color="000000"/>
               <w:left w:val="single" w:sz="4" w:space="0" w:color="auto"/>
@@ -1954,7 +2429,7 @@
         </w:trPr>
         <w:tc>
           <w:tcPr>
-            <w:tcW w:w="0" w:type="auto"/>
+            <w:tcW w:w="622" w:type="dxa"/>
             <w:tcBorders>
               <w:top w:val="single" w:sz="1" w:space="0" w:color="000000"/>
               <w:bottom w:val="single" w:sz="1" w:space="0" w:color="000000"/>
@@ -2081,7 +2556,7 @@
         </w:tc>
         <w:tc>
           <w:tcPr>
-            <w:tcW w:w="889" w:type="dxa"/>
+            <w:tcW w:w="3725" w:type="dxa"/>
             <w:tcBorders>
               <w:top w:val="single" w:sz="2" w:space="0" w:color="000000"/>
               <w:left w:val="single" w:sz="4" w:space="0" w:color="auto"/>
@@ -2108,7 +2583,7 @@
         </w:trPr>
         <w:tc>
           <w:tcPr>
-            <w:tcW w:w="0" w:type="auto"/>
+            <w:tcW w:w="622" w:type="dxa"/>
             <w:tcBorders>
               <w:top w:val="single" w:sz="1" w:space="0" w:color="000000"/>
               <w:bottom w:val="single" w:sz="1" w:space="0" w:color="000000"/>
@@ -2235,7 +2710,7 @@
         </w:tc>
         <w:tc>
           <w:tcPr>
-            <w:tcW w:w="889" w:type="dxa"/>
+            <w:tcW w:w="3725" w:type="dxa"/>
             <w:tcBorders>
               <w:top w:val="single" w:sz="2" w:space="0" w:color="000000"/>
               <w:left w:val="single" w:sz="4" w:space="0" w:color="auto"/>
@@ -2667,7 +3142,6 @@
   <w:style w:type="character" w:default="1" w:styleId="DefaultParagraphFont">
     <w:name w:val="Default Paragraph Font"/>
     <w:uiPriority w:val="1"/>
-    <w:semiHidden/>
     <w:unhideWhenUsed/>
   </w:style>
   <w:style w:type="table" w:default="1" w:styleId="TableNormal">

</xml_diff>

<commit_message>
updating reservation code with fallbacks
</commit_message>
<xml_diff>
--- a/Docs/reservation-test-report.docx
+++ b/Docs/reservation-test-report.docx
@@ -520,7 +520,7 @@
                           <pic:cNvPicPr/>
                         </pic:nvPicPr>
                         <pic:blipFill>
-                          <a:blip r:embed="rId4"/>
+                          <a:blip r:embed="rId5"/>
                           <a:stretch>
                             <a:fillRect/>
                           </a:stretch>
@@ -750,7 +750,7 @@
                           <pic:cNvPicPr/>
                         </pic:nvPicPr>
                         <pic:blipFill>
-                          <a:blip r:embed="rId5"/>
+                          <a:blip r:embed="rId6"/>
                           <a:stretch>
                             <a:fillRect/>
                           </a:stretch>
@@ -960,7 +960,7 @@
                           <pic:cNvPicPr/>
                         </pic:nvPicPr>
                         <pic:blipFill>
-                          <a:blip r:embed="rId6"/>
+                          <a:blip r:embed="rId7"/>
                           <a:stretch>
                             <a:fillRect/>
                           </a:stretch>
@@ -1137,7 +1137,7 @@
                           <pic:cNvPicPr/>
                         </pic:nvPicPr>
                         <pic:blipFill>
-                          <a:blip r:embed="rId7"/>
+                          <a:blip r:embed="rId8"/>
                           <a:stretch>
                             <a:fillRect/>
                           </a:stretch>
@@ -1323,7 +1323,7 @@
                           <pic:cNvPicPr/>
                         </pic:nvPicPr>
                         <pic:blipFill>
-                          <a:blip r:embed="rId8"/>
+                          <a:blip r:embed="rId9"/>
                           <a:stretch>
                             <a:fillRect/>
                           </a:stretch>
@@ -1540,10 +1540,10 @@
                 <w:sz w:val="17"/>
               </w:rPr>
               <w:drawing>
-                <wp:inline distT="0" distB="0" distL="0" distR="0" wp14:anchorId="1E5C8B1E" wp14:editId="5F51C933">
-                  <wp:extent cx="1666887" cy="762006"/>
-                  <wp:effectExtent l="0" t="0" r="0" b="0"/>
-                  <wp:docPr id="595131875" name="Picture 1"/>
+                <wp:inline distT="0" distB="0" distL="0" distR="0" wp14:anchorId="3710C42D" wp14:editId="1942C4EC">
+                  <wp:extent cx="2057415" cy="866781"/>
+                  <wp:effectExtent l="0" t="0" r="0" b="9525"/>
+                  <wp:docPr id="866488771" name="Picture 1"/>
                   <wp:cNvGraphicFramePr>
                     <a:graphicFrameLocks xmlns:a="http://schemas.openxmlformats.org/drawingml/2006/main" noChangeAspect="1"/>
                   </wp:cNvGraphicFramePr>
@@ -1551,11 +1551,11 @@
                     <a:graphicData uri="http://schemas.openxmlformats.org/drawingml/2006/picture">
                       <pic:pic xmlns:pic="http://schemas.openxmlformats.org/drawingml/2006/picture">
                         <pic:nvPicPr>
-                          <pic:cNvPr id="595131875" name=""/>
+                          <pic:cNvPr id="866488771" name=""/>
                           <pic:cNvPicPr/>
                         </pic:nvPicPr>
                         <pic:blipFill>
-                          <a:blip r:embed="rId9"/>
+                          <a:blip r:embed="rId10"/>
                           <a:stretch>
                             <a:fillRect/>
                           </a:stretch>
@@ -1563,7 +1563,7 @@
                         <pic:spPr>
                           <a:xfrm>
                             <a:off x="0" y="0"/>
-                            <a:ext cx="1666887" cy="762006"/>
+                            <a:ext cx="2057415" cy="866781"/>
                           </a:xfrm>
                           <a:prstGeom prst="rect">
                             <a:avLst/>
@@ -1585,13 +1585,23 @@
                 <w:sz w:val="17"/>
               </w:rPr>
             </w:pPr>
-            <w:r>
+          </w:p>
+          <w:p>
+            <w:pPr>
+              <w:spacing w:line="360" w:lineRule="auto"/>
               <w:rPr>
                 <w:rFonts w:ascii="source sans 3" w:eastAsia="source sans 3" w:hAnsi="source sans 3" w:cs="source sans 3"/>
                 <w:color w:val="EE0000"/>
                 <w:sz w:val="17"/>
               </w:rPr>
-              <w:t>FAIL</w:t>
+            </w:pPr>
+            <w:r>
+              <w:rPr>
+                <w:rFonts w:ascii="source sans 3" w:eastAsia="source sans 3" w:hAnsi="source sans 3" w:cs="source sans 3"/>
+                <w:color w:val="EE0000"/>
+                <w:sz w:val="17"/>
+              </w:rPr>
+              <w:t>Fail</w:t>
             </w:r>
           </w:p>
         </w:tc>
@@ -1843,7 +1853,7 @@
                           <pic:cNvPicPr/>
                         </pic:nvPicPr>
                         <pic:blipFill>
-                          <a:blip r:embed="rId10"/>
+                          <a:blip r:embed="rId11"/>
                           <a:stretch>
                             <a:fillRect/>
                           </a:stretch>
@@ -1874,6 +1884,204 @@
               </w:rPr>
             </w:pPr>
           </w:p>
+          <w:p>
+            <w:pPr>
+              <w:spacing w:line="360" w:lineRule="auto"/>
+              <w:rPr>
+                <w:rFonts w:ascii="source sans 3" w:eastAsia="source sans 3" w:hAnsi="source sans 3" w:cs="source sans 3"/>
+                <w:color w:val="000000"/>
+                <w:sz w:val="17"/>
+              </w:rPr>
+            </w:pPr>
+            <w:r>
+              <w:rPr>
+                <w:rFonts w:ascii="source sans 3" w:eastAsia="source sans 3" w:hAnsi="source sans 3" w:cs="source sans 3"/>
+                <w:color w:val="000000"/>
+                <w:sz w:val="17"/>
+              </w:rPr>
+              <w:t xml:space="preserve">Message updated </w:t>
+            </w:r>
+          </w:p>
+        </w:tc>
+      </w:tr>
+      <w:tr>
+        <w:trPr>
+          <w:cantSplit/>
+          <w:tblCellSpacing w:w="0" w:type="dxa"/>
+          <w:jc w:val="center"/>
+        </w:trPr>
+        <w:tc>
+          <w:tcPr>
+            <w:tcW w:w="622" w:type="dxa"/>
+            <w:tcBorders>
+              <w:top w:val="single" w:sz="1" w:space="0" w:color="000000"/>
+              <w:bottom w:val="single" w:sz="1" w:space="0" w:color="000000"/>
+              <w:right w:val="single" w:sz="1" w:space="0" w:color="000000"/>
+            </w:tcBorders>
+          </w:tcPr>
+          <w:p>
+            <w:pPr>
+              <w:spacing w:line="360" w:lineRule="auto"/>
+            </w:pPr>
+            <w:r>
+              <w:rPr>
+                <w:rFonts w:ascii="source sans 3" w:eastAsia="source sans 3" w:hAnsi="source sans 3" w:cs="source sans 3"/>
+                <w:color w:val="000000"/>
+                <w:sz w:val="17"/>
+              </w:rPr>
+              <w:t>R8</w:t>
+            </w:r>
+          </w:p>
+        </w:tc>
+        <w:tc>
+          <w:tcPr>
+            <w:tcW w:w="0" w:type="auto"/>
+            <w:tcBorders>
+              <w:top w:val="single" w:sz="1" w:space="0" w:color="000000"/>
+              <w:bottom w:val="single" w:sz="1" w:space="0" w:color="000000"/>
+              <w:right w:val="single" w:sz="1" w:space="0" w:color="000000"/>
+            </w:tcBorders>
+          </w:tcPr>
+          <w:p>
+            <w:pPr>
+              <w:spacing w:line="360" w:lineRule="auto"/>
+            </w:pPr>
+            <w:r>
+              <w:rPr>
+                <w:rFonts w:ascii="source sans 3" w:eastAsia="source sans 3" w:hAnsi="source sans 3" w:cs="source sans 3"/>
+                <w:color w:val="000000"/>
+                <w:sz w:val="17"/>
+              </w:rPr>
+              <w:t>Collect ready reservation from selected grid row</w:t>
+            </w:r>
+          </w:p>
+        </w:tc>
+        <w:tc>
+          <w:tcPr>
+            <w:tcW w:w="0" w:type="auto"/>
+            <w:tcBorders>
+              <w:top w:val="single" w:sz="1" w:space="0" w:color="000000"/>
+              <w:bottom w:val="single" w:sz="1" w:space="0" w:color="000000"/>
+              <w:right w:val="single" w:sz="1" w:space="0" w:color="000000"/>
+            </w:tcBorders>
+          </w:tcPr>
+          <w:p>
+            <w:pPr>
+              <w:spacing w:line="360" w:lineRule="auto"/>
+            </w:pPr>
+            <w:r>
+              <w:rPr>
+                <w:rFonts w:ascii="source sans 3" w:eastAsia="source sans 3" w:hAnsi="source sans 3" w:cs="source sans 3"/>
+                <w:color w:val="000000"/>
+                <w:sz w:val="17"/>
+              </w:rPr>
+              <w:t xml:space="preserve">On the user dashboard, select a row with status </w:t>
+            </w:r>
+            <w:r>
+              <w:rPr>
+                <w:rStyle w:val="VerbatimChar"/>
+                <w:rFonts w:ascii="menlo" w:eastAsia="menlo" w:hAnsi="menlo" w:cs="menlo"/>
+                <w:color w:val="000000"/>
+                <w:sz w:val="18"/>
+                <w:shd w:val="clear" w:color="auto" w:fill="F8F8FA"/>
+              </w:rPr>
+              <w:t>Available to Collect</w:t>
+            </w:r>
+            <w:r>
+              <w:rPr>
+                <w:rFonts w:ascii="source sans 3" w:eastAsia="source sans 3" w:hAnsi="source sans 3" w:cs="source sans 3"/>
+                <w:color w:val="000000"/>
+                <w:sz w:val="17"/>
+              </w:rPr>
+              <w:t xml:space="preserve"> and click the collect button.</w:t>
+            </w:r>
+          </w:p>
+        </w:tc>
+        <w:tc>
+          <w:tcPr>
+            <w:tcW w:w="0" w:type="auto"/>
+            <w:tcBorders>
+              <w:top w:val="single" w:sz="1" w:space="0" w:color="000000"/>
+              <w:bottom w:val="single" w:sz="1" w:space="0" w:color="000000"/>
+            </w:tcBorders>
+          </w:tcPr>
+          <w:p>
+            <w:pPr>
+              <w:spacing w:line="360" w:lineRule="auto"/>
+            </w:pPr>
+            <w:r>
+              <w:rPr>
+                <w:rFonts w:ascii="source sans 3" w:eastAsia="source sans 3" w:hAnsi="source sans 3" w:cs="source sans 3"/>
+                <w:color w:val="000000"/>
+                <w:sz w:val="17"/>
+              </w:rPr>
+              <w:t xml:space="preserve">Reservation is converted into a loan, reservation becomes </w:t>
+            </w:r>
+            <w:r>
+              <w:rPr>
+                <w:rStyle w:val="VerbatimChar"/>
+                <w:rFonts w:ascii="menlo" w:eastAsia="menlo" w:hAnsi="menlo" w:cs="menlo"/>
+                <w:color w:val="000000"/>
+                <w:sz w:val="18"/>
+                <w:shd w:val="clear" w:color="auto" w:fill="F8F8FA"/>
+              </w:rPr>
+              <w:t>Fulfilled</w:t>
+            </w:r>
+            <w:r>
+              <w:rPr>
+                <w:rFonts w:ascii="source sans 3" w:eastAsia="source sans 3" w:hAnsi="source sans 3" w:cs="source sans 3"/>
+                <w:color w:val="000000"/>
+                <w:sz w:val="17"/>
+              </w:rPr>
+              <w:t xml:space="preserve">, and the dashboard </w:t>
+            </w:r>
+            <w:proofErr w:type="gramStart"/>
+            <w:r>
+              <w:rPr>
+                <w:rFonts w:ascii="source sans 3" w:eastAsia="source sans 3" w:hAnsi="source sans 3" w:cs="source sans 3"/>
+                <w:color w:val="000000"/>
+                <w:sz w:val="17"/>
+              </w:rPr>
+              <w:t>refreshes.[</w:t>
+            </w:r>
+            <w:proofErr w:type="gramEnd"/>
+            <w:r>
+              <w:rPr>
+                <w:rFonts w:ascii="source sans 3" w:eastAsia="source sans 3" w:hAnsi="source sans 3" w:cs="source sans 3"/>
+                <w:color w:val="000000"/>
+                <w:sz w:val="17"/>
+              </w:rPr>
+              <w:t>file:</w:t>
+            </w:r>
+            <w:proofErr w:type="gramStart"/>
+            <w:r>
+              <w:rPr>
+                <w:rFonts w:ascii="source sans 3" w:eastAsia="source sans 3" w:hAnsi="source sans 3" w:cs="source sans 3"/>
+                <w:color w:val="000000"/>
+                <w:sz w:val="17"/>
+              </w:rPr>
+              <w:t>7][</w:t>
+            </w:r>
+            <w:proofErr w:type="gramEnd"/>
+            <w:r>
+              <w:rPr>
+                <w:rFonts w:ascii="source sans 3" w:eastAsia="source sans 3" w:hAnsi="source sans 3" w:cs="source sans 3"/>
+                <w:color w:val="000000"/>
+                <w:sz w:val="17"/>
+              </w:rPr>
+              <w:t>file:14]</w:t>
+            </w:r>
+          </w:p>
+        </w:tc>
+        <w:tc>
+          <w:tcPr>
+            <w:tcW w:w="3725" w:type="dxa"/>
+            <w:tcBorders>
+              <w:top w:val="single" w:sz="2" w:space="0" w:color="000000"/>
+              <w:left w:val="single" w:sz="4" w:space="0" w:color="auto"/>
+              <w:bottom w:val="single" w:sz="2" w:space="0" w:color="000000"/>
+            </w:tcBorders>
+          </w:tcPr>
           <w:p>
             <w:pPr>
               <w:spacing w:line="360" w:lineRule="auto"/>
@@ -1911,7 +2119,8 @@
                 <w:color w:val="000000"/>
                 <w:sz w:val="17"/>
               </w:rPr>
-              <w:t>R8</w:t>
+              <w:lastRenderedPageBreak/>
+              <w:t>R9</w:t>
             </w:r>
           </w:p>
         </w:tc>
@@ -1934,7 +2143,25 @@
                 <w:color w:val="000000"/>
                 <w:sz w:val="17"/>
               </w:rPr>
-              <w:t>Collect ready reservation from selected grid row</w:t>
+              <w:t xml:space="preserve">Collect ready </w:t>
+            </w:r>
+            <w:proofErr w:type="gramStart"/>
+            <w:r>
+              <w:rPr>
+                <w:rFonts w:ascii="source sans 3" w:eastAsia="source sans 3" w:hAnsi="source sans 3" w:cs="source sans 3"/>
+                <w:color w:val="000000"/>
+                <w:sz w:val="17"/>
+              </w:rPr>
+              <w:t>reservation</w:t>
+            </w:r>
+            <w:proofErr w:type="gramEnd"/>
+            <w:r>
+              <w:rPr>
+                <w:rFonts w:ascii="source sans 3" w:eastAsia="source sans 3" w:hAnsi="source sans 3" w:cs="source sans 3"/>
+                <w:color w:val="000000"/>
+                <w:sz w:val="17"/>
+              </w:rPr>
+              <w:t xml:space="preserve"> through popup</w:t>
             </w:r>
           </w:p>
         </w:tc>
@@ -1957,25 +2184,7 @@
                 <w:color w:val="000000"/>
                 <w:sz w:val="17"/>
               </w:rPr>
-              <w:t xml:space="preserve">On the user dashboard, select a row with status </w:t>
-            </w:r>
-            <w:r>
-              <w:rPr>
-                <w:rStyle w:val="VerbatimChar"/>
-                <w:rFonts w:ascii="menlo" w:eastAsia="menlo" w:hAnsi="menlo" w:cs="menlo"/>
-                <w:color w:val="000000"/>
-                <w:sz w:val="18"/>
-                <w:shd w:val="clear" w:color="auto" w:fill="F8F8FA"/>
-              </w:rPr>
-              <w:t>Available to Collect</w:t>
-            </w:r>
-            <w:r>
-              <w:rPr>
-                <w:rFonts w:ascii="source sans 3" w:eastAsia="source sans 3" w:hAnsi="source sans 3" w:cs="source sans 3"/>
-                <w:color w:val="000000"/>
-                <w:sz w:val="17"/>
-              </w:rPr>
-              <w:t xml:space="preserve"> and click the collect button.</w:t>
+              <w:t>Leave no grid row selected, click the collect button, choose a ready reservation in the popup, and confirm.</w:t>
             </w:r>
           </w:p>
         </w:tc>
@@ -1997,25 +2206,7 @@
                 <w:color w:val="000000"/>
                 <w:sz w:val="17"/>
               </w:rPr>
-              <w:t xml:space="preserve">Reservation is converted into a loan, reservation becomes </w:t>
-            </w:r>
-            <w:r>
-              <w:rPr>
-                <w:rStyle w:val="VerbatimChar"/>
-                <w:rFonts w:ascii="menlo" w:eastAsia="menlo" w:hAnsi="menlo" w:cs="menlo"/>
-                <w:color w:val="000000"/>
-                <w:sz w:val="18"/>
-                <w:shd w:val="clear" w:color="auto" w:fill="F8F8FA"/>
-              </w:rPr>
-              <w:t>Fulfilled</w:t>
-            </w:r>
-            <w:r>
-              <w:rPr>
-                <w:rFonts w:ascii="source sans 3" w:eastAsia="source sans 3" w:hAnsi="source sans 3" w:cs="source sans 3"/>
-                <w:color w:val="000000"/>
-                <w:sz w:val="17"/>
-              </w:rPr>
-              <w:t xml:space="preserve">, and the dashboard </w:t>
+              <w:t xml:space="preserve">Selected reservation is collected and a new loan is </w:t>
             </w:r>
             <w:proofErr w:type="gramStart"/>
             <w:r>
@@ -2024,7 +2215,7 @@
                 <w:color w:val="000000"/>
                 <w:sz w:val="17"/>
               </w:rPr>
-              <w:t>refreshes.[</w:t>
+              <w:t>created.[</w:t>
             </w:r>
             <w:proofErr w:type="gramEnd"/>
             <w:r>
@@ -2042,7 +2233,7 @@
                 <w:color w:val="000000"/>
                 <w:sz w:val="17"/>
               </w:rPr>
-              <w:t>7][</w:t>
+              <w:t>13][</w:t>
             </w:r>
             <w:proofErr w:type="gramEnd"/>
             <w:r>
@@ -2101,8 +2292,7 @@
                 <w:color w:val="000000"/>
                 <w:sz w:val="17"/>
               </w:rPr>
-              <w:lastRenderedPageBreak/>
-              <w:t>R9</w:t>
+              <w:t>R10</w:t>
             </w:r>
           </w:p>
         </w:tc>
@@ -2125,25 +2315,7 @@
                 <w:color w:val="000000"/>
                 <w:sz w:val="17"/>
               </w:rPr>
-              <w:t xml:space="preserve">Collect ready </w:t>
-            </w:r>
-            <w:proofErr w:type="gramStart"/>
-            <w:r>
-              <w:rPr>
-                <w:rFonts w:ascii="source sans 3" w:eastAsia="source sans 3" w:hAnsi="source sans 3" w:cs="source sans 3"/>
-                <w:color w:val="000000"/>
-                <w:sz w:val="17"/>
-              </w:rPr>
-              <w:t>reservation</w:t>
-            </w:r>
-            <w:proofErr w:type="gramEnd"/>
-            <w:r>
-              <w:rPr>
-                <w:rFonts w:ascii="source sans 3" w:eastAsia="source sans 3" w:hAnsi="source sans 3" w:cs="source sans 3"/>
-                <w:color w:val="000000"/>
-                <w:sz w:val="17"/>
-              </w:rPr>
-              <w:t xml:space="preserve"> through popup</w:t>
+              <w:t>Reject collection when reservation is not ready</w:t>
             </w:r>
           </w:p>
         </w:tc>
@@ -2166,7 +2338,25 @@
                 <w:color w:val="000000"/>
                 <w:sz w:val="17"/>
               </w:rPr>
-              <w:t>Leave no grid row selected, click the collect button, choose a ready reservation in the popup, and confirm.</w:t>
+              <w:t xml:space="preserve">Attempt to collect a row with status </w:t>
+            </w:r>
+            <w:r>
+              <w:rPr>
+                <w:rStyle w:val="VerbatimChar"/>
+                <w:rFonts w:ascii="menlo" w:eastAsia="menlo" w:hAnsi="menlo" w:cs="menlo"/>
+                <w:color w:val="000000"/>
+                <w:sz w:val="18"/>
+                <w:shd w:val="clear" w:color="auto" w:fill="F8F8FA"/>
+              </w:rPr>
+              <w:t>Reserved</w:t>
+            </w:r>
+            <w:r>
+              <w:rPr>
+                <w:rFonts w:ascii="source sans 3" w:eastAsia="source sans 3" w:hAnsi="source sans 3" w:cs="source sans 3"/>
+                <w:color w:val="000000"/>
+                <w:sz w:val="17"/>
+              </w:rPr>
+              <w:t>.</w:t>
             </w:r>
           </w:p>
         </w:tc>
@@ -2188,7 +2378,7 @@
                 <w:color w:val="000000"/>
                 <w:sz w:val="17"/>
               </w:rPr>
-              <w:t xml:space="preserve">Selected reservation is collected and a new loan is </w:t>
+              <w:t xml:space="preserve">Collection is blocked with a message saying the reservation is not ready to </w:t>
             </w:r>
             <w:proofErr w:type="gramStart"/>
             <w:r>
@@ -2197,7 +2387,7 @@
                 <w:color w:val="000000"/>
                 <w:sz w:val="17"/>
               </w:rPr>
-              <w:t>created.[</w:t>
+              <w:t>collect.[</w:t>
             </w:r>
             <w:proofErr w:type="gramEnd"/>
             <w:r>
@@ -2215,7 +2405,7 @@
                 <w:color w:val="000000"/>
                 <w:sz w:val="17"/>
               </w:rPr>
-              <w:t>13][</w:t>
+              <w:t>7][</w:t>
             </w:r>
             <w:proofErr w:type="gramEnd"/>
             <w:r>
@@ -2274,7 +2464,7 @@
                 <w:color w:val="000000"/>
                 <w:sz w:val="17"/>
               </w:rPr>
-              <w:t>R10</w:t>
+              <w:t>R11</w:t>
             </w:r>
           </w:p>
         </w:tc>
@@ -2297,7 +2487,7 @@
                 <w:color w:val="000000"/>
                 <w:sz w:val="17"/>
               </w:rPr>
-              <w:t>Reject collection when reservation is not ready</w:t>
+              <w:t>Reject collection when member has overdue loan</w:t>
             </w:r>
           </w:p>
         </w:tc>
@@ -2320,25 +2510,7 @@
                 <w:color w:val="000000"/>
                 <w:sz w:val="17"/>
               </w:rPr>
-              <w:t xml:space="preserve">Attempt to collect a row with status </w:t>
-            </w:r>
-            <w:r>
-              <w:rPr>
-                <w:rStyle w:val="VerbatimChar"/>
-                <w:rFonts w:ascii="menlo" w:eastAsia="menlo" w:hAnsi="menlo" w:cs="menlo"/>
-                <w:color w:val="000000"/>
-                <w:sz w:val="18"/>
-                <w:shd w:val="clear" w:color="auto" w:fill="F8F8FA"/>
-              </w:rPr>
-              <w:t>Reserved</w:t>
-            </w:r>
-            <w:r>
-              <w:rPr>
-                <w:rFonts w:ascii="source sans 3" w:eastAsia="source sans 3" w:hAnsi="source sans 3" w:cs="source sans 3"/>
-                <w:color w:val="000000"/>
-                <w:sz w:val="17"/>
-              </w:rPr>
-              <w:t>.</w:t>
+              <w:t>Give the member an overdue active loan and then attempt to collect a ready reservation.</w:t>
             </w:r>
           </w:p>
         </w:tc>
@@ -2360,7 +2532,7 @@
                 <w:color w:val="000000"/>
                 <w:sz w:val="17"/>
               </w:rPr>
-              <w:t xml:space="preserve">Collection is blocked with a message saying the reservation is not ready to </w:t>
+              <w:t xml:space="preserve">Collection is blocked until overdue items are </w:t>
             </w:r>
             <w:proofErr w:type="gramStart"/>
             <w:r>
@@ -2369,7 +2541,7 @@
                 <w:color w:val="000000"/>
                 <w:sz w:val="17"/>
               </w:rPr>
-              <w:t>collect.[</w:t>
+              <w:t>returned.[</w:t>
             </w:r>
             <w:proofErr w:type="gramEnd"/>
             <w:r>
@@ -2387,7 +2559,7 @@
                 <w:color w:val="000000"/>
                 <w:sz w:val="17"/>
               </w:rPr>
-              <w:t>7][</w:t>
+              <w:t>4][</w:t>
             </w:r>
             <w:proofErr w:type="gramEnd"/>
             <w:r>
@@ -2396,7 +2568,7 @@
                 <w:color w:val="000000"/>
                 <w:sz w:val="17"/>
               </w:rPr>
-              <w:t>file:14]</w:t>
+              <w:t>file:10]</w:t>
             </w:r>
           </w:p>
         </w:tc>
@@ -2446,7 +2618,7 @@
                 <w:color w:val="000000"/>
                 <w:sz w:val="17"/>
               </w:rPr>
-              <w:t>R11</w:t>
+              <w:t>R12</w:t>
             </w:r>
           </w:p>
         </w:tc>
@@ -2469,7 +2641,7 @@
                 <w:color w:val="000000"/>
                 <w:sz w:val="17"/>
               </w:rPr>
-              <w:t>Reject collection when member has overdue loan</w:t>
+              <w:t>Reject return on reservation row</w:t>
             </w:r>
           </w:p>
         </w:tc>
@@ -2492,7 +2664,7 @@
                 <w:color w:val="000000"/>
                 <w:sz w:val="17"/>
               </w:rPr>
-              <w:t>Give the member an overdue active loan and then attempt to collect a ready reservation.</w:t>
+              <w:t>Select a reservation row instead of a loan row and click return.</w:t>
             </w:r>
           </w:p>
         </w:tc>
@@ -2514,7 +2686,7 @@
                 <w:color w:val="000000"/>
                 <w:sz w:val="17"/>
               </w:rPr>
-              <w:t xml:space="preserve">Collection is blocked until overdue items are </w:t>
+              <w:t xml:space="preserve">The UI asks for an active loan to be selected and does not call return logic on the </w:t>
             </w:r>
             <w:proofErr w:type="gramStart"/>
             <w:r>
@@ -2523,7 +2695,7 @@
                 <w:color w:val="000000"/>
                 <w:sz w:val="17"/>
               </w:rPr>
-              <w:t>returned.[</w:t>
+              <w:t>reservation.[</w:t>
             </w:r>
             <w:proofErr w:type="gramEnd"/>
             <w:r>
@@ -2541,7 +2713,7 @@
                 <w:color w:val="000000"/>
                 <w:sz w:val="17"/>
               </w:rPr>
-              <w:t>4][</w:t>
+              <w:t>11][</w:t>
             </w:r>
             <w:proofErr w:type="gramEnd"/>
             <w:r>
@@ -2550,7 +2722,7 @@
                 <w:color w:val="000000"/>
                 <w:sz w:val="17"/>
               </w:rPr>
-              <w:t>file:10]</w:t>
+              <w:t>file:14]</w:t>
             </w:r>
           </w:p>
         </w:tc>
@@ -2575,162 +2747,2113 @@
           </w:p>
         </w:tc>
       </w:tr>
-      <w:tr>
-        <w:trPr>
-          <w:cantSplit/>
-          <w:tblCellSpacing w:w="0" w:type="dxa"/>
-          <w:jc w:val="center"/>
-        </w:trPr>
-        <w:tc>
-          <w:tcPr>
-            <w:tcW w:w="622" w:type="dxa"/>
-            <w:tcBorders>
-              <w:top w:val="single" w:sz="1" w:space="0" w:color="000000"/>
-              <w:bottom w:val="single" w:sz="1" w:space="0" w:color="000000"/>
-              <w:right w:val="single" w:sz="1" w:space="0" w:color="000000"/>
-            </w:tcBorders>
-          </w:tcPr>
-          <w:p>
-            <w:pPr>
-              <w:spacing w:line="360" w:lineRule="auto"/>
-            </w:pPr>
-            <w:r>
-              <w:rPr>
-                <w:rFonts w:ascii="source sans 3" w:eastAsia="source sans 3" w:hAnsi="source sans 3" w:cs="source sans 3"/>
-                <w:color w:val="000000"/>
-                <w:sz w:val="17"/>
-              </w:rPr>
-              <w:t>R12</w:t>
-            </w:r>
-          </w:p>
-        </w:tc>
-        <w:tc>
-          <w:tcPr>
-            <w:tcW w:w="0" w:type="auto"/>
-            <w:tcBorders>
-              <w:top w:val="single" w:sz="1" w:space="0" w:color="000000"/>
-              <w:bottom w:val="single" w:sz="1" w:space="0" w:color="000000"/>
-              <w:right w:val="single" w:sz="1" w:space="0" w:color="000000"/>
-            </w:tcBorders>
-          </w:tcPr>
-          <w:p>
-            <w:pPr>
-              <w:spacing w:line="360" w:lineRule="auto"/>
-            </w:pPr>
-            <w:r>
-              <w:rPr>
-                <w:rFonts w:ascii="source sans 3" w:eastAsia="source sans 3" w:hAnsi="source sans 3" w:cs="source sans 3"/>
-                <w:color w:val="000000"/>
-                <w:sz w:val="17"/>
-              </w:rPr>
-              <w:t>Reject return on reservation row</w:t>
-            </w:r>
-          </w:p>
-        </w:tc>
-        <w:tc>
-          <w:tcPr>
-            <w:tcW w:w="0" w:type="auto"/>
-            <w:tcBorders>
-              <w:top w:val="single" w:sz="1" w:space="0" w:color="000000"/>
-              <w:bottom w:val="single" w:sz="1" w:space="0" w:color="000000"/>
-              <w:right w:val="single" w:sz="1" w:space="0" w:color="000000"/>
-            </w:tcBorders>
-          </w:tcPr>
-          <w:p>
-            <w:pPr>
-              <w:spacing w:line="360" w:lineRule="auto"/>
-            </w:pPr>
-            <w:r>
-              <w:rPr>
-                <w:rFonts w:ascii="source sans 3" w:eastAsia="source sans 3" w:hAnsi="source sans 3" w:cs="source sans 3"/>
-                <w:color w:val="000000"/>
-                <w:sz w:val="17"/>
-              </w:rPr>
-              <w:t>Select a reservation row instead of a loan row and click return.</w:t>
-            </w:r>
-          </w:p>
-        </w:tc>
-        <w:tc>
-          <w:tcPr>
-            <w:tcW w:w="0" w:type="auto"/>
-            <w:tcBorders>
-              <w:top w:val="single" w:sz="1" w:space="0" w:color="000000"/>
-              <w:bottom w:val="single" w:sz="1" w:space="0" w:color="000000"/>
-            </w:tcBorders>
-          </w:tcPr>
-          <w:p>
-            <w:pPr>
-              <w:spacing w:line="360" w:lineRule="auto"/>
-            </w:pPr>
-            <w:r>
-              <w:rPr>
-                <w:rFonts w:ascii="source sans 3" w:eastAsia="source sans 3" w:hAnsi="source sans 3" w:cs="source sans 3"/>
-                <w:color w:val="000000"/>
-                <w:sz w:val="17"/>
-              </w:rPr>
-              <w:t xml:space="preserve">The UI asks for an active loan to be selected and does not call return logic on the </w:t>
-            </w:r>
-            <w:proofErr w:type="gramStart"/>
-            <w:r>
-              <w:rPr>
-                <w:rFonts w:ascii="source sans 3" w:eastAsia="source sans 3" w:hAnsi="source sans 3" w:cs="source sans 3"/>
-                <w:color w:val="000000"/>
-                <w:sz w:val="17"/>
-              </w:rPr>
-              <w:t>reservation.[</w:t>
-            </w:r>
-            <w:proofErr w:type="gramEnd"/>
-            <w:r>
-              <w:rPr>
-                <w:rFonts w:ascii="source sans 3" w:eastAsia="source sans 3" w:hAnsi="source sans 3" w:cs="source sans 3"/>
-                <w:color w:val="000000"/>
-                <w:sz w:val="17"/>
-              </w:rPr>
-              <w:t>file:</w:t>
-            </w:r>
-            <w:proofErr w:type="gramStart"/>
-            <w:r>
-              <w:rPr>
-                <w:rFonts w:ascii="source sans 3" w:eastAsia="source sans 3" w:hAnsi="source sans 3" w:cs="source sans 3"/>
-                <w:color w:val="000000"/>
-                <w:sz w:val="17"/>
-              </w:rPr>
-              <w:t>11][</w:t>
-            </w:r>
-            <w:proofErr w:type="gramEnd"/>
-            <w:r>
-              <w:rPr>
-                <w:rFonts w:ascii="source sans 3" w:eastAsia="source sans 3" w:hAnsi="source sans 3" w:cs="source sans 3"/>
-                <w:color w:val="000000"/>
-                <w:sz w:val="17"/>
-              </w:rPr>
-              <w:t>file:14]</w:t>
-            </w:r>
-          </w:p>
-        </w:tc>
-        <w:tc>
-          <w:tcPr>
-            <w:tcW w:w="3725" w:type="dxa"/>
-            <w:tcBorders>
-              <w:top w:val="single" w:sz="2" w:space="0" w:color="000000"/>
-              <w:left w:val="single" w:sz="4" w:space="0" w:color="auto"/>
-              <w:bottom w:val="single" w:sz="2" w:space="0" w:color="000000"/>
-            </w:tcBorders>
-          </w:tcPr>
-          <w:p>
-            <w:pPr>
-              <w:spacing w:line="360" w:lineRule="auto"/>
-              <w:rPr>
-                <w:rFonts w:ascii="source sans 3" w:eastAsia="source sans 3" w:hAnsi="source sans 3" w:cs="source sans 3"/>
-                <w:color w:val="000000"/>
-                <w:sz w:val="17"/>
-              </w:rPr>
-            </w:pPr>
-          </w:p>
-        </w:tc>
-      </w:tr>
     </w:tbl>
     <w:p/>
+    <w:p/>
+    <w:p/>
+    <w:p/>
+    <w:p>
+      <w:pPr>
+        <w:pStyle w:val="Heading2"/>
+        <w:rPr>
+          <w:lang w:val="en-AU"/>
+        </w:rPr>
+      </w:pPr>
+      <w:r>
+        <w:rPr>
+          <w:lang w:val="en-AU"/>
+        </w:rPr>
+        <w:t xml:space="preserve">Issues </w:t>
+      </w:r>
+      <w:r>
+        <w:rPr>
+          <w:lang w:val="en-AU"/>
+        </w:rPr>
+        <w:t xml:space="preserve">/ fixes </w:t>
+      </w:r>
+    </w:p>
+    <w:p>
+      <w:pPr>
+        <w:rPr>
+          <w:b/>
+          <w:bCs/>
+          <w:lang w:val="en-AU"/>
+        </w:rPr>
+      </w:pPr>
+      <w:r>
+        <w:rPr>
+          <w:b/>
+          <w:bCs/>
+          <w:lang w:val="en-AU"/>
+        </w:rPr>
+        <w:t xml:space="preserve">Issue </w:t>
+      </w:r>
+      <w:proofErr w:type="gramStart"/>
+      <w:r>
+        <w:rPr>
+          <w:b/>
+          <w:bCs/>
+          <w:lang w:val="en-AU"/>
+        </w:rPr>
+        <w:t>ID</w:t>
+      </w:r>
+      <w:r>
+        <w:rPr>
+          <w:b/>
+          <w:bCs/>
+          <w:lang w:val="en-AU"/>
+        </w:rPr>
+        <w:t xml:space="preserve"> :</w:t>
+      </w:r>
+      <w:proofErr w:type="gramEnd"/>
+      <w:r>
+        <w:rPr>
+          <w:b/>
+          <w:bCs/>
+          <w:lang w:val="en-AU"/>
+        </w:rPr>
+        <w:t xml:space="preserve"> </w:t>
+      </w:r>
+      <w:r>
+        <w:rPr>
+          <w:b/>
+          <w:bCs/>
+          <w:lang w:val="en-AU"/>
+        </w:rPr>
+        <w:t>1</w:t>
+      </w:r>
+    </w:p>
+    <w:p>
+      <w:pPr>
+        <w:rPr>
+          <w:b/>
+          <w:bCs/>
+          <w:lang w:val="en-AU"/>
+        </w:rPr>
+      </w:pPr>
+      <w:r>
+        <w:rPr>
+          <w:b/>
+          <w:bCs/>
+          <w:lang w:val="en-AU"/>
+        </w:rPr>
+        <w:t>Related Tes</w:t>
+      </w:r>
+      <w:r>
+        <w:rPr>
+          <w:b/>
+          <w:bCs/>
+          <w:lang w:val="en-AU"/>
+        </w:rPr>
+        <w:t xml:space="preserve">t </w:t>
+      </w:r>
+      <w:proofErr w:type="gramStart"/>
+      <w:r>
+        <w:rPr>
+          <w:b/>
+          <w:bCs/>
+          <w:lang w:val="en-AU"/>
+        </w:rPr>
+        <w:t>case :</w:t>
+      </w:r>
+      <w:proofErr w:type="gramEnd"/>
+      <w:r>
+        <w:rPr>
+          <w:b/>
+          <w:bCs/>
+          <w:lang w:val="en-AU"/>
+        </w:rPr>
+        <w:t xml:space="preserve"> R6</w:t>
+      </w:r>
+    </w:p>
+    <w:p>
+      <w:pPr>
+        <w:rPr>
+          <w:lang w:val="en-AU"/>
+        </w:rPr>
+      </w:pPr>
+      <w:r>
+        <w:rPr>
+          <w:lang w:val="en-AU"/>
+        </w:rPr>
+        <w:t>Data changes were not persisting after returning a book</w:t>
+      </w:r>
+    </w:p>
+    <w:p>
+      <w:pPr>
+        <w:rPr>
+          <w:b/>
+          <w:bCs/>
+          <w:lang w:val="en-AU"/>
+        </w:rPr>
+      </w:pPr>
+      <w:r>
+        <w:rPr>
+          <w:b/>
+          <w:bCs/>
+          <w:lang w:val="en-AU"/>
+        </w:rPr>
+        <w:t>Summary</w:t>
+      </w:r>
+    </w:p>
+    <w:p>
+      <w:pPr>
+        <w:rPr>
+          <w:lang w:val="en-AU"/>
+        </w:rPr>
+      </w:pPr>
+      <w:r>
+        <w:rPr>
+          <w:lang w:val="en-AU"/>
+        </w:rPr>
+        <w:t>After a user returned a book, the changes appeared during the session but were not saved permanently. When the application was restarted, the loan, reservation, and book data had reverted to the previous state.</w:t>
+      </w:r>
+    </w:p>
+    <w:p>
+      <w:pPr>
+        <w:rPr>
+          <w:b/>
+          <w:bCs/>
+          <w:lang w:val="en-AU"/>
+        </w:rPr>
+      </w:pPr>
+      <w:r>
+        <w:rPr>
+          <w:b/>
+          <w:bCs/>
+          <w:lang w:val="en-AU"/>
+        </w:rPr>
+        <w:t>Context</w:t>
+      </w:r>
+    </w:p>
+    <w:p>
+      <w:pPr>
+        <w:numPr>
+          <w:ilvl w:val="0"/>
+          <w:numId w:val="1"/>
+        </w:numPr>
+        <w:rPr>
+          <w:lang w:val="en-AU"/>
+        </w:rPr>
+      </w:pPr>
+      <w:r>
+        <w:rPr>
+          <w:b/>
+          <w:bCs/>
+          <w:lang w:val="en-AU"/>
+        </w:rPr>
+        <w:t>Screen / feature:</w:t>
+      </w:r>
+      <w:r>
+        <w:rPr>
+          <w:lang w:val="en-AU"/>
+        </w:rPr>
+        <w:t xml:space="preserve"> Return book workflow.</w:t>
+      </w:r>
+    </w:p>
+    <w:p>
+      <w:pPr>
+        <w:numPr>
+          <w:ilvl w:val="0"/>
+          <w:numId w:val="1"/>
+        </w:numPr>
+        <w:rPr>
+          <w:lang w:val="en-AU"/>
+        </w:rPr>
+      </w:pPr>
+      <w:r>
+        <w:rPr>
+          <w:b/>
+          <w:bCs/>
+          <w:lang w:val="en-AU"/>
+        </w:rPr>
+        <w:t>Area of code:</w:t>
+      </w:r>
+      <w:r>
+        <w:rPr>
+          <w:lang w:val="en-AU"/>
+        </w:rPr>
+        <w:t xml:space="preserve"> </w:t>
+      </w:r>
+      <w:proofErr w:type="spellStart"/>
+      <w:r>
+        <w:rPr>
+          <w:lang w:val="en-AU"/>
+        </w:rPr>
+        <w:t>LibrarySystem.cs</w:t>
+      </w:r>
+      <w:proofErr w:type="spellEnd"/>
+      <w:r>
+        <w:rPr>
+          <w:lang w:val="en-AU"/>
+        </w:rPr>
+        <w:t xml:space="preserve">, mainly </w:t>
+      </w:r>
+      <w:proofErr w:type="spellStart"/>
+      <w:r>
+        <w:rPr>
+          <w:lang w:val="en-AU"/>
+        </w:rPr>
+        <w:t>ReturnLoan</w:t>
+      </w:r>
+      <w:proofErr w:type="spellEnd"/>
+      <w:r>
+        <w:rPr>
+          <w:lang w:val="en-AU"/>
+        </w:rPr>
+        <w:t>.</w:t>
+      </w:r>
+    </w:p>
+    <w:p>
+      <w:pPr>
+        <w:numPr>
+          <w:ilvl w:val="0"/>
+          <w:numId w:val="1"/>
+        </w:numPr>
+        <w:rPr>
+          <w:lang w:val="en-AU"/>
+        </w:rPr>
+      </w:pPr>
+      <w:r>
+        <w:rPr>
+          <w:b/>
+          <w:bCs/>
+          <w:lang w:val="en-AU"/>
+        </w:rPr>
+        <w:t>Related classes:</w:t>
+      </w:r>
+      <w:r>
+        <w:rPr>
+          <w:lang w:val="en-AU"/>
+        </w:rPr>
+        <w:t xml:space="preserve"> </w:t>
+      </w:r>
+      <w:proofErr w:type="spellStart"/>
+      <w:r>
+        <w:rPr>
+          <w:lang w:val="en-AU"/>
+        </w:rPr>
+        <w:t>LibrarySystem</w:t>
+      </w:r>
+      <w:proofErr w:type="spellEnd"/>
+      <w:r>
+        <w:rPr>
+          <w:lang w:val="en-AU"/>
+        </w:rPr>
+        <w:t xml:space="preserve">, Loan, Reservation, </w:t>
+      </w:r>
+      <w:proofErr w:type="spellStart"/>
+      <w:r>
+        <w:rPr>
+          <w:lang w:val="en-AU"/>
+        </w:rPr>
+        <w:t>FileStorageService.Reservation</w:t>
+      </w:r>
+      <w:proofErr w:type="spellEnd"/>
+    </w:p>
+    <w:p>
+      <w:pPr>
+        <w:rPr>
+          <w:b/>
+          <w:bCs/>
+          <w:lang w:val="en-AU"/>
+        </w:rPr>
+      </w:pPr>
+      <w:r>
+        <w:rPr>
+          <w:b/>
+          <w:bCs/>
+          <w:lang w:val="en-AU"/>
+        </w:rPr>
+        <w:t>Symptoms / Observed Behaviour</w:t>
+      </w:r>
+    </w:p>
+    <w:p>
+      <w:pPr>
+        <w:numPr>
+          <w:ilvl w:val="0"/>
+          <w:numId w:val="2"/>
+        </w:numPr>
+        <w:rPr>
+          <w:lang w:val="en-AU"/>
+        </w:rPr>
+      </w:pPr>
+      <w:r>
+        <w:rPr>
+          <w:lang w:val="en-AU"/>
+        </w:rPr>
+        <w:t>Returning a book updated the screen temporarily, but the change was lost after restarting the application.</w:t>
+      </w:r>
+      <w:r>
+        <w:rPr>
+          <w:lang w:val="en-AU"/>
+        </w:rPr>
+        <w:t xml:space="preserve"> </w:t>
+      </w:r>
+    </w:p>
+    <w:p>
+      <w:pPr>
+        <w:numPr>
+          <w:ilvl w:val="0"/>
+          <w:numId w:val="2"/>
+        </w:numPr>
+        <w:rPr>
+          <w:lang w:val="en-AU"/>
+        </w:rPr>
+      </w:pPr>
+      <w:r>
+        <w:rPr>
+          <w:lang w:val="en-AU"/>
+        </w:rPr>
+        <w:lastRenderedPageBreak/>
+        <w:t>The returned loan did not remain marked as returned in saved data</w:t>
+      </w:r>
+      <w:r>
+        <w:rPr>
+          <w:lang w:val="en-AU"/>
+        </w:rPr>
+        <w:t>.</w:t>
+      </w:r>
+    </w:p>
+    <w:p>
+      <w:pPr>
+        <w:numPr>
+          <w:ilvl w:val="0"/>
+          <w:numId w:val="2"/>
+        </w:numPr>
+        <w:rPr>
+          <w:lang w:val="en-AU"/>
+        </w:rPr>
+      </w:pPr>
+      <w:r>
+        <w:rPr>
+          <w:lang w:val="en-AU"/>
+        </w:rPr>
+        <w:t>Reservation status changes were not reliably stored in the JSON files.</w:t>
+      </w:r>
+    </w:p>
+    <w:p>
+      <w:pPr>
+        <w:rPr>
+          <w:b/>
+          <w:bCs/>
+          <w:lang w:val="en-AU"/>
+        </w:rPr>
+      </w:pPr>
+      <w:r>
+        <w:rPr>
+          <w:b/>
+          <w:bCs/>
+          <w:lang w:val="en-AU"/>
+        </w:rPr>
+        <w:t>Root Cause</w:t>
+      </w:r>
+    </w:p>
+    <w:p>
+      <w:pPr>
+        <w:rPr>
+          <w:lang w:val="en-AU"/>
+        </w:rPr>
+      </w:pPr>
+      <w:r>
+        <w:rPr>
+          <w:lang w:val="en-AU"/>
+        </w:rPr>
+        <w:t xml:space="preserve">The original </w:t>
+      </w:r>
+      <w:proofErr w:type="spellStart"/>
+      <w:r>
+        <w:rPr>
+          <w:lang w:val="en-AU"/>
+        </w:rPr>
+        <w:t>ReturnLoan</w:t>
+      </w:r>
+      <w:proofErr w:type="spellEnd"/>
+      <w:r>
+        <w:rPr>
+          <w:lang w:val="en-AU"/>
+        </w:rPr>
+        <w:t xml:space="preserve"> method only marked the loan as returned and did not call </w:t>
+      </w:r>
+      <w:proofErr w:type="spellStart"/>
+      <w:proofErr w:type="gramStart"/>
+      <w:r>
+        <w:rPr>
+          <w:lang w:val="en-AU"/>
+        </w:rPr>
+        <w:t>SaveAllData</w:t>
+      </w:r>
+      <w:proofErr w:type="spellEnd"/>
+      <w:r>
+        <w:rPr>
+          <w:lang w:val="en-AU"/>
+        </w:rPr>
+        <w:t>(</w:t>
+      </w:r>
+      <w:proofErr w:type="gramEnd"/>
+      <w:r>
+        <w:rPr>
+          <w:lang w:val="en-AU"/>
+        </w:rPr>
+        <w:t xml:space="preserve">). Because </w:t>
+      </w:r>
+      <w:proofErr w:type="spellStart"/>
+      <w:r>
+        <w:rPr>
+          <w:lang w:val="en-AU"/>
+        </w:rPr>
+        <w:t>FileStorageService</w:t>
+      </w:r>
+      <w:proofErr w:type="spellEnd"/>
+      <w:r>
+        <w:rPr>
+          <w:lang w:val="en-AU"/>
+        </w:rPr>
+        <w:t xml:space="preserve"> only writes changes when </w:t>
+      </w:r>
+      <w:proofErr w:type="spellStart"/>
+      <w:proofErr w:type="gramStart"/>
+      <w:r>
+        <w:rPr>
+          <w:lang w:val="en-AU"/>
+        </w:rPr>
+        <w:t>SaveAllData</w:t>
+      </w:r>
+      <w:proofErr w:type="spellEnd"/>
+      <w:r>
+        <w:rPr>
+          <w:lang w:val="en-AU"/>
+        </w:rPr>
+        <w:t>(</w:t>
+      </w:r>
+      <w:proofErr w:type="gramEnd"/>
+      <w:r>
+        <w:rPr>
+          <w:lang w:val="en-AU"/>
+        </w:rPr>
+        <w:t xml:space="preserve">) is triggered, the updated state </w:t>
+      </w:r>
+      <w:r>
+        <w:rPr>
+          <w:lang w:val="en-AU"/>
+        </w:rPr>
+        <w:t>never persisted</w:t>
+      </w:r>
+      <w:r>
+        <w:rPr>
+          <w:lang w:val="en-AU"/>
+        </w:rPr>
+        <w:t xml:space="preserve"> to </w:t>
+      </w:r>
+      <w:proofErr w:type="spellStart"/>
+      <w:proofErr w:type="gramStart"/>
+      <w:r>
+        <w:rPr>
+          <w:lang w:val="en-AU"/>
+        </w:rPr>
+        <w:t>books.json</w:t>
+      </w:r>
+      <w:proofErr w:type="spellEnd"/>
+      <w:proofErr w:type="gramEnd"/>
+      <w:r>
+        <w:rPr>
+          <w:lang w:val="en-AU"/>
+        </w:rPr>
+        <w:t xml:space="preserve">, </w:t>
+      </w:r>
+      <w:proofErr w:type="spellStart"/>
+      <w:proofErr w:type="gramStart"/>
+      <w:r>
+        <w:rPr>
+          <w:lang w:val="en-AU"/>
+        </w:rPr>
+        <w:t>loans.json</w:t>
+      </w:r>
+      <w:proofErr w:type="spellEnd"/>
+      <w:proofErr w:type="gramEnd"/>
+      <w:r>
+        <w:rPr>
+          <w:lang w:val="en-AU"/>
+        </w:rPr>
+        <w:t xml:space="preserve">, or </w:t>
+      </w:r>
+      <w:proofErr w:type="spellStart"/>
+      <w:proofErr w:type="gramStart"/>
+      <w:r>
+        <w:rPr>
+          <w:lang w:val="en-AU"/>
+        </w:rPr>
+        <w:t>reservations.json</w:t>
+      </w:r>
+      <w:proofErr w:type="spellEnd"/>
+      <w:proofErr w:type="gramEnd"/>
+      <w:r>
+        <w:rPr>
+          <w:lang w:val="en-AU"/>
+        </w:rPr>
+        <w:t>.</w:t>
+      </w:r>
+    </w:p>
+    <w:p>
+      <w:pPr>
+        <w:rPr>
+          <w:b/>
+          <w:bCs/>
+          <w:lang w:val="en-AU"/>
+        </w:rPr>
+      </w:pPr>
+      <w:r>
+        <w:rPr>
+          <w:b/>
+          <w:bCs/>
+          <w:lang w:val="en-AU"/>
+        </w:rPr>
+        <w:t>Fix Implemented</w:t>
+      </w:r>
+    </w:p>
+    <w:p>
+      <w:pPr>
+        <w:numPr>
+          <w:ilvl w:val="0"/>
+          <w:numId w:val="3"/>
+        </w:numPr>
+        <w:rPr>
+          <w:lang w:val="en-AU"/>
+        </w:rPr>
+      </w:pPr>
+      <w:r>
+        <w:rPr>
+          <w:b/>
+          <w:bCs/>
+          <w:lang w:val="en-AU"/>
+        </w:rPr>
+        <w:t>Files changed:</w:t>
+      </w:r>
+      <w:r>
+        <w:rPr>
+          <w:lang w:val="en-AU"/>
+        </w:rPr>
+        <w:t xml:space="preserve"> </w:t>
+      </w:r>
+      <w:proofErr w:type="spellStart"/>
+      <w:r>
+        <w:rPr>
+          <w:lang w:val="en-AU"/>
+        </w:rPr>
+        <w:t>LibrarySystem.cs</w:t>
+      </w:r>
+      <w:proofErr w:type="spellEnd"/>
+      <w:r>
+        <w:rPr>
+          <w:lang w:val="en-AU"/>
+        </w:rPr>
+        <w:t>.</w:t>
+      </w:r>
+      <w:r>
+        <w:rPr>
+          <w:lang w:val="en-AU"/>
+        </w:rPr>
+        <w:t xml:space="preserve"> </w:t>
+      </w:r>
+    </w:p>
+    <w:p>
+      <w:pPr>
+        <w:numPr>
+          <w:ilvl w:val="0"/>
+          <w:numId w:val="3"/>
+        </w:numPr>
+        <w:rPr>
+          <w:lang w:val="en-AU"/>
+        </w:rPr>
+      </w:pPr>
+      <w:r>
+        <w:rPr>
+          <w:b/>
+          <w:bCs/>
+          <w:lang w:val="en-AU"/>
+        </w:rPr>
+        <w:t>Methods updated:</w:t>
+      </w:r>
+      <w:r>
+        <w:rPr>
+          <w:lang w:val="en-AU"/>
+        </w:rPr>
+        <w:t xml:space="preserve"> </w:t>
+      </w:r>
+      <w:proofErr w:type="spellStart"/>
+      <w:r>
+        <w:rPr>
+          <w:lang w:val="en-AU"/>
+        </w:rPr>
+        <w:t>ReturnLoan</w:t>
+      </w:r>
+      <w:proofErr w:type="spellEnd"/>
+      <w:r>
+        <w:rPr>
+          <w:lang w:val="en-AU"/>
+        </w:rPr>
+        <w:t>.</w:t>
+      </w:r>
+    </w:p>
+    <w:p>
+      <w:pPr>
+        <w:numPr>
+          <w:ilvl w:val="0"/>
+          <w:numId w:val="3"/>
+        </w:numPr>
+        <w:rPr>
+          <w:lang w:val="en-AU"/>
+        </w:rPr>
+      </w:pPr>
+      <w:r>
+        <w:rPr>
+          <w:b/>
+          <w:bCs/>
+          <w:lang w:val="en-AU"/>
+        </w:rPr>
+        <w:t>Code changes (summary):</w:t>
+      </w:r>
+    </w:p>
+    <w:p>
+      <w:pPr>
+        <w:numPr>
+          <w:ilvl w:val="1"/>
+          <w:numId w:val="3"/>
+        </w:numPr>
+        <w:rPr>
+          <w:lang w:val="en-AU"/>
+        </w:rPr>
+      </w:pPr>
+      <w:r>
+        <w:rPr>
+          <w:lang w:val="en-AU"/>
+        </w:rPr>
+        <w:t>Reworked the return workflow so the system locates the active loan properly.</w:t>
+      </w:r>
+    </w:p>
+    <w:p>
+      <w:pPr>
+        <w:numPr>
+          <w:ilvl w:val="1"/>
+          <w:numId w:val="3"/>
+        </w:numPr>
+        <w:rPr>
+          <w:lang w:val="en-AU"/>
+        </w:rPr>
+      </w:pPr>
+      <w:r>
+        <w:rPr>
+          <w:lang w:val="en-AU"/>
+        </w:rPr>
+        <w:t>Added logic to update the reservation queue when applicable.</w:t>
+      </w:r>
+    </w:p>
+    <w:p>
+      <w:pPr>
+        <w:numPr>
+          <w:ilvl w:val="1"/>
+          <w:numId w:val="3"/>
+        </w:numPr>
+        <w:rPr>
+          <w:lang w:val="en-AU"/>
+        </w:rPr>
+      </w:pPr>
+      <w:r>
+        <w:rPr>
+          <w:lang w:val="en-AU"/>
+        </w:rPr>
+        <w:t xml:space="preserve">Added a call to </w:t>
+      </w:r>
+      <w:proofErr w:type="spellStart"/>
+      <w:proofErr w:type="gramStart"/>
+      <w:r>
+        <w:rPr>
+          <w:lang w:val="en-AU"/>
+        </w:rPr>
+        <w:t>SaveAllData</w:t>
+      </w:r>
+      <w:proofErr w:type="spellEnd"/>
+      <w:r>
+        <w:rPr>
+          <w:lang w:val="en-AU"/>
+        </w:rPr>
+        <w:t>(</w:t>
+      </w:r>
+      <w:proofErr w:type="gramEnd"/>
+      <w:r>
+        <w:rPr>
+          <w:lang w:val="en-AU"/>
+        </w:rPr>
+        <w:t>) after the return processing so the data files are written to disk.</w:t>
+      </w:r>
+    </w:p>
+    <w:p>
+      <w:pPr>
+        <w:rPr>
+          <w:b/>
+          <w:bCs/>
+          <w:lang w:val="en-AU"/>
+        </w:rPr>
+      </w:pPr>
+      <w:r>
+        <w:rPr>
+          <w:b/>
+          <w:bCs/>
+          <w:lang w:val="en-AU"/>
+        </w:rPr>
+        <w:t>Test(s) Performed</w:t>
+      </w:r>
+    </w:p>
+    <w:p>
+      <w:pPr>
+        <w:numPr>
+          <w:ilvl w:val="0"/>
+          <w:numId w:val="4"/>
+        </w:numPr>
+        <w:rPr>
+          <w:lang w:val="en-AU"/>
+        </w:rPr>
+      </w:pPr>
+      <w:r>
+        <w:rPr>
+          <w:b/>
+          <w:bCs/>
+          <w:lang w:val="en-AU"/>
+        </w:rPr>
+        <w:t>Manual tests:</w:t>
+      </w:r>
+    </w:p>
+    <w:p>
+      <w:pPr>
+        <w:numPr>
+          <w:ilvl w:val="1"/>
+          <w:numId w:val="4"/>
+        </w:numPr>
+        <w:rPr>
+          <w:lang w:val="en-AU"/>
+        </w:rPr>
+      </w:pPr>
+      <w:r>
+        <w:rPr>
+          <w:lang w:val="en-AU"/>
+        </w:rPr>
+        <w:t>Returned a borrowed book and checked that the change was visible immediately.</w:t>
+      </w:r>
+    </w:p>
+    <w:p>
+      <w:pPr>
+        <w:numPr>
+          <w:ilvl w:val="1"/>
+          <w:numId w:val="4"/>
+        </w:numPr>
+        <w:rPr>
+          <w:lang w:val="en-AU"/>
+        </w:rPr>
+      </w:pPr>
+      <w:r>
+        <w:rPr>
+          <w:lang w:val="en-AU"/>
+        </w:rPr>
+        <w:t>Closed and reopened the application to confirm that the returned loan and updated reservation state were still present.</w:t>
+      </w:r>
+    </w:p>
+    <w:p>
+      <w:pPr>
+        <w:numPr>
+          <w:ilvl w:val="0"/>
+          <w:numId w:val="4"/>
+        </w:numPr>
+        <w:rPr>
+          <w:lang w:val="en-AU"/>
+        </w:rPr>
+      </w:pPr>
+      <w:r>
+        <w:rPr>
+          <w:b/>
+          <w:bCs/>
+          <w:lang w:val="en-AU"/>
+        </w:rPr>
+        <w:t>Data check:</w:t>
+      </w:r>
+    </w:p>
+    <w:p>
+      <w:pPr>
+        <w:numPr>
+          <w:ilvl w:val="1"/>
+          <w:numId w:val="4"/>
+        </w:numPr>
+        <w:rPr>
+          <w:lang w:val="en-AU"/>
+        </w:rPr>
+      </w:pPr>
+      <w:r>
+        <w:rPr>
+          <w:lang w:val="en-AU"/>
+        </w:rPr>
+        <w:t xml:space="preserve">Confirmed that the JSON files were being updated through the save process handled by </w:t>
+      </w:r>
+      <w:proofErr w:type="spellStart"/>
+      <w:r>
+        <w:rPr>
+          <w:lang w:val="en-AU"/>
+        </w:rPr>
+        <w:t>FileStorageService</w:t>
+      </w:r>
+      <w:proofErr w:type="spellEnd"/>
+    </w:p>
+    <w:p>
+      <w:pPr>
+        <w:rPr>
+          <w:b/>
+          <w:bCs/>
+          <w:lang w:val="en-AU"/>
+        </w:rPr>
+      </w:pPr>
+      <w:r>
+        <w:rPr>
+          <w:b/>
+          <w:bCs/>
+          <w:lang w:val="en-AU"/>
+        </w:rPr>
+        <w:t>Result / Status</w:t>
+      </w:r>
+    </w:p>
+    <w:p>
+      <w:pPr>
+        <w:numPr>
+          <w:ilvl w:val="0"/>
+          <w:numId w:val="5"/>
+        </w:numPr>
+        <w:rPr>
+          <w:lang w:val="en-AU"/>
+        </w:rPr>
+      </w:pPr>
+      <w:r>
+        <w:rPr>
+          <w:b/>
+          <w:bCs/>
+          <w:lang w:val="en-AU"/>
+        </w:rPr>
+        <w:t>Outcome:</w:t>
+      </w:r>
+      <w:r>
+        <w:rPr>
+          <w:lang w:val="en-AU"/>
+        </w:rPr>
+        <w:t xml:space="preserve"> Fixed.</w:t>
+      </w:r>
+    </w:p>
+    <w:p>
+      <w:pPr>
+        <w:numPr>
+          <w:ilvl w:val="0"/>
+          <w:numId w:val="5"/>
+        </w:numPr>
+        <w:rPr>
+          <w:lang w:val="en-AU"/>
+        </w:rPr>
+      </w:pPr>
+      <w:r>
+        <w:rPr>
+          <w:b/>
+          <w:bCs/>
+          <w:lang w:val="en-AU"/>
+        </w:rPr>
+        <w:t>Notes:</w:t>
+      </w:r>
+      <w:r>
+        <w:rPr>
+          <w:lang w:val="en-AU"/>
+        </w:rPr>
+        <w:t xml:space="preserve"> Data now persists after returning a book because the return workflow saves the updated application state to the JSON files.</w:t>
+      </w:r>
+    </w:p>
+    <w:p>
+      <w:pPr>
+        <w:rPr>
+          <w:lang w:val="en-AU"/>
+        </w:rPr>
+      </w:pPr>
+    </w:p>
+    <w:p>
+      <w:pPr>
+        <w:rPr>
+          <w:lang w:val="en-AU"/>
+        </w:rPr>
+      </w:pPr>
+    </w:p>
+    <w:p>
+      <w:pPr>
+        <w:rPr>
+          <w:b/>
+          <w:bCs/>
+          <w:lang w:val="en-AU"/>
+        </w:rPr>
+      </w:pPr>
+      <w:r>
+        <w:rPr>
+          <w:b/>
+          <w:bCs/>
+          <w:lang w:val="en-AU"/>
+        </w:rPr>
+        <w:t>Issue ID</w:t>
+      </w:r>
+      <w:r>
+        <w:rPr>
+          <w:b/>
+          <w:bCs/>
+          <w:lang w:val="en-AU"/>
+        </w:rPr>
+        <w:t>: 2</w:t>
+      </w:r>
+    </w:p>
+    <w:p>
+      <w:pPr>
+        <w:rPr>
+          <w:lang w:val="en-AU"/>
+        </w:rPr>
+      </w:pPr>
+      <w:r>
+        <w:rPr>
+          <w:lang w:val="en-AU"/>
+        </w:rPr>
+        <w:t>Returning a book did not increase available copies</w:t>
+      </w:r>
+    </w:p>
+    <w:p>
+      <w:pPr>
+        <w:rPr>
+          <w:b/>
+          <w:bCs/>
+          <w:lang w:val="en-AU"/>
+        </w:rPr>
+      </w:pPr>
+      <w:r>
+        <w:rPr>
+          <w:b/>
+          <w:bCs/>
+          <w:lang w:val="en-AU"/>
+        </w:rPr>
+        <w:t>Summary</w:t>
+      </w:r>
+    </w:p>
+    <w:p>
+      <w:pPr>
+        <w:rPr>
+          <w:lang w:val="en-AU"/>
+        </w:rPr>
+      </w:pPr>
+      <w:r>
+        <w:rPr>
+          <w:lang w:val="en-AU"/>
+        </w:rPr>
+        <w:t>When a borrowed book was returned, the loan was marked as returned, but the book</w:t>
+      </w:r>
+      <w:r>
+        <w:rPr>
+          <w:lang w:val="en-AU"/>
+        </w:rPr>
+        <w:t>’</w:t>
+      </w:r>
+      <w:r>
+        <w:rPr>
+          <w:lang w:val="en-AU"/>
+        </w:rPr>
+        <w:t xml:space="preserve">s </w:t>
+      </w:r>
+      <w:proofErr w:type="spellStart"/>
+      <w:r>
+        <w:rPr>
+          <w:lang w:val="en-AU"/>
+        </w:rPr>
+        <w:t>AvailableCopies</w:t>
+      </w:r>
+      <w:proofErr w:type="spellEnd"/>
+      <w:r>
+        <w:rPr>
+          <w:lang w:val="en-AU"/>
+        </w:rPr>
+        <w:t xml:space="preserve"> value did not increase. This caused the inventory count to remain incorrect after returns</w:t>
+      </w:r>
+      <w:r>
+        <w:rPr>
+          <w:lang w:val="en-AU"/>
+        </w:rPr>
+        <w:t xml:space="preserve">. </w:t>
+      </w:r>
+    </w:p>
+    <w:p>
+      <w:pPr>
+        <w:rPr>
+          <w:b/>
+          <w:bCs/>
+          <w:lang w:val="en-AU"/>
+        </w:rPr>
+      </w:pPr>
+      <w:r>
+        <w:rPr>
+          <w:b/>
+          <w:bCs/>
+          <w:lang w:val="en-AU"/>
+        </w:rPr>
+        <w:t>Context</w:t>
+      </w:r>
+    </w:p>
+    <w:p>
+      <w:pPr>
+        <w:numPr>
+          <w:ilvl w:val="0"/>
+          <w:numId w:val="6"/>
+        </w:numPr>
+        <w:rPr>
+          <w:lang w:val="en-AU"/>
+        </w:rPr>
+      </w:pPr>
+      <w:r>
+        <w:rPr>
+          <w:b/>
+          <w:bCs/>
+          <w:lang w:val="en-AU"/>
+        </w:rPr>
+        <w:t>Screen / feature:</w:t>
+      </w:r>
+      <w:r>
+        <w:rPr>
+          <w:lang w:val="en-AU"/>
+        </w:rPr>
+        <w:t xml:space="preserve"> Return book workflow and stock update logic.</w:t>
+      </w:r>
+      <w:r>
+        <w:rPr>
+          <w:lang w:val="en-AU"/>
+        </w:rPr>
+        <w:t xml:space="preserve"> </w:t>
+      </w:r>
+    </w:p>
+    <w:p>
+      <w:pPr>
+        <w:numPr>
+          <w:ilvl w:val="0"/>
+          <w:numId w:val="6"/>
+        </w:numPr>
+        <w:rPr>
+          <w:lang w:val="en-AU"/>
+        </w:rPr>
+      </w:pPr>
+      <w:r>
+        <w:rPr>
+          <w:b/>
+          <w:bCs/>
+          <w:lang w:val="en-AU"/>
+        </w:rPr>
+        <w:t>Area of code:</w:t>
+      </w:r>
+      <w:r>
+        <w:rPr>
+          <w:lang w:val="en-AU"/>
+        </w:rPr>
+        <w:t xml:space="preserve"> </w:t>
+      </w:r>
+      <w:proofErr w:type="spellStart"/>
+      <w:r>
+        <w:rPr>
+          <w:lang w:val="en-AU"/>
+        </w:rPr>
+        <w:t>LibrarySystem.cs</w:t>
+      </w:r>
+      <w:proofErr w:type="spellEnd"/>
+      <w:r>
+        <w:rPr>
+          <w:lang w:val="en-AU"/>
+        </w:rPr>
+        <w:t xml:space="preserve">, </w:t>
+      </w:r>
+      <w:proofErr w:type="spellStart"/>
+      <w:r>
+        <w:rPr>
+          <w:lang w:val="en-AU"/>
+        </w:rPr>
+        <w:t>Book.cs</w:t>
+      </w:r>
+      <w:proofErr w:type="spellEnd"/>
+      <w:r>
+        <w:rPr>
+          <w:lang w:val="en-AU"/>
+        </w:rPr>
+        <w:t>.</w:t>
+      </w:r>
+    </w:p>
+    <w:p>
+      <w:pPr>
+        <w:numPr>
+          <w:ilvl w:val="0"/>
+          <w:numId w:val="6"/>
+        </w:numPr>
+        <w:rPr>
+          <w:lang w:val="en-AU"/>
+        </w:rPr>
+      </w:pPr>
+      <w:r>
+        <w:rPr>
+          <w:b/>
+          <w:bCs/>
+          <w:lang w:val="en-AU"/>
+        </w:rPr>
+        <w:t>Related classes:</w:t>
+      </w:r>
+      <w:r>
+        <w:rPr>
+          <w:lang w:val="en-AU"/>
+        </w:rPr>
+        <w:t xml:space="preserve"> </w:t>
+      </w:r>
+      <w:proofErr w:type="spellStart"/>
+      <w:r>
+        <w:rPr>
+          <w:lang w:val="en-AU"/>
+        </w:rPr>
+        <w:t>LibrarySystem</w:t>
+      </w:r>
+      <w:proofErr w:type="spellEnd"/>
+      <w:r>
+        <w:rPr>
+          <w:lang w:val="en-AU"/>
+        </w:rPr>
+        <w:t>, Book, Loan, Reservation.Book.cs+3</w:t>
+      </w:r>
+    </w:p>
+    <w:p>
+      <w:pPr>
+        <w:numPr>
+          <w:ilvl w:val="0"/>
+          <w:numId w:val="6"/>
+        </w:numPr>
+        <w:rPr>
+          <w:lang w:val="en-AU"/>
+        </w:rPr>
+      </w:pPr>
+      <w:r>
+        <w:rPr>
+          <w:b/>
+          <w:bCs/>
+          <w:lang w:val="en-AU"/>
+        </w:rPr>
+        <w:t>Initial test case or scenario:</w:t>
+      </w:r>
+      <w:r>
+        <w:rPr>
+          <w:lang w:val="en-AU"/>
+        </w:rPr>
+        <w:t xml:space="preserve"> R7 </w:t>
+      </w:r>
+      <w:r>
+        <w:rPr>
+          <w:lang w:val="en-AU"/>
+        </w:rPr>
+        <w:t>–</w:t>
+      </w:r>
+      <w:r>
+        <w:rPr>
+          <w:lang w:val="en-AU"/>
+        </w:rPr>
+        <w:t xml:space="preserve"> Return book with queued reservation.</w:t>
+      </w:r>
+    </w:p>
+    <w:p>
+      <w:pPr>
+        <w:rPr>
+          <w:b/>
+          <w:bCs/>
+          <w:lang w:val="en-AU"/>
+        </w:rPr>
+      </w:pPr>
+      <w:r>
+        <w:rPr>
+          <w:b/>
+          <w:bCs/>
+          <w:lang w:val="en-AU"/>
+        </w:rPr>
+        <w:lastRenderedPageBreak/>
+        <w:t>Symptoms / Observed Behaviour</w:t>
+      </w:r>
+    </w:p>
+    <w:p>
+      <w:pPr>
+        <w:numPr>
+          <w:ilvl w:val="0"/>
+          <w:numId w:val="7"/>
+        </w:numPr>
+        <w:rPr>
+          <w:lang w:val="en-AU"/>
+        </w:rPr>
+      </w:pPr>
+      <w:r>
+        <w:rPr>
+          <w:lang w:val="en-AU"/>
+        </w:rPr>
+        <w:t>A returned loan changed to returned status, but the book quantity stayed the same.Loan.cs+1</w:t>
+      </w:r>
+    </w:p>
+    <w:p>
+      <w:pPr>
+        <w:numPr>
+          <w:ilvl w:val="0"/>
+          <w:numId w:val="7"/>
+        </w:numPr>
+        <w:rPr>
+          <w:lang w:val="en-AU"/>
+        </w:rPr>
+      </w:pPr>
+      <w:r>
+        <w:rPr>
+          <w:lang w:val="en-AU"/>
+        </w:rPr>
+        <w:t>The system did not restore the returned copy back into stock.Book.cs+1</w:t>
+      </w:r>
+    </w:p>
+    <w:p>
+      <w:pPr>
+        <w:numPr>
+          <w:ilvl w:val="0"/>
+          <w:numId w:val="7"/>
+        </w:numPr>
+        <w:rPr>
+          <w:lang w:val="en-AU"/>
+        </w:rPr>
+      </w:pPr>
+      <w:r>
+        <w:rPr>
+          <w:lang w:val="en-AU"/>
+        </w:rPr>
+        <w:t>This created inconsistent inventory data, especially when a reservation queue was involved.Reservation.cs+2</w:t>
+      </w:r>
+    </w:p>
+    <w:p>
+      <w:pPr>
+        <w:rPr>
+          <w:b/>
+          <w:bCs/>
+          <w:lang w:val="en-AU"/>
+        </w:rPr>
+      </w:pPr>
+      <w:r>
+        <w:rPr>
+          <w:b/>
+          <w:bCs/>
+          <w:lang w:val="en-AU"/>
+        </w:rPr>
+        <w:t>Root Cause</w:t>
+      </w:r>
+    </w:p>
+    <w:p>
+      <w:pPr>
+        <w:rPr>
+          <w:lang w:val="en-AU"/>
+        </w:rPr>
+      </w:pPr>
+      <w:r>
+        <w:rPr>
+          <w:lang w:val="en-AU"/>
+        </w:rPr>
+        <w:t xml:space="preserve">The original </w:t>
+      </w:r>
+      <w:proofErr w:type="spellStart"/>
+      <w:r>
+        <w:rPr>
+          <w:lang w:val="en-AU"/>
+        </w:rPr>
+        <w:t>ReturnLoan</w:t>
+      </w:r>
+      <w:proofErr w:type="spellEnd"/>
+      <w:r>
+        <w:rPr>
+          <w:lang w:val="en-AU"/>
+        </w:rPr>
+        <w:t xml:space="preserve"> method only set Returned = true on the loan and did not call </w:t>
+      </w:r>
+      <w:proofErr w:type="spellStart"/>
+      <w:r>
+        <w:rPr>
+          <w:lang w:val="en-AU"/>
+        </w:rPr>
+        <w:t>Book.ReturnCopy</w:t>
+      </w:r>
+      <w:proofErr w:type="spellEnd"/>
+      <w:r>
+        <w:rPr>
+          <w:lang w:val="en-AU"/>
+        </w:rPr>
+        <w:t xml:space="preserve">(). Since </w:t>
+      </w:r>
+      <w:proofErr w:type="spellStart"/>
+      <w:r>
+        <w:rPr>
+          <w:lang w:val="en-AU"/>
+        </w:rPr>
+        <w:t>AvailableCopies</w:t>
+      </w:r>
+      <w:proofErr w:type="spellEnd"/>
+      <w:r>
+        <w:rPr>
+          <w:lang w:val="en-AU"/>
+        </w:rPr>
+        <w:t xml:space="preserve"> is managed through the Book model</w:t>
+      </w:r>
+      <w:r>
+        <w:rPr>
+          <w:lang w:val="en-AU"/>
+        </w:rPr>
+        <w:t>’</w:t>
+      </w:r>
+      <w:r>
+        <w:rPr>
+          <w:lang w:val="en-AU"/>
+        </w:rPr>
+        <w:t xml:space="preserve">s </w:t>
+      </w:r>
+      <w:proofErr w:type="spellStart"/>
+      <w:proofErr w:type="gramStart"/>
+      <w:r>
+        <w:rPr>
+          <w:lang w:val="en-AU"/>
+        </w:rPr>
+        <w:t>BorrowCopy</w:t>
+      </w:r>
+      <w:proofErr w:type="spellEnd"/>
+      <w:r>
+        <w:rPr>
+          <w:lang w:val="en-AU"/>
+        </w:rPr>
+        <w:t>(</w:t>
+      </w:r>
+      <w:proofErr w:type="gramEnd"/>
+      <w:r>
+        <w:rPr>
+          <w:lang w:val="en-AU"/>
+        </w:rPr>
+        <w:t xml:space="preserve">) and </w:t>
+      </w:r>
+      <w:proofErr w:type="spellStart"/>
+      <w:proofErr w:type="gramStart"/>
+      <w:r>
+        <w:rPr>
+          <w:lang w:val="en-AU"/>
+        </w:rPr>
+        <w:t>ReturnCopy</w:t>
+      </w:r>
+      <w:proofErr w:type="spellEnd"/>
+      <w:r>
+        <w:rPr>
+          <w:lang w:val="en-AU"/>
+        </w:rPr>
+        <w:t>(</w:t>
+      </w:r>
+      <w:proofErr w:type="gramEnd"/>
+      <w:r>
+        <w:rPr>
+          <w:lang w:val="en-AU"/>
+        </w:rPr>
+        <w:t xml:space="preserve">) methods, failing to call </w:t>
+      </w:r>
+      <w:proofErr w:type="spellStart"/>
+      <w:proofErr w:type="gramStart"/>
+      <w:r>
+        <w:rPr>
+          <w:lang w:val="en-AU"/>
+        </w:rPr>
+        <w:t>ReturnCopy</w:t>
+      </w:r>
+      <w:proofErr w:type="spellEnd"/>
+      <w:r>
+        <w:rPr>
+          <w:lang w:val="en-AU"/>
+        </w:rPr>
+        <w:t>(</w:t>
+      </w:r>
+      <w:proofErr w:type="gramEnd"/>
+      <w:r>
+        <w:rPr>
+          <w:lang w:val="en-AU"/>
+        </w:rPr>
+        <w:t>) meant the inventory count never increased after a return.Loan.cs+2</w:t>
+      </w:r>
+    </w:p>
+    <w:p>
+      <w:pPr>
+        <w:rPr>
+          <w:b/>
+          <w:bCs/>
+          <w:lang w:val="en-AU"/>
+        </w:rPr>
+      </w:pPr>
+      <w:r>
+        <w:rPr>
+          <w:b/>
+          <w:bCs/>
+          <w:lang w:val="en-AU"/>
+        </w:rPr>
+        <w:t>Fix Implemented</w:t>
+      </w:r>
+    </w:p>
+    <w:p>
+      <w:pPr>
+        <w:numPr>
+          <w:ilvl w:val="0"/>
+          <w:numId w:val="8"/>
+        </w:numPr>
+        <w:rPr>
+          <w:lang w:val="en-AU"/>
+        </w:rPr>
+      </w:pPr>
+      <w:r>
+        <w:rPr>
+          <w:b/>
+          <w:bCs/>
+          <w:lang w:val="en-AU"/>
+        </w:rPr>
+        <w:t>Files changed:</w:t>
+      </w:r>
+      <w:r>
+        <w:rPr>
+          <w:lang w:val="en-AU"/>
+        </w:rPr>
+        <w:t xml:space="preserve"> </w:t>
+      </w:r>
+      <w:proofErr w:type="spellStart"/>
+      <w:r>
+        <w:rPr>
+          <w:lang w:val="en-AU"/>
+        </w:rPr>
+        <w:t>LibrarySystem.cs.</w:t>
+      </w:r>
+      <w:hyperlink r:id="rId12" w:tgtFrame="_blank" w:history="1">
+        <w:r>
+          <w:rPr>
+            <w:rStyle w:val="Hyperlink"/>
+            <w:lang w:val="en-AU"/>
+          </w:rPr>
+          <w:t>Librarysystem.cs</w:t>
+        </w:r>
+        <w:proofErr w:type="spellEnd"/>
+      </w:hyperlink>
+    </w:p>
+    <w:p>
+      <w:pPr>
+        <w:numPr>
+          <w:ilvl w:val="0"/>
+          <w:numId w:val="8"/>
+        </w:numPr>
+        <w:rPr>
+          <w:lang w:val="en-AU"/>
+        </w:rPr>
+      </w:pPr>
+      <w:r>
+        <w:rPr>
+          <w:b/>
+          <w:bCs/>
+          <w:lang w:val="en-AU"/>
+        </w:rPr>
+        <w:t>Methods updated:</w:t>
+      </w:r>
+      <w:r>
+        <w:rPr>
+          <w:lang w:val="en-AU"/>
+        </w:rPr>
+        <w:t xml:space="preserve"> </w:t>
+      </w:r>
+      <w:proofErr w:type="spellStart"/>
+      <w:r>
+        <w:rPr>
+          <w:lang w:val="en-AU"/>
+        </w:rPr>
+        <w:t>ReturnLoan</w:t>
+      </w:r>
+      <w:proofErr w:type="spellEnd"/>
+      <w:r>
+        <w:rPr>
+          <w:lang w:val="en-AU"/>
+        </w:rPr>
+        <w:t>.</w:t>
+      </w:r>
+    </w:p>
+    <w:p>
+      <w:pPr>
+        <w:numPr>
+          <w:ilvl w:val="0"/>
+          <w:numId w:val="8"/>
+        </w:numPr>
+        <w:rPr>
+          <w:lang w:val="en-AU"/>
+        </w:rPr>
+      </w:pPr>
+      <w:r>
+        <w:rPr>
+          <w:b/>
+          <w:bCs/>
+          <w:lang w:val="en-AU"/>
+        </w:rPr>
+        <w:t>Code changes (summary):</w:t>
+      </w:r>
+    </w:p>
+    <w:p>
+      <w:pPr>
+        <w:numPr>
+          <w:ilvl w:val="1"/>
+          <w:numId w:val="8"/>
+        </w:numPr>
+        <w:rPr>
+          <w:lang w:val="en-AU"/>
+        </w:rPr>
+      </w:pPr>
+      <w:r>
+        <w:rPr>
+          <w:lang w:val="en-AU"/>
+        </w:rPr>
+        <w:t>Updated the return workflow to locate the associated Book.</w:t>
+      </w:r>
+    </w:p>
+    <w:p>
+      <w:pPr>
+        <w:numPr>
+          <w:ilvl w:val="1"/>
+          <w:numId w:val="8"/>
+        </w:numPr>
+        <w:rPr>
+          <w:lang w:val="en-AU"/>
+        </w:rPr>
+      </w:pPr>
+      <w:r>
+        <w:rPr>
+          <w:lang w:val="en-AU"/>
+        </w:rPr>
+        <w:t xml:space="preserve">Added a call to </w:t>
+      </w:r>
+      <w:proofErr w:type="spellStart"/>
+      <w:proofErr w:type="gramStart"/>
+      <w:r>
+        <w:rPr>
+          <w:lang w:val="en-AU"/>
+        </w:rPr>
+        <w:t>book.ReturnCopy</w:t>
+      </w:r>
+      <w:proofErr w:type="spellEnd"/>
+      <w:proofErr w:type="gramEnd"/>
+      <w:r>
+        <w:rPr>
+          <w:lang w:val="en-AU"/>
+        </w:rPr>
+        <w:t xml:space="preserve">() so the available copy </w:t>
+      </w:r>
+      <w:proofErr w:type="gramStart"/>
+      <w:r>
+        <w:rPr>
+          <w:lang w:val="en-AU"/>
+        </w:rPr>
+        <w:t>count</w:t>
+      </w:r>
+      <w:proofErr w:type="gramEnd"/>
+      <w:r>
+        <w:rPr>
+          <w:lang w:val="en-AU"/>
+        </w:rPr>
+        <w:t xml:space="preserve"> increases correctly.</w:t>
+      </w:r>
+    </w:p>
+    <w:p>
+      <w:pPr>
+        <w:numPr>
+          <w:ilvl w:val="1"/>
+          <w:numId w:val="8"/>
+        </w:numPr>
+        <w:rPr>
+          <w:lang w:val="en-AU"/>
+        </w:rPr>
+      </w:pPr>
+      <w:r>
+        <w:rPr>
+          <w:lang w:val="en-AU"/>
+        </w:rPr>
+        <w:t xml:space="preserve">Kept the reservation queue logic so the next queued reservation can still be promoted to </w:t>
+      </w:r>
+      <w:proofErr w:type="spellStart"/>
+      <w:r>
+        <w:rPr>
+          <w:lang w:val="en-AU"/>
+        </w:rPr>
+        <w:t>AvailableToCollect</w:t>
+      </w:r>
+      <w:proofErr w:type="spellEnd"/>
+      <w:r>
+        <w:rPr>
+          <w:lang w:val="en-AU"/>
+        </w:rPr>
+        <w:t xml:space="preserve"> when required.Reservation.cs+2</w:t>
+      </w:r>
+    </w:p>
+    <w:p>
+      <w:pPr>
+        <w:rPr>
+          <w:lang w:val="en-AU"/>
+        </w:rPr>
+      </w:pPr>
+      <w:proofErr w:type="spellStart"/>
+      <w:r>
+        <w:rPr>
+          <w:lang w:val="en-AU"/>
+        </w:rPr>
+        <w:t>csharp</w:t>
+      </w:r>
+      <w:proofErr w:type="spellEnd"/>
+    </w:p>
+    <w:p>
+      <w:pPr>
+        <w:rPr>
+          <w:lang w:val="en-AU"/>
+        </w:rPr>
+      </w:pPr>
+      <w:r>
+        <w:rPr>
+          <w:b/>
+          <w:bCs/>
+          <w:lang w:val="en-AU"/>
+        </w:rPr>
+        <w:t>bool</w:t>
+      </w:r>
+      <w:r>
+        <w:rPr>
+          <w:lang w:val="en-AU"/>
+        </w:rPr>
+        <w:t xml:space="preserve"> </w:t>
+      </w:r>
+      <w:proofErr w:type="spellStart"/>
+      <w:r>
+        <w:rPr>
+          <w:lang w:val="en-AU"/>
+        </w:rPr>
+        <w:t>returnedToShelf</w:t>
+      </w:r>
+      <w:proofErr w:type="spellEnd"/>
+      <w:r>
+        <w:rPr>
+          <w:lang w:val="en-AU"/>
+        </w:rPr>
+        <w:t xml:space="preserve"> = </w:t>
+      </w:r>
+      <w:proofErr w:type="spellStart"/>
+      <w:proofErr w:type="gramStart"/>
+      <w:r>
+        <w:rPr>
+          <w:lang w:val="en-AU"/>
+        </w:rPr>
+        <w:t>book.ReturnCopy</w:t>
+      </w:r>
+      <w:proofErr w:type="spellEnd"/>
+      <w:proofErr w:type="gramEnd"/>
+      <w:r>
+        <w:rPr>
+          <w:lang w:val="en-AU"/>
+        </w:rPr>
+        <w:t>();</w:t>
+      </w:r>
+    </w:p>
+    <w:p>
+      <w:pPr>
+        <w:rPr>
+          <w:lang w:val="en-AU"/>
+        </w:rPr>
+      </w:pPr>
+      <w:r>
+        <w:rPr>
+          <w:b/>
+          <w:bCs/>
+          <w:lang w:val="en-AU"/>
+        </w:rPr>
+        <w:t>if</w:t>
+      </w:r>
+      <w:r>
+        <w:rPr>
+          <w:lang w:val="en-AU"/>
+        </w:rPr>
+        <w:t xml:space="preserve"> </w:t>
+      </w:r>
+      <w:proofErr w:type="gramStart"/>
+      <w:r>
+        <w:rPr>
+          <w:lang w:val="en-AU"/>
+        </w:rPr>
+        <w:t>(!</w:t>
+      </w:r>
+      <w:proofErr w:type="spellStart"/>
+      <w:r>
+        <w:rPr>
+          <w:lang w:val="en-AU"/>
+        </w:rPr>
+        <w:t>returnedToShelf</w:t>
+      </w:r>
+      <w:proofErr w:type="spellEnd"/>
+      <w:proofErr w:type="gramEnd"/>
+      <w:r>
+        <w:rPr>
+          <w:lang w:val="en-AU"/>
+        </w:rPr>
+        <w:t>)</w:t>
+      </w:r>
+    </w:p>
+    <w:p>
+      <w:pPr>
+        <w:rPr>
+          <w:lang w:val="en-AU"/>
+        </w:rPr>
+      </w:pPr>
+      <w:r>
+        <w:rPr>
+          <w:lang w:val="en-AU"/>
+        </w:rPr>
+        <w:t xml:space="preserve">    </w:t>
+      </w:r>
+      <w:r>
+        <w:rPr>
+          <w:b/>
+          <w:bCs/>
+          <w:lang w:val="en-AU"/>
+        </w:rPr>
+        <w:t>return</w:t>
+      </w:r>
+      <w:r>
+        <w:rPr>
+          <w:lang w:val="en-AU"/>
+        </w:rPr>
+        <w:t xml:space="preserve"> "Book return failed because available copies would exceed total copies.";</w:t>
+      </w:r>
+    </w:p>
+    <w:p>
+      <w:pPr>
+        <w:rPr>
+          <w:b/>
+          <w:bCs/>
+          <w:lang w:val="en-AU"/>
+        </w:rPr>
+      </w:pPr>
+      <w:r>
+        <w:rPr>
+          <w:b/>
+          <w:bCs/>
+          <w:lang w:val="en-AU"/>
+        </w:rPr>
+        <w:t>Test(s) Performed</w:t>
+      </w:r>
+    </w:p>
+    <w:p>
+      <w:pPr>
+        <w:numPr>
+          <w:ilvl w:val="0"/>
+          <w:numId w:val="9"/>
+        </w:numPr>
+        <w:rPr>
+          <w:lang w:val="en-AU"/>
+        </w:rPr>
+      </w:pPr>
+      <w:r>
+        <w:rPr>
+          <w:b/>
+          <w:bCs/>
+          <w:lang w:val="en-AU"/>
+        </w:rPr>
+        <w:t>Manual tests:</w:t>
+      </w:r>
+    </w:p>
+    <w:p>
+      <w:pPr>
+        <w:numPr>
+          <w:ilvl w:val="1"/>
+          <w:numId w:val="9"/>
+        </w:numPr>
+        <w:rPr>
+          <w:lang w:val="en-AU"/>
+        </w:rPr>
+      </w:pPr>
+      <w:r>
+        <w:rPr>
+          <w:lang w:val="en-AU"/>
+        </w:rPr>
+        <w:t>Returned a borrowed book and checked that the book</w:t>
+      </w:r>
+      <w:r>
+        <w:rPr>
+          <w:lang w:val="en-AU"/>
+        </w:rPr>
+        <w:t>’</w:t>
+      </w:r>
+      <w:r>
+        <w:rPr>
+          <w:lang w:val="en-AU"/>
+        </w:rPr>
+        <w:t xml:space="preserve">s </w:t>
+      </w:r>
+      <w:proofErr w:type="spellStart"/>
+      <w:r>
+        <w:rPr>
+          <w:lang w:val="en-AU"/>
+        </w:rPr>
+        <w:t>AvailableCopies</w:t>
+      </w:r>
+      <w:proofErr w:type="spellEnd"/>
+      <w:r>
+        <w:rPr>
+          <w:lang w:val="en-AU"/>
+        </w:rPr>
+        <w:t xml:space="preserve"> increased.</w:t>
+      </w:r>
+    </w:p>
+    <w:p>
+      <w:pPr>
+        <w:numPr>
+          <w:ilvl w:val="1"/>
+          <w:numId w:val="9"/>
+        </w:numPr>
+        <w:rPr>
+          <w:lang w:val="en-AU"/>
+        </w:rPr>
+      </w:pPr>
+      <w:r>
+        <w:rPr>
+          <w:lang w:val="en-AU"/>
+        </w:rPr>
+        <w:t>Repeated the return scenario with a queued reservation to confirm the stock update and reservation update both occurred correctly.</w:t>
+      </w:r>
+    </w:p>
+    <w:p>
+      <w:pPr>
+        <w:numPr>
+          <w:ilvl w:val="0"/>
+          <w:numId w:val="9"/>
+        </w:numPr>
+        <w:rPr>
+          <w:lang w:val="en-AU"/>
+        </w:rPr>
+      </w:pPr>
+      <w:r>
+        <w:rPr>
+          <w:b/>
+          <w:bCs/>
+          <w:lang w:val="en-AU"/>
+        </w:rPr>
+        <w:t>Existing test case(s):</w:t>
+      </w:r>
+    </w:p>
+    <w:p>
+      <w:pPr>
+        <w:numPr>
+          <w:ilvl w:val="1"/>
+          <w:numId w:val="9"/>
+        </w:numPr>
+        <w:rPr>
+          <w:lang w:val="en-AU"/>
+        </w:rPr>
+      </w:pPr>
+      <w:r>
+        <w:rPr>
+          <w:lang w:val="en-AU"/>
+        </w:rPr>
+        <w:t xml:space="preserve">R7 </w:t>
+      </w:r>
+      <w:r>
+        <w:rPr>
+          <w:lang w:val="en-AU"/>
+        </w:rPr>
+        <w:t>–</w:t>
+      </w:r>
+      <w:r>
+        <w:rPr>
+          <w:lang w:val="en-AU"/>
+        </w:rPr>
+        <w:t xml:space="preserve"> Return book with queued reservation.</w:t>
+      </w:r>
+    </w:p>
+    <w:p>
+      <w:pPr>
+        <w:numPr>
+          <w:ilvl w:val="0"/>
+          <w:numId w:val="9"/>
+        </w:numPr>
+        <w:rPr>
+          <w:lang w:val="en-AU"/>
+        </w:rPr>
+      </w:pPr>
+      <w:r>
+        <w:rPr>
+          <w:b/>
+          <w:bCs/>
+          <w:lang w:val="en-AU"/>
+        </w:rPr>
+        <w:t>Data check:</w:t>
+      </w:r>
+    </w:p>
+    <w:p>
+      <w:pPr>
+        <w:numPr>
+          <w:ilvl w:val="1"/>
+          <w:numId w:val="9"/>
+        </w:numPr>
+        <w:rPr>
+          <w:lang w:val="en-AU"/>
+        </w:rPr>
+      </w:pPr>
+      <w:r>
+        <w:rPr>
+          <w:lang w:val="en-AU"/>
+        </w:rPr>
+        <w:t>Verified that the book record reflected the updated copy count after the return was processed and saved.Book.cs+1</w:t>
+      </w:r>
+    </w:p>
+    <w:p>
+      <w:pPr>
+        <w:rPr>
+          <w:b/>
+          <w:bCs/>
+          <w:lang w:val="en-AU"/>
+        </w:rPr>
+      </w:pPr>
+      <w:r>
+        <w:rPr>
+          <w:b/>
+          <w:bCs/>
+          <w:lang w:val="en-AU"/>
+        </w:rPr>
+        <w:t>Result / Status</w:t>
+      </w:r>
+    </w:p>
+    <w:p>
+      <w:pPr>
+        <w:numPr>
+          <w:ilvl w:val="0"/>
+          <w:numId w:val="10"/>
+        </w:numPr>
+        <w:rPr>
+          <w:lang w:val="en-AU"/>
+        </w:rPr>
+      </w:pPr>
+      <w:r>
+        <w:rPr>
+          <w:b/>
+          <w:bCs/>
+          <w:lang w:val="en-AU"/>
+        </w:rPr>
+        <w:t>Outcome:</w:t>
+      </w:r>
+      <w:r>
+        <w:rPr>
+          <w:lang w:val="en-AU"/>
+        </w:rPr>
+        <w:t xml:space="preserve"> Fixed.</w:t>
+      </w:r>
+    </w:p>
+    <w:p>
+      <w:pPr>
+        <w:numPr>
+          <w:ilvl w:val="0"/>
+          <w:numId w:val="10"/>
+        </w:numPr>
+        <w:rPr>
+          <w:lang w:val="en-AU"/>
+        </w:rPr>
+      </w:pPr>
+      <w:r>
+        <w:rPr>
+          <w:b/>
+          <w:bCs/>
+          <w:lang w:val="en-AU"/>
+        </w:rPr>
+        <w:t>Notes:</w:t>
+      </w:r>
+      <w:r>
+        <w:rPr>
+          <w:lang w:val="en-AU"/>
+        </w:rPr>
+        <w:t xml:space="preserve"> Available copies now increase correctly during the return workflow because the system uses </w:t>
+      </w:r>
+      <w:proofErr w:type="spellStart"/>
+      <w:r>
+        <w:rPr>
+          <w:lang w:val="en-AU"/>
+        </w:rPr>
+        <w:t>Book.ReturnCopy</w:t>
+      </w:r>
+      <w:proofErr w:type="spellEnd"/>
+      <w:r>
+        <w:rPr>
+          <w:lang w:val="en-AU"/>
+        </w:rPr>
+        <w:t>() instead of only updating the loan record.Book.cs+1</w:t>
+      </w:r>
+    </w:p>
+    <w:p>
+      <w:pPr>
+        <w:rPr>
+          <w:lang w:val="en-AU"/>
+        </w:rPr>
+      </w:pPr>
+      <w:r>
+        <w:rPr>
+          <w:lang w:val="en-AU"/>
+        </w:rPr>
+        <w:t xml:space="preserve">If you want, I can also format these two into a cleaner assignment-style </w:t>
+      </w:r>
+      <w:proofErr w:type="gramStart"/>
+      <w:r>
+        <w:rPr>
+          <w:lang w:val="en-AU"/>
+        </w:rPr>
+        <w:t>tone</w:t>
+      </w:r>
+      <w:proofErr w:type="gramEnd"/>
+      <w:r>
+        <w:rPr>
+          <w:lang w:val="en-AU"/>
+        </w:rPr>
+        <w:t xml:space="preserve"> so they read more like formal report entries and less like developer notes.</w:t>
+      </w:r>
+    </w:p>
+    <w:p>
+      <w:r>
+        <w:lastRenderedPageBreak/>
+        <w:drawing>
+          <wp:inline distT="0" distB="0" distL="0" distR="0" wp14:anchorId="4D5D879A" wp14:editId="535A27D7">
+            <wp:extent cx="5200688" cy="2266967"/>
+            <wp:effectExtent l="0" t="0" r="0" b="0"/>
+            <wp:docPr id="959309552" name="Picture 1" descr="The image shows a book library interface displaying various books with their details such as author, title, publication date, and availability.&#10;&#10;AI-generated content may be incorrect."/>
+            <wp:cNvGraphicFramePr>
+              <a:graphicFrameLocks xmlns:a="http://schemas.openxmlformats.org/drawingml/2006/main" noChangeAspect="1"/>
+            </wp:cNvGraphicFramePr>
+            <a:graphic xmlns:a="http://schemas.openxmlformats.org/drawingml/2006/main">
+              <a:graphicData uri="http://schemas.openxmlformats.org/drawingml/2006/picture">
+                <pic:pic xmlns:pic="http://schemas.openxmlformats.org/drawingml/2006/picture">
+                  <pic:nvPicPr>
+                    <pic:cNvPr id="959309552" name="Picture 1" descr="The image shows a book library interface displaying various books with their details such as author, title, publication date, and availability.&#10;&#10;AI-generated content may be incorrect."/>
+                    <pic:cNvPicPr/>
+                  </pic:nvPicPr>
+                  <pic:blipFill>
+                    <a:blip r:embed="rId13"/>
+                    <a:stretch>
+                      <a:fillRect/>
+                    </a:stretch>
+                  </pic:blipFill>
+                  <pic:spPr>
+                    <a:xfrm>
+                      <a:off x="0" y="0"/>
+                      <a:ext cx="5200688" cy="2266967"/>
+                    </a:xfrm>
+                    <a:prstGeom prst="rect">
+                      <a:avLst/>
+                    </a:prstGeom>
+                  </pic:spPr>
+                </pic:pic>
+              </a:graphicData>
+            </a:graphic>
+          </wp:inline>
+        </w:drawing>
+      </w:r>
+    </w:p>
     <w:sectPr>
       <w:pgSz w:w="12240" w:h="15840"/>
       <w:pgMar w:top="1365" w:right="1365" w:bottom="1365" w:left="1365" w:header="720" w:footer="720" w:gutter="0"/>
@@ -2738,6 +4861,1531 @@
     </w:sectPr>
   </w:body>
 </w:document>
+</file>
+
+<file path=word/numbering.xml><?xml version="1.0" encoding="utf-8"?>
+<w:numbering xmlns:wpc="http://schemas.microsoft.com/office/word/2010/wordprocessingCanvas" xmlns:cx="http://schemas.microsoft.com/office/drawing/2014/chartex" xmlns:cx1="http://schemas.microsoft.com/office/drawing/2015/9/8/chartex" xmlns:cx2="http://schemas.microsoft.com/office/drawing/2015/10/21/chartex" xmlns:cx3="http://schemas.microsoft.com/office/drawing/2016/5/9/chartex" xmlns:cx4="http://schemas.microsoft.com/office/drawing/2016/5/10/chartex" xmlns:cx5="http://schemas.microsoft.com/office/drawing/2016/5/11/chartex" xmlns:cx6="http://schemas.microsoft.com/office/drawing/2016/5/12/chartex" xmlns:cx7="http://schemas.microsoft.com/office/drawing/2016/5/13/chartex" xmlns:cx8="http://schemas.microsoft.com/office/drawing/2016/5/14/chartex" xmlns:mc="http://schemas.openxmlformats.org/markup-compatibility/2006" xmlns:aink="http://schemas.microsoft.com/office/drawing/2016/ink" xmlns:am3d="http://schemas.microsoft.com/office/drawing/2017/model3d" xmlns:o="urn:schemas-microsoft-com:office:office" xmlns:oel="http://schemas.microsoft.com/office/2019/extlst" xmlns:r="http://schemas.openxmlformats.org/officeDocument/2006/relationships" xmlns:m="http://schemas.openxmlformats.org/officeDocument/2006/math" xmlns:v="urn:schemas-microsoft-com:vml" xmlns:wp14="http://schemas.microsoft.com/office/word/2010/wordprocessingDrawing" xmlns:wp="http://schemas.openxmlformats.org/drawingml/2006/wordprocessingDrawing" xmlns:w10="urn:schemas-microsoft-com:office:word" xmlns:w="http://schemas.openxmlformats.org/wordprocessingml/2006/main" xmlns:w14="http://schemas.microsoft.com/office/word/2010/wordml" xmlns:w15="http://schemas.microsoft.com/office/word/2012/wordml" xmlns:w16cex="http://schemas.microsoft.com/office/word/2018/wordml/cex" xmlns:w16cid="http://schemas.microsoft.com/office/word/2016/wordml/cid" xmlns:w16="http://schemas.microsoft.com/office/word/2018/wordml" xmlns:w16du="http://schemas.microsoft.com/office/word/2023/wordml/word16du" xmlns:w16sdtdh="http://schemas.microsoft.com/office/word/2020/wordml/sdtdatahash" xmlns:w16sdtfl="http://schemas.microsoft.com/office/word/2024/wordml/sdtformatlock" xmlns:w16se="http://schemas.microsoft.com/office/word/2015/wordml/symex" xmlns:wpg="http://schemas.microsoft.com/office/word/2010/wordprocessingGroup" xmlns:wpi="http://schemas.microsoft.com/office/word/2010/wordprocessingInk" xmlns:wne="http://schemas.microsoft.com/office/word/2006/wordml" xmlns:wps="http://schemas.microsoft.com/office/word/2010/wordprocessingShape" mc:Ignorable="w14 w15 w16se w16cid w16 w16cex w16sdtdh w16sdtfl w16du wp14">
+  <w:abstractNum w:abstractNumId="0" w15:restartNumberingAfterBreak="0">
+    <w:nsid w:val="0DEF4CB4"/>
+    <w:multiLevelType w:val="multilevel"/>
+    <w:tmpl w:val="A47C964A"/>
+    <w:lvl w:ilvl="0">
+      <w:start w:val="1"/>
+      <w:numFmt w:val="bullet"/>
+      <w:lvlText w:val=""/>
+      <w:lvlJc w:val="left"/>
+      <w:pPr>
+        <w:tabs>
+          <w:tab w:val="num" w:pos="720"/>
+        </w:tabs>
+        <w:ind w:left="720" w:hanging="360"/>
+      </w:pPr>
+      <w:rPr>
+        <w:rFonts w:ascii="Symbol" w:hAnsi="Symbol" w:hint="default"/>
+        <w:sz w:val="20"/>
+      </w:rPr>
+    </w:lvl>
+    <w:lvl w:ilvl="1">
+      <w:start w:val="1"/>
+      <w:numFmt w:val="bullet"/>
+      <w:lvlText w:val="o"/>
+      <w:lvlJc w:val="left"/>
+      <w:pPr>
+        <w:tabs>
+          <w:tab w:val="num" w:pos="1440"/>
+        </w:tabs>
+        <w:ind w:left="1440" w:hanging="360"/>
+      </w:pPr>
+      <w:rPr>
+        <w:rFonts w:ascii="Courier New" w:hAnsi="Courier New" w:hint="default"/>
+        <w:sz w:val="20"/>
+      </w:rPr>
+    </w:lvl>
+    <w:lvl w:ilvl="2" w:tentative="1">
+      <w:start w:val="1"/>
+      <w:numFmt w:val="bullet"/>
+      <w:lvlText w:val=""/>
+      <w:lvlJc w:val="left"/>
+      <w:pPr>
+        <w:tabs>
+          <w:tab w:val="num" w:pos="2160"/>
+        </w:tabs>
+        <w:ind w:left="2160" w:hanging="360"/>
+      </w:pPr>
+      <w:rPr>
+        <w:rFonts w:ascii="Wingdings" w:hAnsi="Wingdings" w:hint="default"/>
+        <w:sz w:val="20"/>
+      </w:rPr>
+    </w:lvl>
+    <w:lvl w:ilvl="3" w:tentative="1">
+      <w:start w:val="1"/>
+      <w:numFmt w:val="bullet"/>
+      <w:lvlText w:val=""/>
+      <w:lvlJc w:val="left"/>
+      <w:pPr>
+        <w:tabs>
+          <w:tab w:val="num" w:pos="2880"/>
+        </w:tabs>
+        <w:ind w:left="2880" w:hanging="360"/>
+      </w:pPr>
+      <w:rPr>
+        <w:rFonts w:ascii="Wingdings" w:hAnsi="Wingdings" w:hint="default"/>
+        <w:sz w:val="20"/>
+      </w:rPr>
+    </w:lvl>
+    <w:lvl w:ilvl="4" w:tentative="1">
+      <w:start w:val="1"/>
+      <w:numFmt w:val="bullet"/>
+      <w:lvlText w:val=""/>
+      <w:lvlJc w:val="left"/>
+      <w:pPr>
+        <w:tabs>
+          <w:tab w:val="num" w:pos="3600"/>
+        </w:tabs>
+        <w:ind w:left="3600" w:hanging="360"/>
+      </w:pPr>
+      <w:rPr>
+        <w:rFonts w:ascii="Wingdings" w:hAnsi="Wingdings" w:hint="default"/>
+        <w:sz w:val="20"/>
+      </w:rPr>
+    </w:lvl>
+    <w:lvl w:ilvl="5" w:tentative="1">
+      <w:start w:val="1"/>
+      <w:numFmt w:val="bullet"/>
+      <w:lvlText w:val=""/>
+      <w:lvlJc w:val="left"/>
+      <w:pPr>
+        <w:tabs>
+          <w:tab w:val="num" w:pos="4320"/>
+        </w:tabs>
+        <w:ind w:left="4320" w:hanging="360"/>
+      </w:pPr>
+      <w:rPr>
+        <w:rFonts w:ascii="Wingdings" w:hAnsi="Wingdings" w:hint="default"/>
+        <w:sz w:val="20"/>
+      </w:rPr>
+    </w:lvl>
+    <w:lvl w:ilvl="6" w:tentative="1">
+      <w:start w:val="1"/>
+      <w:numFmt w:val="bullet"/>
+      <w:lvlText w:val=""/>
+      <w:lvlJc w:val="left"/>
+      <w:pPr>
+        <w:tabs>
+          <w:tab w:val="num" w:pos="5040"/>
+        </w:tabs>
+        <w:ind w:left="5040" w:hanging="360"/>
+      </w:pPr>
+      <w:rPr>
+        <w:rFonts w:ascii="Wingdings" w:hAnsi="Wingdings" w:hint="default"/>
+        <w:sz w:val="20"/>
+      </w:rPr>
+    </w:lvl>
+    <w:lvl w:ilvl="7" w:tentative="1">
+      <w:start w:val="1"/>
+      <w:numFmt w:val="bullet"/>
+      <w:lvlText w:val=""/>
+      <w:lvlJc w:val="left"/>
+      <w:pPr>
+        <w:tabs>
+          <w:tab w:val="num" w:pos="5760"/>
+        </w:tabs>
+        <w:ind w:left="5760" w:hanging="360"/>
+      </w:pPr>
+      <w:rPr>
+        <w:rFonts w:ascii="Wingdings" w:hAnsi="Wingdings" w:hint="default"/>
+        <w:sz w:val="20"/>
+      </w:rPr>
+    </w:lvl>
+    <w:lvl w:ilvl="8" w:tentative="1">
+      <w:start w:val="1"/>
+      <w:numFmt w:val="bullet"/>
+      <w:lvlText w:val=""/>
+      <w:lvlJc w:val="left"/>
+      <w:pPr>
+        <w:tabs>
+          <w:tab w:val="num" w:pos="6480"/>
+        </w:tabs>
+        <w:ind w:left="6480" w:hanging="360"/>
+      </w:pPr>
+      <w:rPr>
+        <w:rFonts w:ascii="Wingdings" w:hAnsi="Wingdings" w:hint="default"/>
+        <w:sz w:val="20"/>
+      </w:rPr>
+    </w:lvl>
+  </w:abstractNum>
+  <w:abstractNum w:abstractNumId="1" w15:restartNumberingAfterBreak="0">
+    <w:nsid w:val="131660A5"/>
+    <w:multiLevelType w:val="multilevel"/>
+    <w:tmpl w:val="C902EA70"/>
+    <w:lvl w:ilvl="0">
+      <w:start w:val="1"/>
+      <w:numFmt w:val="bullet"/>
+      <w:lvlText w:val=""/>
+      <w:lvlJc w:val="left"/>
+      <w:pPr>
+        <w:tabs>
+          <w:tab w:val="num" w:pos="720"/>
+        </w:tabs>
+        <w:ind w:left="720" w:hanging="360"/>
+      </w:pPr>
+      <w:rPr>
+        <w:rFonts w:ascii="Symbol" w:hAnsi="Symbol" w:hint="default"/>
+        <w:sz w:val="20"/>
+      </w:rPr>
+    </w:lvl>
+    <w:lvl w:ilvl="1" w:tentative="1">
+      <w:start w:val="1"/>
+      <w:numFmt w:val="bullet"/>
+      <w:lvlText w:val="o"/>
+      <w:lvlJc w:val="left"/>
+      <w:pPr>
+        <w:tabs>
+          <w:tab w:val="num" w:pos="1440"/>
+        </w:tabs>
+        <w:ind w:left="1440" w:hanging="360"/>
+      </w:pPr>
+      <w:rPr>
+        <w:rFonts w:ascii="Courier New" w:hAnsi="Courier New" w:hint="default"/>
+        <w:sz w:val="20"/>
+      </w:rPr>
+    </w:lvl>
+    <w:lvl w:ilvl="2" w:tentative="1">
+      <w:start w:val="1"/>
+      <w:numFmt w:val="bullet"/>
+      <w:lvlText w:val=""/>
+      <w:lvlJc w:val="left"/>
+      <w:pPr>
+        <w:tabs>
+          <w:tab w:val="num" w:pos="2160"/>
+        </w:tabs>
+        <w:ind w:left="2160" w:hanging="360"/>
+      </w:pPr>
+      <w:rPr>
+        <w:rFonts w:ascii="Wingdings" w:hAnsi="Wingdings" w:hint="default"/>
+        <w:sz w:val="20"/>
+      </w:rPr>
+    </w:lvl>
+    <w:lvl w:ilvl="3" w:tentative="1">
+      <w:start w:val="1"/>
+      <w:numFmt w:val="bullet"/>
+      <w:lvlText w:val=""/>
+      <w:lvlJc w:val="left"/>
+      <w:pPr>
+        <w:tabs>
+          <w:tab w:val="num" w:pos="2880"/>
+        </w:tabs>
+        <w:ind w:left="2880" w:hanging="360"/>
+      </w:pPr>
+      <w:rPr>
+        <w:rFonts w:ascii="Wingdings" w:hAnsi="Wingdings" w:hint="default"/>
+        <w:sz w:val="20"/>
+      </w:rPr>
+    </w:lvl>
+    <w:lvl w:ilvl="4" w:tentative="1">
+      <w:start w:val="1"/>
+      <w:numFmt w:val="bullet"/>
+      <w:lvlText w:val=""/>
+      <w:lvlJc w:val="left"/>
+      <w:pPr>
+        <w:tabs>
+          <w:tab w:val="num" w:pos="3600"/>
+        </w:tabs>
+        <w:ind w:left="3600" w:hanging="360"/>
+      </w:pPr>
+      <w:rPr>
+        <w:rFonts w:ascii="Wingdings" w:hAnsi="Wingdings" w:hint="default"/>
+        <w:sz w:val="20"/>
+      </w:rPr>
+    </w:lvl>
+    <w:lvl w:ilvl="5" w:tentative="1">
+      <w:start w:val="1"/>
+      <w:numFmt w:val="bullet"/>
+      <w:lvlText w:val=""/>
+      <w:lvlJc w:val="left"/>
+      <w:pPr>
+        <w:tabs>
+          <w:tab w:val="num" w:pos="4320"/>
+        </w:tabs>
+        <w:ind w:left="4320" w:hanging="360"/>
+      </w:pPr>
+      <w:rPr>
+        <w:rFonts w:ascii="Wingdings" w:hAnsi="Wingdings" w:hint="default"/>
+        <w:sz w:val="20"/>
+      </w:rPr>
+    </w:lvl>
+    <w:lvl w:ilvl="6" w:tentative="1">
+      <w:start w:val="1"/>
+      <w:numFmt w:val="bullet"/>
+      <w:lvlText w:val=""/>
+      <w:lvlJc w:val="left"/>
+      <w:pPr>
+        <w:tabs>
+          <w:tab w:val="num" w:pos="5040"/>
+        </w:tabs>
+        <w:ind w:left="5040" w:hanging="360"/>
+      </w:pPr>
+      <w:rPr>
+        <w:rFonts w:ascii="Wingdings" w:hAnsi="Wingdings" w:hint="default"/>
+        <w:sz w:val="20"/>
+      </w:rPr>
+    </w:lvl>
+    <w:lvl w:ilvl="7" w:tentative="1">
+      <w:start w:val="1"/>
+      <w:numFmt w:val="bullet"/>
+      <w:lvlText w:val=""/>
+      <w:lvlJc w:val="left"/>
+      <w:pPr>
+        <w:tabs>
+          <w:tab w:val="num" w:pos="5760"/>
+        </w:tabs>
+        <w:ind w:left="5760" w:hanging="360"/>
+      </w:pPr>
+      <w:rPr>
+        <w:rFonts w:ascii="Wingdings" w:hAnsi="Wingdings" w:hint="default"/>
+        <w:sz w:val="20"/>
+      </w:rPr>
+    </w:lvl>
+    <w:lvl w:ilvl="8" w:tentative="1">
+      <w:start w:val="1"/>
+      <w:numFmt w:val="bullet"/>
+      <w:lvlText w:val=""/>
+      <w:lvlJc w:val="left"/>
+      <w:pPr>
+        <w:tabs>
+          <w:tab w:val="num" w:pos="6480"/>
+        </w:tabs>
+        <w:ind w:left="6480" w:hanging="360"/>
+      </w:pPr>
+      <w:rPr>
+        <w:rFonts w:ascii="Wingdings" w:hAnsi="Wingdings" w:hint="default"/>
+        <w:sz w:val="20"/>
+      </w:rPr>
+    </w:lvl>
+  </w:abstractNum>
+  <w:abstractNum w:abstractNumId="2" w15:restartNumberingAfterBreak="0">
+    <w:nsid w:val="15FF1317"/>
+    <w:multiLevelType w:val="multilevel"/>
+    <w:tmpl w:val="2D34ABEE"/>
+    <w:lvl w:ilvl="0">
+      <w:start w:val="1"/>
+      <w:numFmt w:val="bullet"/>
+      <w:lvlText w:val=""/>
+      <w:lvlJc w:val="left"/>
+      <w:pPr>
+        <w:tabs>
+          <w:tab w:val="num" w:pos="720"/>
+        </w:tabs>
+        <w:ind w:left="720" w:hanging="360"/>
+      </w:pPr>
+      <w:rPr>
+        <w:rFonts w:ascii="Symbol" w:hAnsi="Symbol" w:hint="default"/>
+        <w:sz w:val="20"/>
+      </w:rPr>
+    </w:lvl>
+    <w:lvl w:ilvl="1" w:tentative="1">
+      <w:start w:val="1"/>
+      <w:numFmt w:val="bullet"/>
+      <w:lvlText w:val="o"/>
+      <w:lvlJc w:val="left"/>
+      <w:pPr>
+        <w:tabs>
+          <w:tab w:val="num" w:pos="1440"/>
+        </w:tabs>
+        <w:ind w:left="1440" w:hanging="360"/>
+      </w:pPr>
+      <w:rPr>
+        <w:rFonts w:ascii="Courier New" w:hAnsi="Courier New" w:hint="default"/>
+        <w:sz w:val="20"/>
+      </w:rPr>
+    </w:lvl>
+    <w:lvl w:ilvl="2" w:tentative="1">
+      <w:start w:val="1"/>
+      <w:numFmt w:val="bullet"/>
+      <w:lvlText w:val=""/>
+      <w:lvlJc w:val="left"/>
+      <w:pPr>
+        <w:tabs>
+          <w:tab w:val="num" w:pos="2160"/>
+        </w:tabs>
+        <w:ind w:left="2160" w:hanging="360"/>
+      </w:pPr>
+      <w:rPr>
+        <w:rFonts w:ascii="Wingdings" w:hAnsi="Wingdings" w:hint="default"/>
+        <w:sz w:val="20"/>
+      </w:rPr>
+    </w:lvl>
+    <w:lvl w:ilvl="3" w:tentative="1">
+      <w:start w:val="1"/>
+      <w:numFmt w:val="bullet"/>
+      <w:lvlText w:val=""/>
+      <w:lvlJc w:val="left"/>
+      <w:pPr>
+        <w:tabs>
+          <w:tab w:val="num" w:pos="2880"/>
+        </w:tabs>
+        <w:ind w:left="2880" w:hanging="360"/>
+      </w:pPr>
+      <w:rPr>
+        <w:rFonts w:ascii="Wingdings" w:hAnsi="Wingdings" w:hint="default"/>
+        <w:sz w:val="20"/>
+      </w:rPr>
+    </w:lvl>
+    <w:lvl w:ilvl="4" w:tentative="1">
+      <w:start w:val="1"/>
+      <w:numFmt w:val="bullet"/>
+      <w:lvlText w:val=""/>
+      <w:lvlJc w:val="left"/>
+      <w:pPr>
+        <w:tabs>
+          <w:tab w:val="num" w:pos="3600"/>
+        </w:tabs>
+        <w:ind w:left="3600" w:hanging="360"/>
+      </w:pPr>
+      <w:rPr>
+        <w:rFonts w:ascii="Wingdings" w:hAnsi="Wingdings" w:hint="default"/>
+        <w:sz w:val="20"/>
+      </w:rPr>
+    </w:lvl>
+    <w:lvl w:ilvl="5" w:tentative="1">
+      <w:start w:val="1"/>
+      <w:numFmt w:val="bullet"/>
+      <w:lvlText w:val=""/>
+      <w:lvlJc w:val="left"/>
+      <w:pPr>
+        <w:tabs>
+          <w:tab w:val="num" w:pos="4320"/>
+        </w:tabs>
+        <w:ind w:left="4320" w:hanging="360"/>
+      </w:pPr>
+      <w:rPr>
+        <w:rFonts w:ascii="Wingdings" w:hAnsi="Wingdings" w:hint="default"/>
+        <w:sz w:val="20"/>
+      </w:rPr>
+    </w:lvl>
+    <w:lvl w:ilvl="6" w:tentative="1">
+      <w:start w:val="1"/>
+      <w:numFmt w:val="bullet"/>
+      <w:lvlText w:val=""/>
+      <w:lvlJc w:val="left"/>
+      <w:pPr>
+        <w:tabs>
+          <w:tab w:val="num" w:pos="5040"/>
+        </w:tabs>
+        <w:ind w:left="5040" w:hanging="360"/>
+      </w:pPr>
+      <w:rPr>
+        <w:rFonts w:ascii="Wingdings" w:hAnsi="Wingdings" w:hint="default"/>
+        <w:sz w:val="20"/>
+      </w:rPr>
+    </w:lvl>
+    <w:lvl w:ilvl="7" w:tentative="1">
+      <w:start w:val="1"/>
+      <w:numFmt w:val="bullet"/>
+      <w:lvlText w:val=""/>
+      <w:lvlJc w:val="left"/>
+      <w:pPr>
+        <w:tabs>
+          <w:tab w:val="num" w:pos="5760"/>
+        </w:tabs>
+        <w:ind w:left="5760" w:hanging="360"/>
+      </w:pPr>
+      <w:rPr>
+        <w:rFonts w:ascii="Wingdings" w:hAnsi="Wingdings" w:hint="default"/>
+        <w:sz w:val="20"/>
+      </w:rPr>
+    </w:lvl>
+    <w:lvl w:ilvl="8" w:tentative="1">
+      <w:start w:val="1"/>
+      <w:numFmt w:val="bullet"/>
+      <w:lvlText w:val=""/>
+      <w:lvlJc w:val="left"/>
+      <w:pPr>
+        <w:tabs>
+          <w:tab w:val="num" w:pos="6480"/>
+        </w:tabs>
+        <w:ind w:left="6480" w:hanging="360"/>
+      </w:pPr>
+      <w:rPr>
+        <w:rFonts w:ascii="Wingdings" w:hAnsi="Wingdings" w:hint="default"/>
+        <w:sz w:val="20"/>
+      </w:rPr>
+    </w:lvl>
+  </w:abstractNum>
+  <w:abstractNum w:abstractNumId="3" w15:restartNumberingAfterBreak="0">
+    <w:nsid w:val="19D07399"/>
+    <w:multiLevelType w:val="multilevel"/>
+    <w:tmpl w:val="1C1CD308"/>
+    <w:lvl w:ilvl="0">
+      <w:start w:val="1"/>
+      <w:numFmt w:val="bullet"/>
+      <w:lvlText w:val=""/>
+      <w:lvlJc w:val="left"/>
+      <w:pPr>
+        <w:tabs>
+          <w:tab w:val="num" w:pos="720"/>
+        </w:tabs>
+        <w:ind w:left="720" w:hanging="360"/>
+      </w:pPr>
+      <w:rPr>
+        <w:rFonts w:ascii="Symbol" w:hAnsi="Symbol" w:hint="default"/>
+        <w:sz w:val="20"/>
+      </w:rPr>
+    </w:lvl>
+    <w:lvl w:ilvl="1" w:tentative="1">
+      <w:start w:val="1"/>
+      <w:numFmt w:val="bullet"/>
+      <w:lvlText w:val="o"/>
+      <w:lvlJc w:val="left"/>
+      <w:pPr>
+        <w:tabs>
+          <w:tab w:val="num" w:pos="1440"/>
+        </w:tabs>
+        <w:ind w:left="1440" w:hanging="360"/>
+      </w:pPr>
+      <w:rPr>
+        <w:rFonts w:ascii="Courier New" w:hAnsi="Courier New" w:hint="default"/>
+        <w:sz w:val="20"/>
+      </w:rPr>
+    </w:lvl>
+    <w:lvl w:ilvl="2" w:tentative="1">
+      <w:start w:val="1"/>
+      <w:numFmt w:val="bullet"/>
+      <w:lvlText w:val=""/>
+      <w:lvlJc w:val="left"/>
+      <w:pPr>
+        <w:tabs>
+          <w:tab w:val="num" w:pos="2160"/>
+        </w:tabs>
+        <w:ind w:left="2160" w:hanging="360"/>
+      </w:pPr>
+      <w:rPr>
+        <w:rFonts w:ascii="Wingdings" w:hAnsi="Wingdings" w:hint="default"/>
+        <w:sz w:val="20"/>
+      </w:rPr>
+    </w:lvl>
+    <w:lvl w:ilvl="3" w:tentative="1">
+      <w:start w:val="1"/>
+      <w:numFmt w:val="bullet"/>
+      <w:lvlText w:val=""/>
+      <w:lvlJc w:val="left"/>
+      <w:pPr>
+        <w:tabs>
+          <w:tab w:val="num" w:pos="2880"/>
+        </w:tabs>
+        <w:ind w:left="2880" w:hanging="360"/>
+      </w:pPr>
+      <w:rPr>
+        <w:rFonts w:ascii="Wingdings" w:hAnsi="Wingdings" w:hint="default"/>
+        <w:sz w:val="20"/>
+      </w:rPr>
+    </w:lvl>
+    <w:lvl w:ilvl="4" w:tentative="1">
+      <w:start w:val="1"/>
+      <w:numFmt w:val="bullet"/>
+      <w:lvlText w:val=""/>
+      <w:lvlJc w:val="left"/>
+      <w:pPr>
+        <w:tabs>
+          <w:tab w:val="num" w:pos="3600"/>
+        </w:tabs>
+        <w:ind w:left="3600" w:hanging="360"/>
+      </w:pPr>
+      <w:rPr>
+        <w:rFonts w:ascii="Wingdings" w:hAnsi="Wingdings" w:hint="default"/>
+        <w:sz w:val="20"/>
+      </w:rPr>
+    </w:lvl>
+    <w:lvl w:ilvl="5" w:tentative="1">
+      <w:start w:val="1"/>
+      <w:numFmt w:val="bullet"/>
+      <w:lvlText w:val=""/>
+      <w:lvlJc w:val="left"/>
+      <w:pPr>
+        <w:tabs>
+          <w:tab w:val="num" w:pos="4320"/>
+        </w:tabs>
+        <w:ind w:left="4320" w:hanging="360"/>
+      </w:pPr>
+      <w:rPr>
+        <w:rFonts w:ascii="Wingdings" w:hAnsi="Wingdings" w:hint="default"/>
+        <w:sz w:val="20"/>
+      </w:rPr>
+    </w:lvl>
+    <w:lvl w:ilvl="6" w:tentative="1">
+      <w:start w:val="1"/>
+      <w:numFmt w:val="bullet"/>
+      <w:lvlText w:val=""/>
+      <w:lvlJc w:val="left"/>
+      <w:pPr>
+        <w:tabs>
+          <w:tab w:val="num" w:pos="5040"/>
+        </w:tabs>
+        <w:ind w:left="5040" w:hanging="360"/>
+      </w:pPr>
+      <w:rPr>
+        <w:rFonts w:ascii="Wingdings" w:hAnsi="Wingdings" w:hint="default"/>
+        <w:sz w:val="20"/>
+      </w:rPr>
+    </w:lvl>
+    <w:lvl w:ilvl="7" w:tentative="1">
+      <w:start w:val="1"/>
+      <w:numFmt w:val="bullet"/>
+      <w:lvlText w:val=""/>
+      <w:lvlJc w:val="left"/>
+      <w:pPr>
+        <w:tabs>
+          <w:tab w:val="num" w:pos="5760"/>
+        </w:tabs>
+        <w:ind w:left="5760" w:hanging="360"/>
+      </w:pPr>
+      <w:rPr>
+        <w:rFonts w:ascii="Wingdings" w:hAnsi="Wingdings" w:hint="default"/>
+        <w:sz w:val="20"/>
+      </w:rPr>
+    </w:lvl>
+    <w:lvl w:ilvl="8" w:tentative="1">
+      <w:start w:val="1"/>
+      <w:numFmt w:val="bullet"/>
+      <w:lvlText w:val=""/>
+      <w:lvlJc w:val="left"/>
+      <w:pPr>
+        <w:tabs>
+          <w:tab w:val="num" w:pos="6480"/>
+        </w:tabs>
+        <w:ind w:left="6480" w:hanging="360"/>
+      </w:pPr>
+      <w:rPr>
+        <w:rFonts w:ascii="Wingdings" w:hAnsi="Wingdings" w:hint="default"/>
+        <w:sz w:val="20"/>
+      </w:rPr>
+    </w:lvl>
+  </w:abstractNum>
+  <w:abstractNum w:abstractNumId="4" w15:restartNumberingAfterBreak="0">
+    <w:nsid w:val="1C674B25"/>
+    <w:multiLevelType w:val="multilevel"/>
+    <w:tmpl w:val="2CB0DC94"/>
+    <w:lvl w:ilvl="0">
+      <w:start w:val="1"/>
+      <w:numFmt w:val="bullet"/>
+      <w:lvlText w:val=""/>
+      <w:lvlJc w:val="left"/>
+      <w:pPr>
+        <w:tabs>
+          <w:tab w:val="num" w:pos="720"/>
+        </w:tabs>
+        <w:ind w:left="720" w:hanging="360"/>
+      </w:pPr>
+      <w:rPr>
+        <w:rFonts w:ascii="Symbol" w:hAnsi="Symbol" w:hint="default"/>
+        <w:sz w:val="20"/>
+      </w:rPr>
+    </w:lvl>
+    <w:lvl w:ilvl="1" w:tentative="1">
+      <w:start w:val="1"/>
+      <w:numFmt w:val="bullet"/>
+      <w:lvlText w:val="o"/>
+      <w:lvlJc w:val="left"/>
+      <w:pPr>
+        <w:tabs>
+          <w:tab w:val="num" w:pos="1440"/>
+        </w:tabs>
+        <w:ind w:left="1440" w:hanging="360"/>
+      </w:pPr>
+      <w:rPr>
+        <w:rFonts w:ascii="Courier New" w:hAnsi="Courier New" w:hint="default"/>
+        <w:sz w:val="20"/>
+      </w:rPr>
+    </w:lvl>
+    <w:lvl w:ilvl="2" w:tentative="1">
+      <w:start w:val="1"/>
+      <w:numFmt w:val="bullet"/>
+      <w:lvlText w:val=""/>
+      <w:lvlJc w:val="left"/>
+      <w:pPr>
+        <w:tabs>
+          <w:tab w:val="num" w:pos="2160"/>
+        </w:tabs>
+        <w:ind w:left="2160" w:hanging="360"/>
+      </w:pPr>
+      <w:rPr>
+        <w:rFonts w:ascii="Wingdings" w:hAnsi="Wingdings" w:hint="default"/>
+        <w:sz w:val="20"/>
+      </w:rPr>
+    </w:lvl>
+    <w:lvl w:ilvl="3" w:tentative="1">
+      <w:start w:val="1"/>
+      <w:numFmt w:val="bullet"/>
+      <w:lvlText w:val=""/>
+      <w:lvlJc w:val="left"/>
+      <w:pPr>
+        <w:tabs>
+          <w:tab w:val="num" w:pos="2880"/>
+        </w:tabs>
+        <w:ind w:left="2880" w:hanging="360"/>
+      </w:pPr>
+      <w:rPr>
+        <w:rFonts w:ascii="Wingdings" w:hAnsi="Wingdings" w:hint="default"/>
+        <w:sz w:val="20"/>
+      </w:rPr>
+    </w:lvl>
+    <w:lvl w:ilvl="4" w:tentative="1">
+      <w:start w:val="1"/>
+      <w:numFmt w:val="bullet"/>
+      <w:lvlText w:val=""/>
+      <w:lvlJc w:val="left"/>
+      <w:pPr>
+        <w:tabs>
+          <w:tab w:val="num" w:pos="3600"/>
+        </w:tabs>
+        <w:ind w:left="3600" w:hanging="360"/>
+      </w:pPr>
+      <w:rPr>
+        <w:rFonts w:ascii="Wingdings" w:hAnsi="Wingdings" w:hint="default"/>
+        <w:sz w:val="20"/>
+      </w:rPr>
+    </w:lvl>
+    <w:lvl w:ilvl="5" w:tentative="1">
+      <w:start w:val="1"/>
+      <w:numFmt w:val="bullet"/>
+      <w:lvlText w:val=""/>
+      <w:lvlJc w:val="left"/>
+      <w:pPr>
+        <w:tabs>
+          <w:tab w:val="num" w:pos="4320"/>
+        </w:tabs>
+        <w:ind w:left="4320" w:hanging="360"/>
+      </w:pPr>
+      <w:rPr>
+        <w:rFonts w:ascii="Wingdings" w:hAnsi="Wingdings" w:hint="default"/>
+        <w:sz w:val="20"/>
+      </w:rPr>
+    </w:lvl>
+    <w:lvl w:ilvl="6" w:tentative="1">
+      <w:start w:val="1"/>
+      <w:numFmt w:val="bullet"/>
+      <w:lvlText w:val=""/>
+      <w:lvlJc w:val="left"/>
+      <w:pPr>
+        <w:tabs>
+          <w:tab w:val="num" w:pos="5040"/>
+        </w:tabs>
+        <w:ind w:left="5040" w:hanging="360"/>
+      </w:pPr>
+      <w:rPr>
+        <w:rFonts w:ascii="Wingdings" w:hAnsi="Wingdings" w:hint="default"/>
+        <w:sz w:val="20"/>
+      </w:rPr>
+    </w:lvl>
+    <w:lvl w:ilvl="7" w:tentative="1">
+      <w:start w:val="1"/>
+      <w:numFmt w:val="bullet"/>
+      <w:lvlText w:val=""/>
+      <w:lvlJc w:val="left"/>
+      <w:pPr>
+        <w:tabs>
+          <w:tab w:val="num" w:pos="5760"/>
+        </w:tabs>
+        <w:ind w:left="5760" w:hanging="360"/>
+      </w:pPr>
+      <w:rPr>
+        <w:rFonts w:ascii="Wingdings" w:hAnsi="Wingdings" w:hint="default"/>
+        <w:sz w:val="20"/>
+      </w:rPr>
+    </w:lvl>
+    <w:lvl w:ilvl="8" w:tentative="1">
+      <w:start w:val="1"/>
+      <w:numFmt w:val="bullet"/>
+      <w:lvlText w:val=""/>
+      <w:lvlJc w:val="left"/>
+      <w:pPr>
+        <w:tabs>
+          <w:tab w:val="num" w:pos="6480"/>
+        </w:tabs>
+        <w:ind w:left="6480" w:hanging="360"/>
+      </w:pPr>
+      <w:rPr>
+        <w:rFonts w:ascii="Wingdings" w:hAnsi="Wingdings" w:hint="default"/>
+        <w:sz w:val="20"/>
+      </w:rPr>
+    </w:lvl>
+  </w:abstractNum>
+  <w:abstractNum w:abstractNumId="5" w15:restartNumberingAfterBreak="0">
+    <w:nsid w:val="1F732CB0"/>
+    <w:multiLevelType w:val="multilevel"/>
+    <w:tmpl w:val="3912DC66"/>
+    <w:lvl w:ilvl="0">
+      <w:start w:val="1"/>
+      <w:numFmt w:val="bullet"/>
+      <w:lvlText w:val=""/>
+      <w:lvlJc w:val="left"/>
+      <w:pPr>
+        <w:tabs>
+          <w:tab w:val="num" w:pos="720"/>
+        </w:tabs>
+        <w:ind w:left="720" w:hanging="360"/>
+      </w:pPr>
+      <w:rPr>
+        <w:rFonts w:ascii="Symbol" w:hAnsi="Symbol" w:hint="default"/>
+        <w:sz w:val="20"/>
+      </w:rPr>
+    </w:lvl>
+    <w:lvl w:ilvl="1" w:tentative="1">
+      <w:start w:val="1"/>
+      <w:numFmt w:val="bullet"/>
+      <w:lvlText w:val="o"/>
+      <w:lvlJc w:val="left"/>
+      <w:pPr>
+        <w:tabs>
+          <w:tab w:val="num" w:pos="1440"/>
+        </w:tabs>
+        <w:ind w:left="1440" w:hanging="360"/>
+      </w:pPr>
+      <w:rPr>
+        <w:rFonts w:ascii="Courier New" w:hAnsi="Courier New" w:hint="default"/>
+        <w:sz w:val="20"/>
+      </w:rPr>
+    </w:lvl>
+    <w:lvl w:ilvl="2" w:tentative="1">
+      <w:start w:val="1"/>
+      <w:numFmt w:val="bullet"/>
+      <w:lvlText w:val=""/>
+      <w:lvlJc w:val="left"/>
+      <w:pPr>
+        <w:tabs>
+          <w:tab w:val="num" w:pos="2160"/>
+        </w:tabs>
+        <w:ind w:left="2160" w:hanging="360"/>
+      </w:pPr>
+      <w:rPr>
+        <w:rFonts w:ascii="Wingdings" w:hAnsi="Wingdings" w:hint="default"/>
+        <w:sz w:val="20"/>
+      </w:rPr>
+    </w:lvl>
+    <w:lvl w:ilvl="3" w:tentative="1">
+      <w:start w:val="1"/>
+      <w:numFmt w:val="bullet"/>
+      <w:lvlText w:val=""/>
+      <w:lvlJc w:val="left"/>
+      <w:pPr>
+        <w:tabs>
+          <w:tab w:val="num" w:pos="2880"/>
+        </w:tabs>
+        <w:ind w:left="2880" w:hanging="360"/>
+      </w:pPr>
+      <w:rPr>
+        <w:rFonts w:ascii="Wingdings" w:hAnsi="Wingdings" w:hint="default"/>
+        <w:sz w:val="20"/>
+      </w:rPr>
+    </w:lvl>
+    <w:lvl w:ilvl="4" w:tentative="1">
+      <w:start w:val="1"/>
+      <w:numFmt w:val="bullet"/>
+      <w:lvlText w:val=""/>
+      <w:lvlJc w:val="left"/>
+      <w:pPr>
+        <w:tabs>
+          <w:tab w:val="num" w:pos="3600"/>
+        </w:tabs>
+        <w:ind w:left="3600" w:hanging="360"/>
+      </w:pPr>
+      <w:rPr>
+        <w:rFonts w:ascii="Wingdings" w:hAnsi="Wingdings" w:hint="default"/>
+        <w:sz w:val="20"/>
+      </w:rPr>
+    </w:lvl>
+    <w:lvl w:ilvl="5" w:tentative="1">
+      <w:start w:val="1"/>
+      <w:numFmt w:val="bullet"/>
+      <w:lvlText w:val=""/>
+      <w:lvlJc w:val="left"/>
+      <w:pPr>
+        <w:tabs>
+          <w:tab w:val="num" w:pos="4320"/>
+        </w:tabs>
+        <w:ind w:left="4320" w:hanging="360"/>
+      </w:pPr>
+      <w:rPr>
+        <w:rFonts w:ascii="Wingdings" w:hAnsi="Wingdings" w:hint="default"/>
+        <w:sz w:val="20"/>
+      </w:rPr>
+    </w:lvl>
+    <w:lvl w:ilvl="6" w:tentative="1">
+      <w:start w:val="1"/>
+      <w:numFmt w:val="bullet"/>
+      <w:lvlText w:val=""/>
+      <w:lvlJc w:val="left"/>
+      <w:pPr>
+        <w:tabs>
+          <w:tab w:val="num" w:pos="5040"/>
+        </w:tabs>
+        <w:ind w:left="5040" w:hanging="360"/>
+      </w:pPr>
+      <w:rPr>
+        <w:rFonts w:ascii="Wingdings" w:hAnsi="Wingdings" w:hint="default"/>
+        <w:sz w:val="20"/>
+      </w:rPr>
+    </w:lvl>
+    <w:lvl w:ilvl="7" w:tentative="1">
+      <w:start w:val="1"/>
+      <w:numFmt w:val="bullet"/>
+      <w:lvlText w:val=""/>
+      <w:lvlJc w:val="left"/>
+      <w:pPr>
+        <w:tabs>
+          <w:tab w:val="num" w:pos="5760"/>
+        </w:tabs>
+        <w:ind w:left="5760" w:hanging="360"/>
+      </w:pPr>
+      <w:rPr>
+        <w:rFonts w:ascii="Wingdings" w:hAnsi="Wingdings" w:hint="default"/>
+        <w:sz w:val="20"/>
+      </w:rPr>
+    </w:lvl>
+    <w:lvl w:ilvl="8" w:tentative="1">
+      <w:start w:val="1"/>
+      <w:numFmt w:val="bullet"/>
+      <w:lvlText w:val=""/>
+      <w:lvlJc w:val="left"/>
+      <w:pPr>
+        <w:tabs>
+          <w:tab w:val="num" w:pos="6480"/>
+        </w:tabs>
+        <w:ind w:left="6480" w:hanging="360"/>
+      </w:pPr>
+      <w:rPr>
+        <w:rFonts w:ascii="Wingdings" w:hAnsi="Wingdings" w:hint="default"/>
+        <w:sz w:val="20"/>
+      </w:rPr>
+    </w:lvl>
+  </w:abstractNum>
+  <w:abstractNum w:abstractNumId="6" w15:restartNumberingAfterBreak="0">
+    <w:nsid w:val="39471413"/>
+    <w:multiLevelType w:val="multilevel"/>
+    <w:tmpl w:val="A86CEC3A"/>
+    <w:lvl w:ilvl="0">
+      <w:start w:val="1"/>
+      <w:numFmt w:val="bullet"/>
+      <w:lvlText w:val=""/>
+      <w:lvlJc w:val="left"/>
+      <w:pPr>
+        <w:tabs>
+          <w:tab w:val="num" w:pos="720"/>
+        </w:tabs>
+        <w:ind w:left="720" w:hanging="360"/>
+      </w:pPr>
+      <w:rPr>
+        <w:rFonts w:ascii="Symbol" w:hAnsi="Symbol" w:hint="default"/>
+        <w:sz w:val="20"/>
+      </w:rPr>
+    </w:lvl>
+    <w:lvl w:ilvl="1">
+      <w:start w:val="1"/>
+      <w:numFmt w:val="bullet"/>
+      <w:lvlText w:val="o"/>
+      <w:lvlJc w:val="left"/>
+      <w:pPr>
+        <w:tabs>
+          <w:tab w:val="num" w:pos="1440"/>
+        </w:tabs>
+        <w:ind w:left="1440" w:hanging="360"/>
+      </w:pPr>
+      <w:rPr>
+        <w:rFonts w:ascii="Courier New" w:hAnsi="Courier New" w:hint="default"/>
+        <w:sz w:val="20"/>
+      </w:rPr>
+    </w:lvl>
+    <w:lvl w:ilvl="2" w:tentative="1">
+      <w:start w:val="1"/>
+      <w:numFmt w:val="bullet"/>
+      <w:lvlText w:val=""/>
+      <w:lvlJc w:val="left"/>
+      <w:pPr>
+        <w:tabs>
+          <w:tab w:val="num" w:pos="2160"/>
+        </w:tabs>
+        <w:ind w:left="2160" w:hanging="360"/>
+      </w:pPr>
+      <w:rPr>
+        <w:rFonts w:ascii="Wingdings" w:hAnsi="Wingdings" w:hint="default"/>
+        <w:sz w:val="20"/>
+      </w:rPr>
+    </w:lvl>
+    <w:lvl w:ilvl="3" w:tentative="1">
+      <w:start w:val="1"/>
+      <w:numFmt w:val="bullet"/>
+      <w:lvlText w:val=""/>
+      <w:lvlJc w:val="left"/>
+      <w:pPr>
+        <w:tabs>
+          <w:tab w:val="num" w:pos="2880"/>
+        </w:tabs>
+        <w:ind w:left="2880" w:hanging="360"/>
+      </w:pPr>
+      <w:rPr>
+        <w:rFonts w:ascii="Wingdings" w:hAnsi="Wingdings" w:hint="default"/>
+        <w:sz w:val="20"/>
+      </w:rPr>
+    </w:lvl>
+    <w:lvl w:ilvl="4" w:tentative="1">
+      <w:start w:val="1"/>
+      <w:numFmt w:val="bullet"/>
+      <w:lvlText w:val=""/>
+      <w:lvlJc w:val="left"/>
+      <w:pPr>
+        <w:tabs>
+          <w:tab w:val="num" w:pos="3600"/>
+        </w:tabs>
+        <w:ind w:left="3600" w:hanging="360"/>
+      </w:pPr>
+      <w:rPr>
+        <w:rFonts w:ascii="Wingdings" w:hAnsi="Wingdings" w:hint="default"/>
+        <w:sz w:val="20"/>
+      </w:rPr>
+    </w:lvl>
+    <w:lvl w:ilvl="5" w:tentative="1">
+      <w:start w:val="1"/>
+      <w:numFmt w:val="bullet"/>
+      <w:lvlText w:val=""/>
+      <w:lvlJc w:val="left"/>
+      <w:pPr>
+        <w:tabs>
+          <w:tab w:val="num" w:pos="4320"/>
+        </w:tabs>
+        <w:ind w:left="4320" w:hanging="360"/>
+      </w:pPr>
+      <w:rPr>
+        <w:rFonts w:ascii="Wingdings" w:hAnsi="Wingdings" w:hint="default"/>
+        <w:sz w:val="20"/>
+      </w:rPr>
+    </w:lvl>
+    <w:lvl w:ilvl="6" w:tentative="1">
+      <w:start w:val="1"/>
+      <w:numFmt w:val="bullet"/>
+      <w:lvlText w:val=""/>
+      <w:lvlJc w:val="left"/>
+      <w:pPr>
+        <w:tabs>
+          <w:tab w:val="num" w:pos="5040"/>
+        </w:tabs>
+        <w:ind w:left="5040" w:hanging="360"/>
+      </w:pPr>
+      <w:rPr>
+        <w:rFonts w:ascii="Wingdings" w:hAnsi="Wingdings" w:hint="default"/>
+        <w:sz w:val="20"/>
+      </w:rPr>
+    </w:lvl>
+    <w:lvl w:ilvl="7" w:tentative="1">
+      <w:start w:val="1"/>
+      <w:numFmt w:val="bullet"/>
+      <w:lvlText w:val=""/>
+      <w:lvlJc w:val="left"/>
+      <w:pPr>
+        <w:tabs>
+          <w:tab w:val="num" w:pos="5760"/>
+        </w:tabs>
+        <w:ind w:left="5760" w:hanging="360"/>
+      </w:pPr>
+      <w:rPr>
+        <w:rFonts w:ascii="Wingdings" w:hAnsi="Wingdings" w:hint="default"/>
+        <w:sz w:val="20"/>
+      </w:rPr>
+    </w:lvl>
+    <w:lvl w:ilvl="8" w:tentative="1">
+      <w:start w:val="1"/>
+      <w:numFmt w:val="bullet"/>
+      <w:lvlText w:val=""/>
+      <w:lvlJc w:val="left"/>
+      <w:pPr>
+        <w:tabs>
+          <w:tab w:val="num" w:pos="6480"/>
+        </w:tabs>
+        <w:ind w:left="6480" w:hanging="360"/>
+      </w:pPr>
+      <w:rPr>
+        <w:rFonts w:ascii="Wingdings" w:hAnsi="Wingdings" w:hint="default"/>
+        <w:sz w:val="20"/>
+      </w:rPr>
+    </w:lvl>
+  </w:abstractNum>
+  <w:abstractNum w:abstractNumId="7" w15:restartNumberingAfterBreak="0">
+    <w:nsid w:val="5B2C7EE6"/>
+    <w:multiLevelType w:val="multilevel"/>
+    <w:tmpl w:val="10088578"/>
+    <w:lvl w:ilvl="0">
+      <w:start w:val="1"/>
+      <w:numFmt w:val="bullet"/>
+      <w:lvlText w:val=""/>
+      <w:lvlJc w:val="left"/>
+      <w:pPr>
+        <w:tabs>
+          <w:tab w:val="num" w:pos="720"/>
+        </w:tabs>
+        <w:ind w:left="720" w:hanging="360"/>
+      </w:pPr>
+      <w:rPr>
+        <w:rFonts w:ascii="Symbol" w:hAnsi="Symbol" w:hint="default"/>
+        <w:sz w:val="20"/>
+      </w:rPr>
+    </w:lvl>
+    <w:lvl w:ilvl="1">
+      <w:start w:val="1"/>
+      <w:numFmt w:val="bullet"/>
+      <w:lvlText w:val="o"/>
+      <w:lvlJc w:val="left"/>
+      <w:pPr>
+        <w:tabs>
+          <w:tab w:val="num" w:pos="1440"/>
+        </w:tabs>
+        <w:ind w:left="1440" w:hanging="360"/>
+      </w:pPr>
+      <w:rPr>
+        <w:rFonts w:ascii="Courier New" w:hAnsi="Courier New" w:hint="default"/>
+        <w:sz w:val="20"/>
+      </w:rPr>
+    </w:lvl>
+    <w:lvl w:ilvl="2" w:tentative="1">
+      <w:start w:val="1"/>
+      <w:numFmt w:val="bullet"/>
+      <w:lvlText w:val=""/>
+      <w:lvlJc w:val="left"/>
+      <w:pPr>
+        <w:tabs>
+          <w:tab w:val="num" w:pos="2160"/>
+        </w:tabs>
+        <w:ind w:left="2160" w:hanging="360"/>
+      </w:pPr>
+      <w:rPr>
+        <w:rFonts w:ascii="Wingdings" w:hAnsi="Wingdings" w:hint="default"/>
+        <w:sz w:val="20"/>
+      </w:rPr>
+    </w:lvl>
+    <w:lvl w:ilvl="3" w:tentative="1">
+      <w:start w:val="1"/>
+      <w:numFmt w:val="bullet"/>
+      <w:lvlText w:val=""/>
+      <w:lvlJc w:val="left"/>
+      <w:pPr>
+        <w:tabs>
+          <w:tab w:val="num" w:pos="2880"/>
+        </w:tabs>
+        <w:ind w:left="2880" w:hanging="360"/>
+      </w:pPr>
+      <w:rPr>
+        <w:rFonts w:ascii="Wingdings" w:hAnsi="Wingdings" w:hint="default"/>
+        <w:sz w:val="20"/>
+      </w:rPr>
+    </w:lvl>
+    <w:lvl w:ilvl="4" w:tentative="1">
+      <w:start w:val="1"/>
+      <w:numFmt w:val="bullet"/>
+      <w:lvlText w:val=""/>
+      <w:lvlJc w:val="left"/>
+      <w:pPr>
+        <w:tabs>
+          <w:tab w:val="num" w:pos="3600"/>
+        </w:tabs>
+        <w:ind w:left="3600" w:hanging="360"/>
+      </w:pPr>
+      <w:rPr>
+        <w:rFonts w:ascii="Wingdings" w:hAnsi="Wingdings" w:hint="default"/>
+        <w:sz w:val="20"/>
+      </w:rPr>
+    </w:lvl>
+    <w:lvl w:ilvl="5" w:tentative="1">
+      <w:start w:val="1"/>
+      <w:numFmt w:val="bullet"/>
+      <w:lvlText w:val=""/>
+      <w:lvlJc w:val="left"/>
+      <w:pPr>
+        <w:tabs>
+          <w:tab w:val="num" w:pos="4320"/>
+        </w:tabs>
+        <w:ind w:left="4320" w:hanging="360"/>
+      </w:pPr>
+      <w:rPr>
+        <w:rFonts w:ascii="Wingdings" w:hAnsi="Wingdings" w:hint="default"/>
+        <w:sz w:val="20"/>
+      </w:rPr>
+    </w:lvl>
+    <w:lvl w:ilvl="6" w:tentative="1">
+      <w:start w:val="1"/>
+      <w:numFmt w:val="bullet"/>
+      <w:lvlText w:val=""/>
+      <w:lvlJc w:val="left"/>
+      <w:pPr>
+        <w:tabs>
+          <w:tab w:val="num" w:pos="5040"/>
+        </w:tabs>
+        <w:ind w:left="5040" w:hanging="360"/>
+      </w:pPr>
+      <w:rPr>
+        <w:rFonts w:ascii="Wingdings" w:hAnsi="Wingdings" w:hint="default"/>
+        <w:sz w:val="20"/>
+      </w:rPr>
+    </w:lvl>
+    <w:lvl w:ilvl="7" w:tentative="1">
+      <w:start w:val="1"/>
+      <w:numFmt w:val="bullet"/>
+      <w:lvlText w:val=""/>
+      <w:lvlJc w:val="left"/>
+      <w:pPr>
+        <w:tabs>
+          <w:tab w:val="num" w:pos="5760"/>
+        </w:tabs>
+        <w:ind w:left="5760" w:hanging="360"/>
+      </w:pPr>
+      <w:rPr>
+        <w:rFonts w:ascii="Wingdings" w:hAnsi="Wingdings" w:hint="default"/>
+        <w:sz w:val="20"/>
+      </w:rPr>
+    </w:lvl>
+    <w:lvl w:ilvl="8" w:tentative="1">
+      <w:start w:val="1"/>
+      <w:numFmt w:val="bullet"/>
+      <w:lvlText w:val=""/>
+      <w:lvlJc w:val="left"/>
+      <w:pPr>
+        <w:tabs>
+          <w:tab w:val="num" w:pos="6480"/>
+        </w:tabs>
+        <w:ind w:left="6480" w:hanging="360"/>
+      </w:pPr>
+      <w:rPr>
+        <w:rFonts w:ascii="Wingdings" w:hAnsi="Wingdings" w:hint="default"/>
+        <w:sz w:val="20"/>
+      </w:rPr>
+    </w:lvl>
+  </w:abstractNum>
+  <w:abstractNum w:abstractNumId="8" w15:restartNumberingAfterBreak="0">
+    <w:nsid w:val="638F2D9B"/>
+    <w:multiLevelType w:val="multilevel"/>
+    <w:tmpl w:val="AC56D4BE"/>
+    <w:lvl w:ilvl="0">
+      <w:start w:val="1"/>
+      <w:numFmt w:val="bullet"/>
+      <w:lvlText w:val=""/>
+      <w:lvlJc w:val="left"/>
+      <w:pPr>
+        <w:tabs>
+          <w:tab w:val="num" w:pos="720"/>
+        </w:tabs>
+        <w:ind w:left="720" w:hanging="360"/>
+      </w:pPr>
+      <w:rPr>
+        <w:rFonts w:ascii="Symbol" w:hAnsi="Symbol" w:hint="default"/>
+        <w:sz w:val="20"/>
+      </w:rPr>
+    </w:lvl>
+    <w:lvl w:ilvl="1" w:tentative="1">
+      <w:start w:val="1"/>
+      <w:numFmt w:val="bullet"/>
+      <w:lvlText w:val="o"/>
+      <w:lvlJc w:val="left"/>
+      <w:pPr>
+        <w:tabs>
+          <w:tab w:val="num" w:pos="1440"/>
+        </w:tabs>
+        <w:ind w:left="1440" w:hanging="360"/>
+      </w:pPr>
+      <w:rPr>
+        <w:rFonts w:ascii="Courier New" w:hAnsi="Courier New" w:hint="default"/>
+        <w:sz w:val="20"/>
+      </w:rPr>
+    </w:lvl>
+    <w:lvl w:ilvl="2" w:tentative="1">
+      <w:start w:val="1"/>
+      <w:numFmt w:val="bullet"/>
+      <w:lvlText w:val=""/>
+      <w:lvlJc w:val="left"/>
+      <w:pPr>
+        <w:tabs>
+          <w:tab w:val="num" w:pos="2160"/>
+        </w:tabs>
+        <w:ind w:left="2160" w:hanging="360"/>
+      </w:pPr>
+      <w:rPr>
+        <w:rFonts w:ascii="Wingdings" w:hAnsi="Wingdings" w:hint="default"/>
+        <w:sz w:val="20"/>
+      </w:rPr>
+    </w:lvl>
+    <w:lvl w:ilvl="3" w:tentative="1">
+      <w:start w:val="1"/>
+      <w:numFmt w:val="bullet"/>
+      <w:lvlText w:val=""/>
+      <w:lvlJc w:val="left"/>
+      <w:pPr>
+        <w:tabs>
+          <w:tab w:val="num" w:pos="2880"/>
+        </w:tabs>
+        <w:ind w:left="2880" w:hanging="360"/>
+      </w:pPr>
+      <w:rPr>
+        <w:rFonts w:ascii="Wingdings" w:hAnsi="Wingdings" w:hint="default"/>
+        <w:sz w:val="20"/>
+      </w:rPr>
+    </w:lvl>
+    <w:lvl w:ilvl="4" w:tentative="1">
+      <w:start w:val="1"/>
+      <w:numFmt w:val="bullet"/>
+      <w:lvlText w:val=""/>
+      <w:lvlJc w:val="left"/>
+      <w:pPr>
+        <w:tabs>
+          <w:tab w:val="num" w:pos="3600"/>
+        </w:tabs>
+        <w:ind w:left="3600" w:hanging="360"/>
+      </w:pPr>
+      <w:rPr>
+        <w:rFonts w:ascii="Wingdings" w:hAnsi="Wingdings" w:hint="default"/>
+        <w:sz w:val="20"/>
+      </w:rPr>
+    </w:lvl>
+    <w:lvl w:ilvl="5" w:tentative="1">
+      <w:start w:val="1"/>
+      <w:numFmt w:val="bullet"/>
+      <w:lvlText w:val=""/>
+      <w:lvlJc w:val="left"/>
+      <w:pPr>
+        <w:tabs>
+          <w:tab w:val="num" w:pos="4320"/>
+        </w:tabs>
+        <w:ind w:left="4320" w:hanging="360"/>
+      </w:pPr>
+      <w:rPr>
+        <w:rFonts w:ascii="Wingdings" w:hAnsi="Wingdings" w:hint="default"/>
+        <w:sz w:val="20"/>
+      </w:rPr>
+    </w:lvl>
+    <w:lvl w:ilvl="6" w:tentative="1">
+      <w:start w:val="1"/>
+      <w:numFmt w:val="bullet"/>
+      <w:lvlText w:val=""/>
+      <w:lvlJc w:val="left"/>
+      <w:pPr>
+        <w:tabs>
+          <w:tab w:val="num" w:pos="5040"/>
+        </w:tabs>
+        <w:ind w:left="5040" w:hanging="360"/>
+      </w:pPr>
+      <w:rPr>
+        <w:rFonts w:ascii="Wingdings" w:hAnsi="Wingdings" w:hint="default"/>
+        <w:sz w:val="20"/>
+      </w:rPr>
+    </w:lvl>
+    <w:lvl w:ilvl="7" w:tentative="1">
+      <w:start w:val="1"/>
+      <w:numFmt w:val="bullet"/>
+      <w:lvlText w:val=""/>
+      <w:lvlJc w:val="left"/>
+      <w:pPr>
+        <w:tabs>
+          <w:tab w:val="num" w:pos="5760"/>
+        </w:tabs>
+        <w:ind w:left="5760" w:hanging="360"/>
+      </w:pPr>
+      <w:rPr>
+        <w:rFonts w:ascii="Wingdings" w:hAnsi="Wingdings" w:hint="default"/>
+        <w:sz w:val="20"/>
+      </w:rPr>
+    </w:lvl>
+    <w:lvl w:ilvl="8" w:tentative="1">
+      <w:start w:val="1"/>
+      <w:numFmt w:val="bullet"/>
+      <w:lvlText w:val=""/>
+      <w:lvlJc w:val="left"/>
+      <w:pPr>
+        <w:tabs>
+          <w:tab w:val="num" w:pos="6480"/>
+        </w:tabs>
+        <w:ind w:left="6480" w:hanging="360"/>
+      </w:pPr>
+      <w:rPr>
+        <w:rFonts w:ascii="Wingdings" w:hAnsi="Wingdings" w:hint="default"/>
+        <w:sz w:val="20"/>
+      </w:rPr>
+    </w:lvl>
+  </w:abstractNum>
+  <w:abstractNum w:abstractNumId="9" w15:restartNumberingAfterBreak="0">
+    <w:nsid w:val="707872F4"/>
+    <w:multiLevelType w:val="multilevel"/>
+    <w:tmpl w:val="8EE6B966"/>
+    <w:lvl w:ilvl="0">
+      <w:start w:val="1"/>
+      <w:numFmt w:val="bullet"/>
+      <w:lvlText w:val=""/>
+      <w:lvlJc w:val="left"/>
+      <w:pPr>
+        <w:tabs>
+          <w:tab w:val="num" w:pos="720"/>
+        </w:tabs>
+        <w:ind w:left="720" w:hanging="360"/>
+      </w:pPr>
+      <w:rPr>
+        <w:rFonts w:ascii="Symbol" w:hAnsi="Symbol" w:hint="default"/>
+        <w:sz w:val="20"/>
+      </w:rPr>
+    </w:lvl>
+    <w:lvl w:ilvl="1">
+      <w:start w:val="1"/>
+      <w:numFmt w:val="bullet"/>
+      <w:lvlText w:val="o"/>
+      <w:lvlJc w:val="left"/>
+      <w:pPr>
+        <w:tabs>
+          <w:tab w:val="num" w:pos="1440"/>
+        </w:tabs>
+        <w:ind w:left="1440" w:hanging="360"/>
+      </w:pPr>
+      <w:rPr>
+        <w:rFonts w:ascii="Courier New" w:hAnsi="Courier New" w:hint="default"/>
+        <w:sz w:val="20"/>
+      </w:rPr>
+    </w:lvl>
+    <w:lvl w:ilvl="2" w:tentative="1">
+      <w:start w:val="1"/>
+      <w:numFmt w:val="bullet"/>
+      <w:lvlText w:val=""/>
+      <w:lvlJc w:val="left"/>
+      <w:pPr>
+        <w:tabs>
+          <w:tab w:val="num" w:pos="2160"/>
+        </w:tabs>
+        <w:ind w:left="2160" w:hanging="360"/>
+      </w:pPr>
+      <w:rPr>
+        <w:rFonts w:ascii="Wingdings" w:hAnsi="Wingdings" w:hint="default"/>
+        <w:sz w:val="20"/>
+      </w:rPr>
+    </w:lvl>
+    <w:lvl w:ilvl="3" w:tentative="1">
+      <w:start w:val="1"/>
+      <w:numFmt w:val="bullet"/>
+      <w:lvlText w:val=""/>
+      <w:lvlJc w:val="left"/>
+      <w:pPr>
+        <w:tabs>
+          <w:tab w:val="num" w:pos="2880"/>
+        </w:tabs>
+        <w:ind w:left="2880" w:hanging="360"/>
+      </w:pPr>
+      <w:rPr>
+        <w:rFonts w:ascii="Wingdings" w:hAnsi="Wingdings" w:hint="default"/>
+        <w:sz w:val="20"/>
+      </w:rPr>
+    </w:lvl>
+    <w:lvl w:ilvl="4" w:tentative="1">
+      <w:start w:val="1"/>
+      <w:numFmt w:val="bullet"/>
+      <w:lvlText w:val=""/>
+      <w:lvlJc w:val="left"/>
+      <w:pPr>
+        <w:tabs>
+          <w:tab w:val="num" w:pos="3600"/>
+        </w:tabs>
+        <w:ind w:left="3600" w:hanging="360"/>
+      </w:pPr>
+      <w:rPr>
+        <w:rFonts w:ascii="Wingdings" w:hAnsi="Wingdings" w:hint="default"/>
+        <w:sz w:val="20"/>
+      </w:rPr>
+    </w:lvl>
+    <w:lvl w:ilvl="5" w:tentative="1">
+      <w:start w:val="1"/>
+      <w:numFmt w:val="bullet"/>
+      <w:lvlText w:val=""/>
+      <w:lvlJc w:val="left"/>
+      <w:pPr>
+        <w:tabs>
+          <w:tab w:val="num" w:pos="4320"/>
+        </w:tabs>
+        <w:ind w:left="4320" w:hanging="360"/>
+      </w:pPr>
+      <w:rPr>
+        <w:rFonts w:ascii="Wingdings" w:hAnsi="Wingdings" w:hint="default"/>
+        <w:sz w:val="20"/>
+      </w:rPr>
+    </w:lvl>
+    <w:lvl w:ilvl="6" w:tentative="1">
+      <w:start w:val="1"/>
+      <w:numFmt w:val="bullet"/>
+      <w:lvlText w:val=""/>
+      <w:lvlJc w:val="left"/>
+      <w:pPr>
+        <w:tabs>
+          <w:tab w:val="num" w:pos="5040"/>
+        </w:tabs>
+        <w:ind w:left="5040" w:hanging="360"/>
+      </w:pPr>
+      <w:rPr>
+        <w:rFonts w:ascii="Wingdings" w:hAnsi="Wingdings" w:hint="default"/>
+        <w:sz w:val="20"/>
+      </w:rPr>
+    </w:lvl>
+    <w:lvl w:ilvl="7" w:tentative="1">
+      <w:start w:val="1"/>
+      <w:numFmt w:val="bullet"/>
+      <w:lvlText w:val=""/>
+      <w:lvlJc w:val="left"/>
+      <w:pPr>
+        <w:tabs>
+          <w:tab w:val="num" w:pos="5760"/>
+        </w:tabs>
+        <w:ind w:left="5760" w:hanging="360"/>
+      </w:pPr>
+      <w:rPr>
+        <w:rFonts w:ascii="Wingdings" w:hAnsi="Wingdings" w:hint="default"/>
+        <w:sz w:val="20"/>
+      </w:rPr>
+    </w:lvl>
+    <w:lvl w:ilvl="8" w:tentative="1">
+      <w:start w:val="1"/>
+      <w:numFmt w:val="bullet"/>
+      <w:lvlText w:val=""/>
+      <w:lvlJc w:val="left"/>
+      <w:pPr>
+        <w:tabs>
+          <w:tab w:val="num" w:pos="6480"/>
+        </w:tabs>
+        <w:ind w:left="6480" w:hanging="360"/>
+      </w:pPr>
+      <w:rPr>
+        <w:rFonts w:ascii="Wingdings" w:hAnsi="Wingdings" w:hint="default"/>
+        <w:sz w:val="20"/>
+      </w:rPr>
+    </w:lvl>
+  </w:abstractNum>
+  <w:num w:numId="1" w16cid:durableId="1902136865">
+    <w:abstractNumId w:val="5"/>
+  </w:num>
+  <w:num w:numId="2" w16cid:durableId="1129281952">
+    <w:abstractNumId w:val="3"/>
+  </w:num>
+  <w:num w:numId="3" w16cid:durableId="2033649199">
+    <w:abstractNumId w:val="6"/>
+  </w:num>
+  <w:num w:numId="4" w16cid:durableId="159274282">
+    <w:abstractNumId w:val="9"/>
+  </w:num>
+  <w:num w:numId="5" w16cid:durableId="123087347">
+    <w:abstractNumId w:val="8"/>
+  </w:num>
+  <w:num w:numId="6" w16cid:durableId="1644000010">
+    <w:abstractNumId w:val="4"/>
+  </w:num>
+  <w:num w:numId="7" w16cid:durableId="1125388777">
+    <w:abstractNumId w:val="1"/>
+  </w:num>
+  <w:num w:numId="8" w16cid:durableId="1973241687">
+    <w:abstractNumId w:val="7"/>
+  </w:num>
+  <w:num w:numId="9" w16cid:durableId="414326956">
+    <w:abstractNumId w:val="0"/>
+  </w:num>
+  <w:num w:numId="10" w16cid:durableId="1062370602">
+    <w:abstractNumId w:val="2"/>
+  </w:num>
+</w:numbering>
 </file>
 
 <file path=word/styles.xml><?xml version="1.0" encoding="utf-8"?>
@@ -3139,6 +6787,28 @@
     <w:name w:val="Normal"/>
     <w:qFormat/>
   </w:style>
+  <w:style w:type="paragraph" w:styleId="Heading2">
+    <w:name w:val="heading 2"/>
+    <w:basedOn w:val="Normal"/>
+    <w:next w:val="Normal"/>
+    <w:link w:val="Heading2Char"/>
+    <w:uiPriority w:val="9"/>
+    <w:unhideWhenUsed/>
+    <w:qFormat/>
+    <w:rsid w:val="00DD53D5"/>
+    <w:pPr>
+      <w:keepNext/>
+      <w:keepLines/>
+      <w:spacing w:before="40" w:after="0"/>
+      <w:outlineLvl w:val="1"/>
+    </w:pPr>
+    <w:rPr>
+      <w:rFonts w:asciiTheme="majorHAnsi" w:eastAsiaTheme="majorEastAsia" w:hAnsiTheme="majorHAnsi" w:cstheme="majorBidi"/>
+      <w:color w:val="0F4761" w:themeColor="accent1" w:themeShade="BF"/>
+      <w:sz w:val="26"/>
+      <w:szCs w:val="26"/>
+    </w:rPr>
+  </w:style>
   <w:style w:type="character" w:default="1" w:styleId="DefaultParagraphFont">
     <w:name w:val="Default Paragraph Font"/>
     <w:uiPriority w:val="1"/>
@@ -3187,6 +6857,42 @@
         <w:right w:w="160" w:type="dxa"/>
       </w:tblCellMar>
     </w:tblPr>
+  </w:style>
+  <w:style w:type="character" w:styleId="Hyperlink">
+    <w:name w:val="Hyperlink"/>
+    <w:basedOn w:val="DefaultParagraphFont"/>
+    <w:uiPriority w:val="99"/>
+    <w:unhideWhenUsed/>
+    <w:rsid w:val="00E71A2F"/>
+    <w:rPr>
+      <w:color w:val="467886" w:themeColor="hyperlink"/>
+      <w:u w:val="single"/>
+    </w:rPr>
+  </w:style>
+  <w:style w:type="character" w:styleId="UnresolvedMention">
+    <w:name w:val="Unresolved Mention"/>
+    <w:basedOn w:val="DefaultParagraphFont"/>
+    <w:uiPriority w:val="99"/>
+    <w:semiHidden/>
+    <w:unhideWhenUsed/>
+    <w:rsid w:val="00E71A2F"/>
+    <w:rPr>
+      <w:color w:val="605E5C"/>
+      <w:shd w:val="clear" w:color="auto" w:fill="E1DFDD"/>
+    </w:rPr>
+  </w:style>
+  <w:style w:type="character" w:customStyle="1" w:styleId="Heading2Char">
+    <w:name w:val="Heading 2 Char"/>
+    <w:basedOn w:val="DefaultParagraphFont"/>
+    <w:link w:val="Heading2"/>
+    <w:uiPriority w:val="9"/>
+    <w:rsid w:val="00DD53D5"/>
+    <w:rPr>
+      <w:rFonts w:asciiTheme="majorHAnsi" w:eastAsiaTheme="majorEastAsia" w:hAnsiTheme="majorHAnsi" w:cstheme="majorBidi"/>
+      <w:color w:val="0F4761" w:themeColor="accent1" w:themeShade="BF"/>
+      <w:sz w:val="26"/>
+      <w:szCs w:val="26"/>
+    </w:rPr>
   </w:style>
 </w:styles>
 </file>

</xml_diff>

<commit_message>
Testing complete reservation branch
</commit_message>
<xml_diff>
--- a/Docs/reservation-test-report.docx
+++ b/Docs/reservation-test-report.docx
@@ -180,9 +180,9 @@
       </w:tblPr>
       <w:tblGrid>
         <w:gridCol w:w="622"/>
-        <w:gridCol w:w="1293"/>
-        <w:gridCol w:w="1922"/>
-        <w:gridCol w:w="2500"/>
+        <w:gridCol w:w="1409"/>
+        <w:gridCol w:w="2250"/>
+        <w:gridCol w:w="2056"/>
         <w:gridCol w:w="3725"/>
       </w:tblGrid>
       <w:tr>
@@ -501,6 +501,7 @@
             <w:r>
               <w:rPr>
                 <w:rFonts w:ascii="source sans 3" w:eastAsia="source sans 3" w:hAnsi="source sans 3" w:cs="source sans 3"/>
+                <w:noProof/>
                 <w:color w:val="000000"/>
                 <w:sz w:val="17"/>
               </w:rPr>
@@ -520,7 +521,7 @@
                           <pic:cNvPicPr/>
                         </pic:nvPicPr>
                         <pic:blipFill>
-                          <a:blip r:embed="rId5"/>
+                          <a:blip r:embed="rId6"/>
                           <a:stretch>
                             <a:fillRect/>
                           </a:stretch>
@@ -731,6 +732,7 @@
             <w:r>
               <w:rPr>
                 <w:rFonts w:ascii="source sans 3" w:eastAsia="source sans 3" w:hAnsi="source sans 3" w:cs="source sans 3"/>
+                <w:noProof/>
                 <w:color w:val="000000"/>
                 <w:sz w:val="17"/>
               </w:rPr>
@@ -750,7 +752,7 @@
                           <pic:cNvPicPr/>
                         </pic:nvPicPr>
                         <pic:blipFill>
-                          <a:blip r:embed="rId6"/>
+                          <a:blip r:embed="rId7"/>
                           <a:stretch>
                             <a:fillRect/>
                           </a:stretch>
@@ -776,15 +778,7 @@
                 <w:color w:val="000000"/>
                 <w:sz w:val="17"/>
               </w:rPr>
-              <w:t xml:space="preserve"> </w:t>
-            </w:r>
-            <w:r>
-              <w:rPr>
-                <w:rFonts w:ascii="source sans 3" w:eastAsia="source sans 3" w:hAnsi="source sans 3" w:cs="source sans 3"/>
-                <w:color w:val="000000"/>
-                <w:sz w:val="17"/>
-              </w:rPr>
-              <w:t>Pass</w:t>
+              <w:t xml:space="preserve"> Pass</w:t>
             </w:r>
           </w:p>
         </w:tc>
@@ -941,6 +935,7 @@
             <w:r>
               <w:rPr>
                 <w:rFonts w:ascii="source sans 3" w:eastAsia="source sans 3" w:hAnsi="source sans 3" w:cs="source sans 3"/>
+                <w:noProof/>
                 <w:color w:val="000000"/>
                 <w:sz w:val="17"/>
               </w:rPr>
@@ -960,7 +955,7 @@
                           <pic:cNvPicPr/>
                         </pic:nvPicPr>
                         <pic:blipFill>
-                          <a:blip r:embed="rId7"/>
+                          <a:blip r:embed="rId8"/>
                           <a:stretch>
                             <a:fillRect/>
                           </a:stretch>
@@ -1118,6 +1113,7 @@
             <w:r>
               <w:rPr>
                 <w:rFonts w:ascii="source sans 3" w:eastAsia="source sans 3" w:hAnsi="source sans 3" w:cs="source sans 3"/>
+                <w:noProof/>
                 <w:color w:val="000000"/>
                 <w:sz w:val="17"/>
               </w:rPr>
@@ -1137,7 +1133,7 @@
                           <pic:cNvPicPr/>
                         </pic:nvPicPr>
                         <pic:blipFill>
-                          <a:blip r:embed="rId8"/>
+                          <a:blip r:embed="rId9"/>
                           <a:stretch>
                             <a:fillRect/>
                           </a:stretch>
@@ -1304,6 +1300,7 @@
             <w:r>
               <w:rPr>
                 <w:rFonts w:ascii="source sans 3" w:eastAsia="source sans 3" w:hAnsi="source sans 3" w:cs="source sans 3"/>
+                <w:noProof/>
                 <w:color w:val="000000"/>
                 <w:sz w:val="17"/>
               </w:rPr>
@@ -1323,7 +1320,7 @@
                           <pic:cNvPicPr/>
                         </pic:nvPicPr>
                         <pic:blipFill>
-                          <a:blip r:embed="rId9"/>
+                          <a:blip r:embed="rId10"/>
                           <a:stretch>
                             <a:fillRect/>
                           </a:stretch>
@@ -1536,6 +1533,7 @@
             <w:r>
               <w:rPr>
                 <w:rFonts w:ascii="source sans 3" w:eastAsia="source sans 3" w:hAnsi="source sans 3" w:cs="source sans 3"/>
+                <w:noProof/>
                 <w:color w:val="EE0000"/>
                 <w:sz w:val="17"/>
               </w:rPr>
@@ -1555,7 +1553,7 @@
                           <pic:cNvPicPr/>
                         </pic:nvPicPr>
                         <pic:blipFill>
-                          <a:blip r:embed="rId10"/>
+                          <a:blip r:embed="rId11"/>
                           <a:stretch>
                             <a:fillRect/>
                           </a:stretch>
@@ -1834,6 +1832,7 @@
             <w:r>
               <w:rPr>
                 <w:rFonts w:ascii="source sans 3" w:eastAsia="source sans 3" w:hAnsi="source sans 3" w:cs="source sans 3"/>
+                <w:noProof/>
                 <w:color w:val="000000"/>
                 <w:sz w:val="17"/>
               </w:rPr>
@@ -1853,7 +1852,7 @@
                           <pic:cNvPicPr/>
                         </pic:nvPicPr>
                         <pic:blipFill>
-                          <a:blip r:embed="rId11"/>
+                          <a:blip r:embed="rId12"/>
                           <a:stretch>
                             <a:fillRect/>
                           </a:stretch>
@@ -2033,43 +2032,7 @@
                 <w:color w:val="000000"/>
                 <w:sz w:val="17"/>
               </w:rPr>
-              <w:t xml:space="preserve">, and the dashboard </w:t>
-            </w:r>
-            <w:proofErr w:type="gramStart"/>
-            <w:r>
-              <w:rPr>
-                <w:rFonts w:ascii="source sans 3" w:eastAsia="source sans 3" w:hAnsi="source sans 3" w:cs="source sans 3"/>
-                <w:color w:val="000000"/>
-                <w:sz w:val="17"/>
-              </w:rPr>
-              <w:t>refreshes.[</w:t>
-            </w:r>
-            <w:proofErr w:type="gramEnd"/>
-            <w:r>
-              <w:rPr>
-                <w:rFonts w:ascii="source sans 3" w:eastAsia="source sans 3" w:hAnsi="source sans 3" w:cs="source sans 3"/>
-                <w:color w:val="000000"/>
-                <w:sz w:val="17"/>
-              </w:rPr>
-              <w:t>file:</w:t>
-            </w:r>
-            <w:proofErr w:type="gramStart"/>
-            <w:r>
-              <w:rPr>
-                <w:rFonts w:ascii="source sans 3" w:eastAsia="source sans 3" w:hAnsi="source sans 3" w:cs="source sans 3"/>
-                <w:color w:val="000000"/>
-                <w:sz w:val="17"/>
-              </w:rPr>
-              <w:t>7][</w:t>
-            </w:r>
-            <w:proofErr w:type="gramEnd"/>
-            <w:r>
-              <w:rPr>
-                <w:rFonts w:ascii="source sans 3" w:eastAsia="source sans 3" w:hAnsi="source sans 3" w:cs="source sans 3"/>
-                <w:color w:val="000000"/>
-                <w:sz w:val="17"/>
-              </w:rPr>
-              <w:t>file:14]</w:t>
+              <w:t>, and the dashboard refreshes.</w:t>
             </w:r>
           </w:p>
         </w:tc>
@@ -2091,6 +2054,76 @@
                 <w:sz w:val="17"/>
               </w:rPr>
             </w:pPr>
+            <w:r>
+              <w:rPr>
+                <w:rFonts w:ascii="source sans 3" w:eastAsia="source sans 3" w:hAnsi="source sans 3" w:cs="source sans 3"/>
+                <w:color w:val="000000"/>
+                <w:sz w:val="17"/>
+              </w:rPr>
+              <w:drawing>
+                <wp:inline distT="0" distB="0" distL="0" distR="0" wp14:anchorId="17341744" wp14:editId="446D58F4">
+                  <wp:extent cx="1876439" cy="914407"/>
+                  <wp:effectExtent l="0" t="0" r="9525" b="0"/>
+                  <wp:docPr id="1038614882" name="Picture 1"/>
+                  <wp:cNvGraphicFramePr>
+                    <a:graphicFrameLocks xmlns:a="http://schemas.openxmlformats.org/drawingml/2006/main" noChangeAspect="1"/>
+                  </wp:cNvGraphicFramePr>
+                  <a:graphic xmlns:a="http://schemas.openxmlformats.org/drawingml/2006/main">
+                    <a:graphicData uri="http://schemas.openxmlformats.org/drawingml/2006/picture">
+                      <pic:pic xmlns:pic="http://schemas.openxmlformats.org/drawingml/2006/picture">
+                        <pic:nvPicPr>
+                          <pic:cNvPr id="1038614882" name=""/>
+                          <pic:cNvPicPr/>
+                        </pic:nvPicPr>
+                        <pic:blipFill>
+                          <a:blip r:embed="rId13"/>
+                          <a:stretch>
+                            <a:fillRect/>
+                          </a:stretch>
+                        </pic:blipFill>
+                        <pic:spPr>
+                          <a:xfrm>
+                            <a:off x="0" y="0"/>
+                            <a:ext cx="1876439" cy="914407"/>
+                          </a:xfrm>
+                          <a:prstGeom prst="rect">
+                            <a:avLst/>
+                          </a:prstGeom>
+                        </pic:spPr>
+                      </pic:pic>
+                    </a:graphicData>
+                  </a:graphic>
+                </wp:inline>
+              </w:drawing>
+            </w:r>
+          </w:p>
+          <w:p>
+            <w:pPr>
+              <w:spacing w:line="360" w:lineRule="auto"/>
+              <w:rPr>
+                <w:rFonts w:ascii="source sans 3" w:eastAsia="source sans 3" w:hAnsi="source sans 3" w:cs="source sans 3"/>
+                <w:color w:val="000000"/>
+                <w:sz w:val="17"/>
+              </w:rPr>
+            </w:pPr>
+          </w:p>
+          <w:p>
+            <w:pPr>
+              <w:spacing w:line="360" w:lineRule="auto"/>
+              <w:rPr>
+                <w:rFonts w:ascii="source sans 3" w:eastAsia="source sans 3" w:hAnsi="source sans 3" w:cs="source sans 3"/>
+                <w:color w:val="000000"/>
+                <w:sz w:val="17"/>
+              </w:rPr>
+            </w:pPr>
+            <w:r>
+              <w:rPr>
+                <w:rFonts w:ascii="source sans 3" w:eastAsia="source sans 3" w:hAnsi="source sans 3" w:cs="source sans 3"/>
+                <w:color w:val="000000"/>
+                <w:sz w:val="17"/>
+              </w:rPr>
+              <w:t>PASS</w:t>
+            </w:r>
           </w:p>
         </w:tc>
       </w:tr>
@@ -2206,7 +2239,7 @@
                 <w:color w:val="000000"/>
                 <w:sz w:val="17"/>
               </w:rPr>
-              <w:t xml:space="preserve">Selected reservation is collected and a new loan is </w:t>
+              <w:t xml:space="preserve">Selected </w:t>
             </w:r>
             <w:proofErr w:type="gramStart"/>
             <w:r>
@@ -2215,7 +2248,7 @@
                 <w:color w:val="000000"/>
                 <w:sz w:val="17"/>
               </w:rPr>
-              <w:t>created.[</w:t>
+              <w:t>reservation is</w:t>
             </w:r>
             <w:proofErr w:type="gramEnd"/>
             <w:r>
@@ -2224,25 +2257,7 @@
                 <w:color w:val="000000"/>
                 <w:sz w:val="17"/>
               </w:rPr>
-              <w:t>file:</w:t>
-            </w:r>
-            <w:proofErr w:type="gramStart"/>
-            <w:r>
-              <w:rPr>
-                <w:rFonts w:ascii="source sans 3" w:eastAsia="source sans 3" w:hAnsi="source sans 3" w:cs="source sans 3"/>
-                <w:color w:val="000000"/>
-                <w:sz w:val="17"/>
-              </w:rPr>
-              <w:t>13][</w:t>
-            </w:r>
-            <w:proofErr w:type="gramEnd"/>
-            <w:r>
-              <w:rPr>
-                <w:rFonts w:ascii="source sans 3" w:eastAsia="source sans 3" w:hAnsi="source sans 3" w:cs="source sans 3"/>
-                <w:color w:val="000000"/>
-                <w:sz w:val="17"/>
-              </w:rPr>
-              <w:t>file:14]</w:t>
+              <w:t xml:space="preserve"> collected and a new loan is created.</w:t>
             </w:r>
           </w:p>
         </w:tc>
@@ -2264,6 +2279,48 @@
                 <w:sz w:val="17"/>
               </w:rPr>
             </w:pPr>
+            <w:r>
+              <w:rPr>
+                <w:rFonts w:ascii="source sans 3" w:eastAsia="source sans 3" w:hAnsi="source sans 3" w:cs="source sans 3"/>
+                <w:color w:val="000000"/>
+                <w:sz w:val="17"/>
+              </w:rPr>
+              <w:drawing>
+                <wp:inline distT="0" distB="0" distL="0" distR="0" wp14:anchorId="1080BCB2" wp14:editId="35D3BA74">
+                  <wp:extent cx="1914539" cy="847731"/>
+                  <wp:effectExtent l="0" t="0" r="9525" b="9525"/>
+                  <wp:docPr id="1560091281" name="Picture 1"/>
+                  <wp:cNvGraphicFramePr>
+                    <a:graphicFrameLocks xmlns:a="http://schemas.openxmlformats.org/drawingml/2006/main" noChangeAspect="1"/>
+                  </wp:cNvGraphicFramePr>
+                  <a:graphic xmlns:a="http://schemas.openxmlformats.org/drawingml/2006/main">
+                    <a:graphicData uri="http://schemas.openxmlformats.org/drawingml/2006/picture">
+                      <pic:pic xmlns:pic="http://schemas.openxmlformats.org/drawingml/2006/picture">
+                        <pic:nvPicPr>
+                          <pic:cNvPr id="1560091281" name=""/>
+                          <pic:cNvPicPr/>
+                        </pic:nvPicPr>
+                        <pic:blipFill>
+                          <a:blip r:embed="rId14"/>
+                          <a:stretch>
+                            <a:fillRect/>
+                          </a:stretch>
+                        </pic:blipFill>
+                        <pic:spPr>
+                          <a:xfrm>
+                            <a:off x="0" y="0"/>
+                            <a:ext cx="1914539" cy="847731"/>
+                          </a:xfrm>
+                          <a:prstGeom prst="rect">
+                            <a:avLst/>
+                          </a:prstGeom>
+                        </pic:spPr>
+                      </pic:pic>
+                    </a:graphicData>
+                  </a:graphic>
+                </wp:inline>
+              </w:drawing>
+            </w:r>
           </w:p>
         </w:tc>
       </w:tr>
@@ -2378,43 +2435,7 @@
                 <w:color w:val="000000"/>
                 <w:sz w:val="17"/>
               </w:rPr>
-              <w:t xml:space="preserve">Collection is blocked with a message saying the reservation is not ready to </w:t>
-            </w:r>
-            <w:proofErr w:type="gramStart"/>
-            <w:r>
-              <w:rPr>
-                <w:rFonts w:ascii="source sans 3" w:eastAsia="source sans 3" w:hAnsi="source sans 3" w:cs="source sans 3"/>
-                <w:color w:val="000000"/>
-                <w:sz w:val="17"/>
-              </w:rPr>
-              <w:t>collect.[</w:t>
-            </w:r>
-            <w:proofErr w:type="gramEnd"/>
-            <w:r>
-              <w:rPr>
-                <w:rFonts w:ascii="source sans 3" w:eastAsia="source sans 3" w:hAnsi="source sans 3" w:cs="source sans 3"/>
-                <w:color w:val="000000"/>
-                <w:sz w:val="17"/>
-              </w:rPr>
-              <w:t>file:</w:t>
-            </w:r>
-            <w:proofErr w:type="gramStart"/>
-            <w:r>
-              <w:rPr>
-                <w:rFonts w:ascii="source sans 3" w:eastAsia="source sans 3" w:hAnsi="source sans 3" w:cs="source sans 3"/>
-                <w:color w:val="000000"/>
-                <w:sz w:val="17"/>
-              </w:rPr>
-              <w:t>7][</w:t>
-            </w:r>
-            <w:proofErr w:type="gramEnd"/>
-            <w:r>
-              <w:rPr>
-                <w:rFonts w:ascii="source sans 3" w:eastAsia="source sans 3" w:hAnsi="source sans 3" w:cs="source sans 3"/>
-                <w:color w:val="000000"/>
-                <w:sz w:val="17"/>
-              </w:rPr>
-              <w:t>file:14]</w:t>
+              <w:t>Collection is blocked with a message saying the reservation is not ready to collect.</w:t>
             </w:r>
           </w:p>
         </w:tc>
@@ -2436,6 +2457,14 @@
                 <w:sz w:val="17"/>
               </w:rPr>
             </w:pPr>
+            <w:r>
+              <w:rPr>
+                <w:rFonts w:ascii="source sans 3" w:eastAsia="source sans 3" w:hAnsi="source sans 3" w:cs="source sans 3"/>
+                <w:color w:val="000000"/>
+                <w:sz w:val="17"/>
+              </w:rPr>
+              <w:t>Pass</w:t>
+            </w:r>
           </w:p>
         </w:tc>
       </w:tr>
@@ -2532,43 +2561,7 @@
                 <w:color w:val="000000"/>
                 <w:sz w:val="17"/>
               </w:rPr>
-              <w:t xml:space="preserve">Collection is blocked until overdue items are </w:t>
-            </w:r>
-            <w:proofErr w:type="gramStart"/>
-            <w:r>
-              <w:rPr>
-                <w:rFonts w:ascii="source sans 3" w:eastAsia="source sans 3" w:hAnsi="source sans 3" w:cs="source sans 3"/>
-                <w:color w:val="000000"/>
-                <w:sz w:val="17"/>
-              </w:rPr>
-              <w:t>returned.[</w:t>
-            </w:r>
-            <w:proofErr w:type="gramEnd"/>
-            <w:r>
-              <w:rPr>
-                <w:rFonts w:ascii="source sans 3" w:eastAsia="source sans 3" w:hAnsi="source sans 3" w:cs="source sans 3"/>
-                <w:color w:val="000000"/>
-                <w:sz w:val="17"/>
-              </w:rPr>
-              <w:t>file:</w:t>
-            </w:r>
-            <w:proofErr w:type="gramStart"/>
-            <w:r>
-              <w:rPr>
-                <w:rFonts w:ascii="source sans 3" w:eastAsia="source sans 3" w:hAnsi="source sans 3" w:cs="source sans 3"/>
-                <w:color w:val="000000"/>
-                <w:sz w:val="17"/>
-              </w:rPr>
-              <w:t>4][</w:t>
-            </w:r>
-            <w:proofErr w:type="gramEnd"/>
-            <w:r>
-              <w:rPr>
-                <w:rFonts w:ascii="source sans 3" w:eastAsia="source sans 3" w:hAnsi="source sans 3" w:cs="source sans 3"/>
-                <w:color w:val="000000"/>
-                <w:sz w:val="17"/>
-              </w:rPr>
-              <w:t>file:10]</w:t>
+              <w:t>Collection is blocked until overdue items are returned.</w:t>
             </w:r>
           </w:p>
         </w:tc>
@@ -2590,6 +2583,14 @@
                 <w:sz w:val="17"/>
               </w:rPr>
             </w:pPr>
+            <w:r>
+              <w:rPr>
+                <w:rFonts w:ascii="source sans 3" w:eastAsia="source sans 3" w:hAnsi="source sans 3" w:cs="source sans 3"/>
+                <w:color w:val="000000"/>
+                <w:sz w:val="17"/>
+              </w:rPr>
+              <w:t>Pass</w:t>
+            </w:r>
           </w:p>
         </w:tc>
       </w:tr>
@@ -2686,43 +2687,7 @@
                 <w:color w:val="000000"/>
                 <w:sz w:val="17"/>
               </w:rPr>
-              <w:t xml:space="preserve">The UI asks for an active loan to be selected and does not call return logic on the </w:t>
-            </w:r>
-            <w:proofErr w:type="gramStart"/>
-            <w:r>
-              <w:rPr>
-                <w:rFonts w:ascii="source sans 3" w:eastAsia="source sans 3" w:hAnsi="source sans 3" w:cs="source sans 3"/>
-                <w:color w:val="000000"/>
-                <w:sz w:val="17"/>
-              </w:rPr>
-              <w:t>reservation.[</w:t>
-            </w:r>
-            <w:proofErr w:type="gramEnd"/>
-            <w:r>
-              <w:rPr>
-                <w:rFonts w:ascii="source sans 3" w:eastAsia="source sans 3" w:hAnsi="source sans 3" w:cs="source sans 3"/>
-                <w:color w:val="000000"/>
-                <w:sz w:val="17"/>
-              </w:rPr>
-              <w:t>file:</w:t>
-            </w:r>
-            <w:proofErr w:type="gramStart"/>
-            <w:r>
-              <w:rPr>
-                <w:rFonts w:ascii="source sans 3" w:eastAsia="source sans 3" w:hAnsi="source sans 3" w:cs="source sans 3"/>
-                <w:color w:val="000000"/>
-                <w:sz w:val="17"/>
-              </w:rPr>
-              <w:t>11][</w:t>
-            </w:r>
-            <w:proofErr w:type="gramEnd"/>
-            <w:r>
-              <w:rPr>
-                <w:rFonts w:ascii="source sans 3" w:eastAsia="source sans 3" w:hAnsi="source sans 3" w:cs="source sans 3"/>
-                <w:color w:val="000000"/>
-                <w:sz w:val="17"/>
-              </w:rPr>
-              <w:t>file:14]</w:t>
+              <w:t>The UI asks for an active loan to be selected and does not call return logic on the reservation.</w:t>
             </w:r>
           </w:p>
         </w:tc>
@@ -2744,6 +2709,66 @@
                 <w:sz w:val="17"/>
               </w:rPr>
             </w:pPr>
+            <w:r>
+              <w:rPr>
+                <w:rFonts w:ascii="source sans 3" w:eastAsia="source sans 3" w:hAnsi="source sans 3" w:cs="source sans 3"/>
+                <w:color w:val="000000"/>
+                <w:sz w:val="17"/>
+              </w:rPr>
+              <w:drawing>
+                <wp:inline distT="0" distB="0" distL="0" distR="0" wp14:anchorId="7A5BF418" wp14:editId="34B03342">
+                  <wp:extent cx="1304935" cy="847731"/>
+                  <wp:effectExtent l="0" t="0" r="9525" b="9525"/>
+                  <wp:docPr id="70195512" name="Picture 1"/>
+                  <wp:cNvGraphicFramePr>
+                    <a:graphicFrameLocks xmlns:a="http://schemas.openxmlformats.org/drawingml/2006/main" noChangeAspect="1"/>
+                  </wp:cNvGraphicFramePr>
+                  <a:graphic xmlns:a="http://schemas.openxmlformats.org/drawingml/2006/main">
+                    <a:graphicData uri="http://schemas.openxmlformats.org/drawingml/2006/picture">
+                      <pic:pic xmlns:pic="http://schemas.openxmlformats.org/drawingml/2006/picture">
+                        <pic:nvPicPr>
+                          <pic:cNvPr id="70195512" name=""/>
+                          <pic:cNvPicPr/>
+                        </pic:nvPicPr>
+                        <pic:blipFill>
+                          <a:blip r:embed="rId15"/>
+                          <a:stretch>
+                            <a:fillRect/>
+                          </a:stretch>
+                        </pic:blipFill>
+                        <pic:spPr>
+                          <a:xfrm>
+                            <a:off x="0" y="0"/>
+                            <a:ext cx="1304935" cy="847731"/>
+                          </a:xfrm>
+                          <a:prstGeom prst="rect">
+                            <a:avLst/>
+                          </a:prstGeom>
+                        </pic:spPr>
+                      </pic:pic>
+                    </a:graphicData>
+                  </a:graphic>
+                </wp:inline>
+              </w:drawing>
+            </w:r>
+          </w:p>
+          <w:p>
+            <w:pPr>
+              <w:spacing w:line="360" w:lineRule="auto"/>
+              <w:rPr>
+                <w:rFonts w:ascii="source sans 3" w:eastAsia="source sans 3" w:hAnsi="source sans 3" w:cs="source sans 3"/>
+                <w:color w:val="000000"/>
+                <w:sz w:val="17"/>
+              </w:rPr>
+            </w:pPr>
+            <w:r>
+              <w:rPr>
+                <w:rFonts w:ascii="source sans 3" w:eastAsia="source sans 3" w:hAnsi="source sans 3" w:cs="source sans 3"/>
+                <w:color w:val="000000"/>
+                <w:sz w:val="17"/>
+              </w:rPr>
+              <w:t>Pass</w:t>
+            </w:r>
           </w:p>
         </w:tc>
       </w:tr>
@@ -3082,6 +3107,7 @@
         <w:rPr>
           <w:lang w:val="en-AU"/>
         </w:rPr>
+        <w:lastRenderedPageBreak/>
         <w:t>Returning a book updated the screen temporarily, but the change was lost after restarting the application.</w:t>
       </w:r>
       <w:r>
@@ -3105,7 +3131,6 @@
         <w:rPr>
           <w:lang w:val="en-AU"/>
         </w:rPr>
-        <w:lastRenderedPageBreak/>
         <w:t>The returned loan did not remain marked as returned in saved data</w:t>
       </w:r>
       <w:r>
@@ -3938,6 +3963,7 @@
           <w:bCs/>
           <w:lang w:val="en-AU"/>
         </w:rPr>
+        <w:lastRenderedPageBreak/>
         <w:t>Initial test case or scenario:</w:t>
       </w:r>
       <w:r>
@@ -3973,7 +3999,6 @@
           <w:bCs/>
           <w:lang w:val="en-AU"/>
         </w:rPr>
-        <w:lastRenderedPageBreak/>
         <w:t>Symptoms / Observed Behaviour</w:t>
       </w:r>
     </w:p>
@@ -4226,7 +4251,7 @@
         </w:rPr>
         <w:t>LibrarySystem.cs.</w:t>
       </w:r>
-      <w:hyperlink r:id="rId12" w:tgtFrame="_blank" w:history="1">
+      <w:hyperlink r:id="rId16" w:tgtFrame="_blank" w:history="1">
         <w:r>
           <w:rPr>
             <w:rStyle w:val="Hyperlink"/>
@@ -4816,6 +4841,9 @@
     </w:p>
     <w:p>
       <w:r>
+        <w:rPr>
+          <w:noProof/>
+        </w:rPr>
         <w:lastRenderedPageBreak/>
         <w:drawing>
           <wp:inline distT="0" distB="0" distL="0" distR="0" wp14:anchorId="4D5D879A" wp14:editId="535A27D7">
@@ -4833,7 +4861,7 @@
                     <pic:cNvPicPr/>
                   </pic:nvPicPr>
                   <pic:blipFill>
-                    <a:blip r:embed="rId13"/>
+                    <a:blip r:embed="rId17"/>
                     <a:stretch>
                       <a:fillRect/>
                     </a:stretch>
@@ -6812,6 +6840,7 @@
   <w:style w:type="character" w:default="1" w:styleId="DefaultParagraphFont">
     <w:name w:val="Default Paragraph Font"/>
     <w:uiPriority w:val="1"/>
+    <w:semiHidden/>
     <w:unhideWhenUsed/>
   </w:style>
   <w:style w:type="table" w:default="1" w:styleId="TableNormal">
@@ -7210,4 +7239,16 @@
     </a:ext>
   </a:extLst>
 </a:theme>
+</file>
+
+<file path=customXml/item1.xml><?xml version="1.0" encoding="utf-8"?>
+<b:Sources xmlns:b="http://schemas.openxmlformats.org/officeDocument/2006/bibliography" xmlns="http://schemas.openxmlformats.org/officeDocument/2006/bibliography" SelectedStyle="\APASixthEditionOfficeOnline.xsl" StyleName="APA" Version="6"/>
+</file>
+
+<file path=customXml/itemProps1.xml><?xml version="1.0" encoding="utf-8"?>
+<ds:datastoreItem xmlns:ds="http://schemas.openxmlformats.org/officeDocument/2006/customXml" ds:itemID="{0677ADB6-84B2-445B-99DB-182A0CE8775B}">
+  <ds:schemaRefs>
+    <ds:schemaRef ds:uri="http://schemas.openxmlformats.org/officeDocument/2006/bibliography"/>
+  </ds:schemaRefs>
+</ds:datastoreItem>
 </file>
</xml_diff>